<commit_message>
Add Superior University Thesis Formatting Guide for consistent document standards
</commit_message>
<xml_diff>
--- a/07_Thesis/Thesis_Ch1_Ch2.docx
+++ b/07_Thesis/Thesis_Ch1_Ch2.docx
@@ -19,6 +19,196 @@
     </w:p>
     <w:p>
       <w:pPr>
+        <w:spacing w:before="0" w:after="480"/>
+        <w:jc w:val="center"/>
+      </w:pPr>
+      <w:r>
+        <w:drawing>
+          <wp:inline xmlns:a="http://schemas.openxmlformats.org/drawingml/2006/main" xmlns:pic="http://schemas.openxmlformats.org/drawingml/2006/picture">
+            <wp:extent cx="1800000" cy="2674800"/>
+            <wp:docPr id="1" name="Picture 1"/>
+            <wp:cNvGraphicFramePr>
+              <a:graphicFrameLocks noChangeAspect="1"/>
+            </wp:cNvGraphicFramePr>
+            <a:graphic>
+              <a:graphicData uri="http://schemas.openxmlformats.org/drawingml/2006/picture">
+                <pic:pic>
+                  <pic:nvPicPr>
+                    <pic:cNvPr id="0" name="superior_logo_vertical.png"/>
+                    <pic:cNvPicPr/>
+                  </pic:nvPicPr>
+                  <pic:blipFill>
+                    <a:blip r:embed="rId9"/>
+                    <a:stretch>
+                      <a:fillRect/>
+                    </a:stretch>
+                  </pic:blipFill>
+                  <pic:spPr>
+                    <a:xfrm>
+                      <a:off x="0" y="0"/>
+                      <a:ext cx="1800000" cy="2674800"/>
+                    </a:xfrm>
+                    <a:prstGeom prst="rect"/>
+                  </pic:spPr>
+                </pic:pic>
+              </a:graphicData>
+            </a:graphic>
+          </wp:inline>
+        </w:drawing>
+      </w:r>
+    </w:p>
+    <w:p>
+      <w:pPr>
+        <w:spacing w:lineRule="auto" w:line="360" w:before="0" w:after="0"/>
+        <w:jc w:val="center"/>
+      </w:pPr>
+      <w:r>
+        <w:rPr>
+          <w:rFonts w:ascii="Times New Roman" w:hAnsi="Times New Roman" w:cs="Times New Roman"/>
+          <w:b w:val="0"/>
+          <w:i w:val="0"/>
+          <w:sz w:val="24"/>
+        </w:rPr>
+        <w:t>A Thesis submitted in partial fulfillment</w:t>
+      </w:r>
+    </w:p>
+    <w:p>
+      <w:pPr>
+        <w:spacing w:lineRule="auto" w:line="360" w:before="0" w:after="240"/>
+        <w:jc w:val="center"/>
+      </w:pPr>
+      <w:r>
+        <w:rPr>
+          <w:rFonts w:ascii="Times New Roman" w:hAnsi="Times New Roman" w:cs="Times New Roman"/>
+          <w:b w:val="0"/>
+          <w:i w:val="0"/>
+          <w:sz w:val="24"/>
+        </w:rPr>
+        <w:t>of the requirements for the degree of</w:t>
+      </w:r>
+    </w:p>
+    <w:p>
+      <w:pPr>
+        <w:spacing w:lineRule="auto" w:line="360" w:before="0" w:after="0"/>
+        <w:jc w:val="center"/>
+      </w:pPr>
+      <w:r>
+        <w:rPr>
+          <w:rFonts w:ascii="Times New Roman" w:hAnsi="Times New Roman" w:cs="Times New Roman"/>
+          <w:b w:val="0"/>
+          <w:i w:val="0"/>
+          <w:sz w:val="28"/>
+        </w:rPr>
+        <w:t>MASTER OF SCIENCE</w:t>
+      </w:r>
+    </w:p>
+    <w:p>
+      <w:pPr>
+        <w:spacing w:lineRule="auto" w:line="360" w:before="0" w:after="0"/>
+        <w:jc w:val="center"/>
+      </w:pPr>
+      <w:r>
+        <w:rPr>
+          <w:rFonts w:ascii="Times New Roman" w:hAnsi="Times New Roman" w:cs="Times New Roman"/>
+          <w:b w:val="0"/>
+          <w:i w:val="0"/>
+          <w:sz w:val="28"/>
+        </w:rPr>
+        <w:t>IN</w:t>
+      </w:r>
+    </w:p>
+    <w:p>
+      <w:pPr>
+        <w:spacing w:lineRule="auto" w:line="360" w:before="0" w:after="360"/>
+        <w:jc w:val="center"/>
+      </w:pPr>
+      <w:r>
+        <w:rPr>
+          <w:rFonts w:ascii="Times New Roman" w:hAnsi="Times New Roman" w:cs="Times New Roman"/>
+          <w:b w:val="0"/>
+          <w:i w:val="0"/>
+          <w:sz w:val="28"/>
+        </w:rPr>
+        <w:t>ARTIFICIAL INTELLIGENCE</w:t>
+      </w:r>
+    </w:p>
+    <w:p>
+      <w:pPr>
+        <w:spacing w:lineRule="auto" w:line="360" w:before="0" w:after="0"/>
+        <w:jc w:val="center"/>
+      </w:pPr>
+      <w:r>
+        <w:rPr>
+          <w:rFonts w:ascii="Times New Roman" w:hAnsi="Times New Roman" w:cs="Times New Roman"/>
+          <w:b w:val="0"/>
+          <w:i w:val="0"/>
+          <w:sz w:val="24"/>
+        </w:rPr>
+        <w:t>Submitted By</w:t>
+      </w:r>
+    </w:p>
+    <w:p>
+      <w:pPr>
+        <w:spacing w:lineRule="auto" w:line="360" w:before="0" w:after="0"/>
+        <w:jc w:val="center"/>
+      </w:pPr>
+      <w:r>
+        <w:rPr>
+          <w:rFonts w:ascii="Times New Roman" w:hAnsi="Times New Roman" w:cs="Times New Roman"/>
+          <w:b w:val="0"/>
+          <w:i w:val="0"/>
+          <w:sz w:val="28"/>
+        </w:rPr>
+        <w:t>Adeel Gill</w:t>
+      </w:r>
+    </w:p>
+    <w:p>
+      <w:pPr>
+        <w:spacing w:lineRule="auto" w:line="360" w:before="0" w:after="0"/>
+        <w:jc w:val="center"/>
+      </w:pPr>
+      <w:r>
+        <w:rPr>
+          <w:rFonts w:ascii="Times New Roman" w:hAnsi="Times New Roman" w:cs="Times New Roman"/>
+          <w:b w:val="0"/>
+          <w:i w:val="0"/>
+          <w:sz w:val="28"/>
+        </w:rPr>
+        <w:t>SU92-MSAIW-S25-011</w:t>
+      </w:r>
+    </w:p>
+    <w:p>
+      <w:pPr>
+        <w:spacing w:lineRule="auto" w:line="360" w:before="0" w:after="360"/>
+        <w:jc w:val="center"/>
+      </w:pPr>
+      <w:r>
+        <w:rPr>
+          <w:rFonts w:ascii="Times New Roman" w:hAnsi="Times New Roman" w:cs="Times New Roman"/>
+          <w:b w:val="0"/>
+          <w:i w:val="0"/>
+          <w:sz w:val="24"/>
+        </w:rPr>
+        <w:t>Session: 2025-2026</w:t>
+      </w:r>
+    </w:p>
+    <w:p>
+      <w:pPr>
+        <w:spacing w:lineRule="auto" w:line="360" w:before="0" w:after="0"/>
+        <w:jc w:val="center"/>
+      </w:pPr>
+      <w:r>
+        <w:rPr>
+          <w:rFonts w:ascii="Times New Roman" w:hAnsi="Times New Roman" w:cs="Times New Roman"/>
+          <w:b w:val="0"/>
+          <w:i w:val="0"/>
+          <w:sz w:val="24"/>
+        </w:rPr>
+        <w:t>Supervised By</w:t>
+      </w:r>
+    </w:p>
+    <w:p>
+      <w:pPr>
         <w:spacing w:lineRule="auto" w:line="360" w:before="0" w:after="480"/>
         <w:jc w:val="center"/>
       </w:pPr>
@@ -26,10 +216,10 @@
         <w:rPr>
           <w:rFonts w:ascii="Times New Roman" w:hAnsi="Times New Roman" w:cs="Times New Roman"/>
           <w:b w:val="0"/>
-          <w:i/>
-          <w:sz w:val="24"/>
-        </w:rPr>
-        <w:t>[Insert Superior University logo here — 5 cm × 7.43 cm]</w:t>
+          <w:i w:val="0"/>
+          <w:sz w:val="28"/>
+        </w:rPr>
+        <w:t>Dr. Fawad Nasim</w:t>
       </w:r>
     </w:p>
     <w:p>
@@ -42,14 +232,14 @@
           <w:rFonts w:ascii="Times New Roman" w:hAnsi="Times New Roman" w:cs="Times New Roman"/>
           <w:b w:val="0"/>
           <w:i w:val="0"/>
-          <w:sz w:val="24"/>
-        </w:rPr>
-        <w:t>A Thesis submitted in partial fulfillment</w:t>
+          <w:sz w:val="28"/>
+        </w:rPr>
+        <w:t>DEPARTMENT OF COMPUTER SCIENCE</w:t>
       </w:r>
     </w:p>
     <w:p>
       <w:pPr>
-        <w:spacing w:lineRule="auto" w:line="360" w:before="0" w:after="240"/>
+        <w:spacing w:lineRule="auto" w:line="360" w:before="0" w:after="0"/>
         <w:jc w:val="center"/>
       </w:pPr>
       <w:r>
@@ -57,9 +247,9 @@
           <w:rFonts w:ascii="Times New Roman" w:hAnsi="Times New Roman" w:cs="Times New Roman"/>
           <w:b w:val="0"/>
           <w:i w:val="0"/>
-          <w:sz w:val="24"/>
-        </w:rPr>
-        <w:t>of the requirements for the degree of</w:t>
+          <w:sz w:val="28"/>
+        </w:rPr>
+        <w:t>FACULTY OF COMPUTER SCIENCE AND INFORMATION TECHNOLOGY</w:t>
       </w:r>
     </w:p>
     <w:p>
@@ -74,178 +264,13 @@
           <w:i w:val="0"/>
           <w:sz w:val="28"/>
         </w:rPr>
-        <w:t>MASTER OF SCIENCE</w:t>
+        <w:t>THE SUPERIOR UNIVERSITY, LAHORE</w:t>
       </w:r>
     </w:p>
     <w:p>
       <w:pPr>
-        <w:spacing w:lineRule="auto" w:line="360" w:before="0" w:after="0"/>
-        <w:jc w:val="center"/>
-      </w:pPr>
-      <w:r>
-        <w:rPr>
-          <w:rFonts w:ascii="Times New Roman" w:hAnsi="Times New Roman" w:cs="Times New Roman"/>
-          <w:b w:val="0"/>
-          <w:i w:val="0"/>
-          <w:sz w:val="28"/>
-        </w:rPr>
-        <w:t>IN</w:t>
-      </w:r>
-    </w:p>
-    <w:p>
-      <w:pPr>
-        <w:spacing w:lineRule="auto" w:line="360" w:before="0" w:after="360"/>
-        <w:jc w:val="center"/>
-      </w:pPr>
-      <w:r>
-        <w:rPr>
-          <w:rFonts w:ascii="Times New Roman" w:hAnsi="Times New Roman" w:cs="Times New Roman"/>
-          <w:b w:val="0"/>
-          <w:i w:val="0"/>
-          <w:sz w:val="28"/>
-        </w:rPr>
-        <w:t>ARTIFICIAL INTELLIGENCE</w:t>
-      </w:r>
-    </w:p>
-    <w:p>
-      <w:pPr>
-        <w:spacing w:lineRule="auto" w:line="360" w:before="0" w:after="0"/>
-        <w:jc w:val="center"/>
-      </w:pPr>
-      <w:r>
-        <w:rPr>
-          <w:rFonts w:ascii="Times New Roman" w:hAnsi="Times New Roman" w:cs="Times New Roman"/>
-          <w:b w:val="0"/>
-          <w:i w:val="0"/>
-          <w:sz w:val="24"/>
-        </w:rPr>
-        <w:t>Submitted By</w:t>
-      </w:r>
-    </w:p>
-    <w:p>
-      <w:pPr>
-        <w:spacing w:lineRule="auto" w:line="360" w:before="0" w:after="0"/>
-        <w:jc w:val="center"/>
-      </w:pPr>
-      <w:r>
-        <w:rPr>
-          <w:rFonts w:ascii="Times New Roman" w:hAnsi="Times New Roman" w:cs="Times New Roman"/>
-          <w:b w:val="0"/>
-          <w:i w:val="0"/>
-          <w:sz w:val="28"/>
-        </w:rPr>
-        <w:t>Adeel Gill</w:t>
-      </w:r>
-    </w:p>
-    <w:p>
-      <w:pPr>
-        <w:spacing w:lineRule="auto" w:line="360" w:before="0" w:after="0"/>
-        <w:jc w:val="center"/>
-      </w:pPr>
-      <w:r>
-        <w:rPr>
-          <w:rFonts w:ascii="Times New Roman" w:hAnsi="Times New Roman" w:cs="Times New Roman"/>
-          <w:b w:val="0"/>
-          <w:i w:val="0"/>
-          <w:sz w:val="28"/>
-        </w:rPr>
-        <w:t>[Roll Number]</w:t>
-      </w:r>
-    </w:p>
-    <w:p>
-      <w:pPr>
-        <w:spacing w:lineRule="auto" w:line="360" w:before="0" w:after="360"/>
-        <w:jc w:val="center"/>
-      </w:pPr>
-      <w:r>
-        <w:rPr>
-          <w:rFonts w:ascii="Times New Roman" w:hAnsi="Times New Roman" w:cs="Times New Roman"/>
-          <w:b w:val="0"/>
-          <w:i w:val="0"/>
-          <w:sz w:val="24"/>
-        </w:rPr>
-        <w:t>Session: [Session e.g., 2023-2025]</w:t>
-      </w:r>
-    </w:p>
-    <w:p>
-      <w:pPr>
-        <w:spacing w:lineRule="auto" w:line="360" w:before="0" w:after="0"/>
-        <w:jc w:val="center"/>
-      </w:pPr>
-      <w:r>
-        <w:rPr>
-          <w:rFonts w:ascii="Times New Roman" w:hAnsi="Times New Roman" w:cs="Times New Roman"/>
-          <w:b w:val="0"/>
-          <w:i w:val="0"/>
-          <w:sz w:val="24"/>
-        </w:rPr>
-        <w:t>Supervised By</w:t>
-      </w:r>
-    </w:p>
-    <w:p>
-      <w:pPr>
-        <w:spacing w:lineRule="auto" w:line="360" w:before="0" w:after="480"/>
-        <w:jc w:val="center"/>
-      </w:pPr>
-      <w:r>
-        <w:rPr>
-          <w:rFonts w:ascii="Times New Roman" w:hAnsi="Times New Roman" w:cs="Times New Roman"/>
-          <w:b w:val="0"/>
-          <w:i w:val="0"/>
-          <w:sz w:val="28"/>
-        </w:rPr>
-        <w:t>[Supervisor Name]</w:t>
-      </w:r>
-    </w:p>
-    <w:p>
-      <w:pPr>
-        <w:spacing w:lineRule="auto" w:line="360" w:before="0" w:after="0"/>
-        <w:jc w:val="center"/>
-      </w:pPr>
-      <w:r>
-        <w:rPr>
-          <w:rFonts w:ascii="Times New Roman" w:hAnsi="Times New Roman" w:cs="Times New Roman"/>
-          <w:b w:val="0"/>
-          <w:i w:val="0"/>
-          <w:sz w:val="28"/>
-        </w:rPr>
-        <w:t>DEPARTMENT OF COMPUTER SCIENCE</w:t>
-      </w:r>
-    </w:p>
-    <w:p>
-      <w:pPr>
-        <w:spacing w:lineRule="auto" w:line="360" w:before="0" w:after="0"/>
-        <w:jc w:val="center"/>
-      </w:pPr>
-      <w:r>
-        <w:rPr>
-          <w:rFonts w:ascii="Times New Roman" w:hAnsi="Times New Roman" w:cs="Times New Roman"/>
-          <w:b w:val="0"/>
-          <w:i w:val="0"/>
-          <w:sz w:val="28"/>
-        </w:rPr>
-        <w:t>FACULTY OF COMPUTER SCIENCE AND INFORMATION TECHNOLOGY</w:t>
-      </w:r>
-    </w:p>
-    <w:p>
-      <w:pPr>
-        <w:spacing w:lineRule="auto" w:line="360" w:before="0" w:after="0"/>
-        <w:jc w:val="center"/>
-      </w:pPr>
-      <w:r>
-        <w:rPr>
-          <w:rFonts w:ascii="Times New Roman" w:hAnsi="Times New Roman" w:cs="Times New Roman"/>
-          <w:b w:val="0"/>
-          <w:i w:val="0"/>
-          <w:sz w:val="28"/>
-        </w:rPr>
-        <w:t>THE SUPERIOR UNIVERSITY, LAHORE</w:t>
-      </w:r>
-    </w:p>
-    <w:p>
-      <w:pPr>
         <w:sectPr>
-          <w:footerReference w:type="default" r:id="rId9"/>
+          <w:footerReference w:type="default" r:id="rId10"/>
           <w:pgSz w:w="11909" w:h="16834"/>
           <w:pgMar w:top="1440" w:right="1440" w:bottom="1440" w:left="1800" w:header="720" w:footer="720" w:gutter="0"/>
           <w:cols w:space="720"/>
@@ -258,6 +283,7 @@
       <w:pPr>
         <w:spacing w:lineRule="auto" w:line="360" w:before="0" w:after="360"/>
         <w:jc w:val="center"/>
+        <w:outlineLvl w:val="0"/>
       </w:pPr>
       <w:r>
         <w:rPr>
@@ -353,7 +379,7 @@
           <w:i w:val="0"/>
           <w:sz w:val="24"/>
         </w:rPr>
-        <w:t>Roll Number:          [Roll Number] ____________________________</w:t>
+        <w:t>Roll Number:          SU92-MSAIW-S25-011 ____________________________</w:t>
       </w:r>
     </w:p>
     <w:p>
@@ -380,6 +406,7 @@
       <w:pPr>
         <w:spacing w:lineRule="auto" w:line="360" w:before="0" w:after="360"/>
         <w:jc w:val="center"/>
+        <w:outlineLvl w:val="0"/>
       </w:pPr>
       <w:r>
         <w:rPr>
@@ -505,7 +532,7 @@
           <w:i w:val="0"/>
           <w:sz w:val="24"/>
         </w:rPr>
-        <w:t>Supervisor Name:      [Supervisor Name] ____________________________</w:t>
+        <w:t>Supervisor Name:      Dr. Fawad Nasim ____________________________</w:t>
       </w:r>
     </w:p>
     <w:p>
@@ -517,6 +544,7 @@
       <w:pPr>
         <w:spacing w:lineRule="auto" w:line="360" w:before="0" w:after="360"/>
         <w:jc w:val="center"/>
+        <w:outlineLvl w:val="0"/>
       </w:pPr>
       <w:r>
         <w:rPr>
@@ -540,7 +568,7 @@
           <w:i w:val="0"/>
           <w:sz w:val="24"/>
         </w:rPr>
-        <w:t>It is certified that this thesis titled, “An Agentic AI Framework for Intelligent Patient Monitoring and Clinical Decision Support”, submitted by Adeel Gill, Roll No. [Roll Number], for the MS/M.Phil “Artificial Intelligence” at the “Faculty Of Computer Science And Information Technology”, Superior University, is an original research work and contains satisfactory material to be eligible for evaluation by the Examiner(s) for the award of the above-stated degree.</w:t>
+        <w:t>It is certified that this thesis titled, “An Agentic AI Framework for Intelligent Patient Monitoring and Clinical Decision Support”, submitted by Adeel Gill, Roll No. SU92-MSAIW-S25-011, for the MS/M.Phil “Artificial Intelligence” at the “Faculty Of Computer Science And Information Technology”, Superior University, is an original research work and contains satisfactory material to be eligible for evaluation by the Examiner(s) for the award of the above-stated degree.</w:t>
       </w:r>
     </w:p>
     <w:p>
@@ -591,7 +619,7 @@
           <w:i w:val="0"/>
           <w:sz w:val="24"/>
         </w:rPr>
-        <w:t>Supervisor's Name:     [Supervisor Name] ____________________________</w:t>
+        <w:t>Supervisor's Name:     Dr. Fawad Nasim ____________________________</w:t>
       </w:r>
     </w:p>
     <w:p>
@@ -669,6 +697,7 @@
       <w:pPr>
         <w:spacing w:lineRule="auto" w:line="360" w:before="0" w:after="360"/>
         <w:jc w:val="center"/>
+        <w:outlineLvl w:val="0"/>
       </w:pPr>
       <w:r>
         <w:rPr>
@@ -692,7 +721,7 @@
           <w:i w:val="0"/>
           <w:sz w:val="24"/>
         </w:rPr>
-        <w:t>It is certified that the research work contained in this thesis, titled “An Agentic AI Framework for Intelligent Patient Monitoring and Clinical Decision Support”, was conducted by Adeel Gill under the supervision of [Supervisor Name] and is adequate for the award of “Master Of Science in Artificial Intelligence”.</w:t>
+        <w:t>It is certified that the research work contained in this thesis, titled “An Agentic AI Framework for Intelligent Patient Monitoring and Clinical Decision Support”, was conducted by Adeel Gill under the supervision of Dr. Fawad Nasim and is adequate for the award of “Master Of Science in Artificial Intelligence”.</w:t>
       </w:r>
     </w:p>
     <w:p>
@@ -860,6 +889,7 @@
       <w:pPr>
         <w:spacing w:lineRule="auto" w:line="360" w:before="0" w:after="360"/>
         <w:jc w:val="center"/>
+        <w:outlineLvl w:val="0"/>
       </w:pPr>
       <w:r>
         <w:rPr>
@@ -883,7 +913,7 @@
           <w:i/>
           <w:sz w:val="24"/>
         </w:rPr>
-        <w:t>To [dedication text — begins with the word “To”].</w:t>
+        <w:t>To [dedication text, begins with the word “To”].</w:t>
       </w:r>
     </w:p>
     <w:p>
@@ -895,6 +925,7 @@
       <w:pPr>
         <w:spacing w:lineRule="auto" w:line="360" w:before="0" w:after="360"/>
         <w:jc w:val="center"/>
+        <w:outlineLvl w:val="0"/>
       </w:pPr>
       <w:r>
         <w:rPr>
@@ -965,6 +996,7 @@
       <w:pPr>
         <w:spacing w:lineRule="auto" w:line="360" w:before="0" w:after="360"/>
         <w:jc w:val="center"/>
+        <w:outlineLvl w:val="0"/>
       </w:pPr>
       <w:r>
         <w:rPr>
@@ -977,10 +1009,6 @@
       </w:r>
     </w:p>
     <w:p>
-      <w:pPr>
-        <w:spacing w:lineRule="auto" w:line="360" w:after="120"/>
-        <w:jc w:val="both"/>
-      </w:pPr>
       <w:r>
         <w:rPr>
           <w:rFonts w:ascii="Times New Roman" w:hAnsi="Times New Roman" w:cs="Times New Roman"/>
@@ -988,7 +1016,11 @@
           <w:i w:val="0"/>
           <w:sz w:val="24"/>
         </w:rPr>
-        <w:t>(Insert figure captions here after placing figures in the document. In Word: References → Insert Table of Figures. Example: Fig 3.1: Proposed Agentic AI framework.)</w:t>
+        <w:fldChar w:fldCharType="begin"/>
+        <w:instrText xml:space="preserve">TOC \h \z \c "Figure"</w:instrText>
+        <w:fldChar w:fldCharType="separate"/>
+        <w:t>Right-click and choose “Update Field” after inserting captioned figures.</w:t>
+        <w:fldChar w:fldCharType="end"/>
       </w:r>
     </w:p>
     <w:p>
@@ -1000,6 +1032,7 @@
       <w:pPr>
         <w:spacing w:lineRule="auto" w:line="360" w:before="0" w:after="360"/>
         <w:jc w:val="center"/>
+        <w:outlineLvl w:val="0"/>
       </w:pPr>
       <w:r>
         <w:rPr>
@@ -1012,10 +1045,6 @@
       </w:r>
     </w:p>
     <w:p>
-      <w:pPr>
-        <w:spacing w:lineRule="auto" w:line="360" w:after="120"/>
-        <w:jc w:val="both"/>
-      </w:pPr>
       <w:r>
         <w:rPr>
           <w:rFonts w:ascii="Times New Roman" w:hAnsi="Times New Roman" w:cs="Times New Roman"/>
@@ -1023,7 +1052,11 @@
           <w:i w:val="0"/>
           <w:sz w:val="24"/>
         </w:rPr>
-        <w:t>(Insert table captions here. Example: Table 2.1: Comparative analysis of reviewed agent frameworks.)</w:t>
+        <w:fldChar w:fldCharType="begin"/>
+        <w:instrText xml:space="preserve">TOC \h \z \c "Table"</w:instrText>
+        <w:fldChar w:fldCharType="separate"/>
+        <w:t>Right-click and choose “Update Field” after inserting captioned tables.</w:t>
+        <w:fldChar w:fldCharType="end"/>
       </w:r>
     </w:p>
     <w:p>
@@ -1035,6 +1068,7 @@
       <w:pPr>
         <w:spacing w:lineRule="auto" w:line="360" w:before="0" w:after="360"/>
         <w:jc w:val="center"/>
+        <w:outlineLvl w:val="0"/>
       </w:pPr>
       <w:r>
         <w:rPr>
@@ -1433,7 +1467,7 @@
     <w:p>
       <w:pPr>
         <w:sectPr>
-          <w:footerReference w:type="default" r:id="rId10"/>
+          <w:footerReference w:type="default" r:id="rId11"/>
           <w:pgSz w:w="11909" w:h="16834"/>
           <w:pgMar w:top="1440" w:right="1440" w:bottom="1440" w:left="1800" w:header="720" w:footer="720" w:gutter="0"/>
           <w:cols w:space="720"/>
@@ -1446,6 +1480,7 @@
       <w:pPr>
         <w:spacing w:lineRule="auto" w:line="360" w:before="0" w:after="360"/>
         <w:jc w:val="center"/>
+        <w:outlineLvl w:val="0"/>
       </w:pPr>
       <w:r>
         <w:rPr>
@@ -1469,7 +1504,7 @@
           <w:i w:val="0"/>
           <w:sz w:val="24"/>
         </w:rPr>
-        <w:t>Clinical teams in intensive care generate vast, heterogeneous data—vital signs, laboratory results, medications, and free-text notes—yet turning this stream into timely, trustworthy decisions remains difficult. Large language models (LLMs) answer medical questions well but behave as passive responders: they lack persistent patient memory, autonomous planning, and verifiable grounding, and they are typically evaluated on static examination-style questions rather than on the longitudinal record of a real patient. This thesis designs an Agentic AI framework for intelligent patient monitoring and clinical decision support that addresses these limitations. The framework organizes specialized LLM agents—monitoring, diagnosis, risk prediction, treatment recommendation, explanation, and a verification gate—under a coordinator that routes tasks by patient condition and resolves conflicting recommendations. It couples the ReAct reasoning paradigm with retrieval-augmented generation (RAG) that grounds every recommendation in both the patient’s own electronic health record timeline and external clinical guidelines, and it preserves longitudinal context through a layered memory model. A cross-cutting trustworthy-AI layer provides explainability, audit logging, bias monitoring, confidence calibration, and human-in-the-loop validation so that clinicians retain final authority. The publicly available MIMIC-IV critical-care database is used as the data source, and the study specifies a bounded prototype together with an evaluation protocol that compares the framework against single-LLM, guideline-only RAG, and multi-agent baselines using measures of diagnostic accuracy, factual grounding, risk-prediction discrimination, safety, explanation faithfulness, calibration, and runtime cost. The expected contribution is a coherent, verifiable architecture for longitudinal clinical decision support, an explicit account of how patient-timeline retrieval and a dedicated verification agent affect hallucination and safety, and a reproducible design that future work can implement and validate. The thesis is positioned as a design and methodology contribution that lays the foundation for empirical clinical evaluation.</w:t>
+        <w:t>Clinical teams in intensive care generate vast, heterogeneous data, including vital signs, laboratory results, medications, and free-text notes, yet turning this stream into timely, trustworthy decisions remains difficult. Large language models (LLMs) answer medical questions well but behave as passive responders: they lack persistent patient memory, autonomous planning, and verifiable grounding, and they are typically evaluated on static examination-style questions rather than on the longitudinal record of a real patient. This thesis designs an Agentic AI framework for intelligent patient monitoring and clinical decision support that addresses these limitations. The framework organizes specialized LLM agents for monitoring, diagnosis, risk prediction, treatment recommendation, explanation, and a verification gate under a coordinator that routes tasks by patient condition and resolves conflicting recommendations. It couples the ReAct reasoning paradigm with retrieval-augmented generation (RAG) that grounds every recommendation in both the patient’s own electronic health record timeline and external clinical guidelines, and it preserves longitudinal context through a layered memory model. A cross-cutting trustworthy-AI layer provides explainability, audit logging, bias monitoring, confidence calibration, and human-in-the-loop validation so that clinicians retain final authority. The publicly available MIMIC-IV critical-care database is used as the data source, and the study specifies a bounded prototype together with an evaluation protocol that compares the framework against single-LLM, guideline-only RAG, and multi-agent baselines using measures of diagnostic accuracy, factual grounding, risk-prediction discrimination, safety, explanation faithfulness, calibration, and runtime cost. The expected contribution is a coherent, verifiable architecture for longitudinal clinical decision support, an explicit account of how patient-timeline retrieval and a dedicated verification agent affect hallucination and safety, and a reproducible design that future work can implement and validate. The thesis is positioned as a design and methodology contribution that lays the foundation for empirical clinical evaluation.</w:t>
       </w:r>
     </w:p>
     <w:p>
@@ -1496,6 +1531,7 @@
       <w:pPr>
         <w:spacing w:lineRule="auto" w:line="360" w:before="0" w:after="0"/>
         <w:jc w:val="center"/>
+        <w:outlineLvl w:val="0"/>
       </w:pPr>
       <w:r>
         <w:rPr>
@@ -1525,6 +1561,7 @@
     <w:p>
       <w:pPr>
         <w:spacing w:lineRule="auto" w:line="360" w:after="120"/>
+        <w:ind w:firstLine="720"/>
         <w:jc w:val="both"/>
       </w:pPr>
       <w:r>
@@ -1539,15 +1576,17 @@
     </w:p>
     <w:p>
       <w:pPr>
+        <w:keepNext/>
         <w:spacing w:lineRule="auto" w:line="360" w:before="240" w:after="120"/>
         <w:jc w:val="left"/>
+        <w:outlineLvl w:val="1"/>
       </w:pPr>
       <w:r>
         <w:rPr>
           <w:rFonts w:ascii="Times New Roman" w:hAnsi="Times New Roman" w:cs="Times New Roman"/>
           <w:b/>
           <w:i w:val="0"/>
-          <w:sz w:val="24"/>
+          <w:sz w:val="28"/>
         </w:rPr>
         <w:t>1.1 Background</w:t>
       </w:r>
@@ -1555,6 +1594,7 @@
     <w:p>
       <w:pPr>
         <w:spacing w:lineRule="auto" w:line="360" w:after="120"/>
+        <w:ind w:firstLine="720"/>
         <w:jc w:val="both"/>
       </w:pPr>
       <w:r>
@@ -1570,6 +1610,7 @@
     <w:p>
       <w:pPr>
         <w:spacing w:lineRule="auto" w:line="360" w:after="120"/>
+        <w:ind w:firstLine="720"/>
         <w:jc w:val="both"/>
       </w:pPr>
       <w:r>
@@ -1585,6 +1626,7 @@
     <w:p>
       <w:pPr>
         <w:spacing w:lineRule="auto" w:line="360" w:after="120"/>
+        <w:ind w:firstLine="720"/>
         <w:jc w:val="both"/>
       </w:pPr>
       <w:r>
@@ -1600,6 +1642,7 @@
     <w:p>
       <w:pPr>
         <w:spacing w:lineRule="auto" w:line="360" w:after="120"/>
+        <w:ind w:firstLine="720"/>
         <w:jc w:val="both"/>
       </w:pPr>
       <w:r>
@@ -1615,6 +1658,7 @@
     <w:p>
       <w:pPr>
         <w:spacing w:lineRule="auto" w:line="360" w:after="120"/>
+        <w:ind w:firstLine="720"/>
         <w:jc w:val="both"/>
       </w:pPr>
       <w:r>
@@ -1629,15 +1673,17 @@
     </w:p>
     <w:p>
       <w:pPr>
+        <w:keepNext/>
         <w:spacing w:lineRule="auto" w:line="360" w:before="240" w:after="120"/>
         <w:jc w:val="left"/>
+        <w:outlineLvl w:val="1"/>
       </w:pPr>
       <w:r>
         <w:rPr>
           <w:rFonts w:ascii="Times New Roman" w:hAnsi="Times New Roman" w:cs="Times New Roman"/>
           <w:b/>
           <w:i w:val="0"/>
-          <w:sz w:val="24"/>
+          <w:sz w:val="28"/>
         </w:rPr>
         <w:t>1.2 Problem Statement</w:t>
       </w:r>
@@ -1645,6 +1691,7 @@
     <w:p>
       <w:pPr>
         <w:spacing w:lineRule="auto" w:line="360" w:after="120"/>
+        <w:ind w:firstLine="720"/>
         <w:jc w:val="both"/>
       </w:pPr>
       <w:r>
@@ -1660,6 +1707,7 @@
     <w:p>
       <w:pPr>
         <w:spacing w:lineRule="auto" w:line="360" w:after="120"/>
+        <w:ind w:firstLine="720"/>
         <w:jc w:val="both"/>
       </w:pPr>
       <w:r>
@@ -1675,6 +1723,7 @@
     <w:p>
       <w:pPr>
         <w:spacing w:lineRule="auto" w:line="360" w:after="120"/>
+        <w:ind w:firstLine="720"/>
         <w:jc w:val="both"/>
       </w:pPr>
       <w:r>
@@ -1690,6 +1739,7 @@
     <w:p>
       <w:pPr>
         <w:spacing w:lineRule="auto" w:line="360" w:after="120"/>
+        <w:ind w:firstLine="720"/>
         <w:jc w:val="both"/>
       </w:pPr>
       <w:r>
@@ -1704,15 +1754,17 @@
     </w:p>
     <w:p>
       <w:pPr>
+        <w:keepNext/>
         <w:spacing w:lineRule="auto" w:line="360" w:before="240" w:after="120"/>
         <w:jc w:val="left"/>
+        <w:outlineLvl w:val="1"/>
       </w:pPr>
       <w:r>
         <w:rPr>
           <w:rFonts w:ascii="Times New Roman" w:hAnsi="Times New Roman" w:cs="Times New Roman"/>
           <w:b/>
           <w:i w:val="0"/>
-          <w:sz w:val="24"/>
+          <w:sz w:val="28"/>
         </w:rPr>
         <w:t>1.3 Research Objectives</w:t>
       </w:r>
@@ -1720,6 +1772,7 @@
     <w:p>
       <w:pPr>
         <w:spacing w:lineRule="auto" w:line="360" w:after="120"/>
+        <w:ind w:firstLine="720"/>
         <w:jc w:val="both"/>
       </w:pPr>
       <w:r>
@@ -1735,6 +1788,7 @@
     <w:p>
       <w:pPr>
         <w:spacing w:lineRule="auto" w:line="360" w:after="120"/>
+        <w:ind w:firstLine="720"/>
         <w:jc w:val="both"/>
       </w:pPr>
       <w:r>
@@ -1749,15 +1803,17 @@
     </w:p>
     <w:p>
       <w:pPr>
+        <w:keepNext/>
         <w:spacing w:lineRule="auto" w:line="360" w:before="240" w:after="120"/>
         <w:jc w:val="left"/>
+        <w:outlineLvl w:val="1"/>
       </w:pPr>
       <w:r>
         <w:rPr>
           <w:rFonts w:ascii="Times New Roman" w:hAnsi="Times New Roman" w:cs="Times New Roman"/>
           <w:b/>
           <w:i w:val="0"/>
-          <w:sz w:val="24"/>
+          <w:sz w:val="28"/>
         </w:rPr>
         <w:t>1.4 Research Questions</w:t>
       </w:r>
@@ -1765,6 +1821,7 @@
     <w:p>
       <w:pPr>
         <w:spacing w:lineRule="auto" w:line="360" w:after="120"/>
+        <w:ind w:firstLine="720"/>
         <w:jc w:val="both"/>
       </w:pPr>
       <w:r>
@@ -1780,6 +1837,7 @@
     <w:p>
       <w:pPr>
         <w:spacing w:lineRule="auto" w:line="360" w:after="120"/>
+        <w:ind w:firstLine="720"/>
         <w:jc w:val="both"/>
       </w:pPr>
       <w:r>
@@ -1804,6 +1862,7 @@
     <w:p>
       <w:pPr>
         <w:spacing w:lineRule="auto" w:line="360" w:after="120"/>
+        <w:ind w:firstLine="720"/>
         <w:jc w:val="both"/>
       </w:pPr>
       <w:r>
@@ -1828,6 +1887,7 @@
     <w:p>
       <w:pPr>
         <w:spacing w:lineRule="auto" w:line="360" w:after="120"/>
+        <w:ind w:firstLine="720"/>
         <w:jc w:val="both"/>
       </w:pPr>
       <w:r>
@@ -1852,6 +1912,7 @@
     <w:p>
       <w:pPr>
         <w:spacing w:lineRule="auto" w:line="360" w:after="120"/>
+        <w:ind w:firstLine="720"/>
         <w:jc w:val="both"/>
       </w:pPr>
       <w:r>
@@ -1876,6 +1937,7 @@
     <w:p>
       <w:pPr>
         <w:spacing w:lineRule="auto" w:line="360" w:after="120"/>
+        <w:ind w:firstLine="720"/>
         <w:jc w:val="both"/>
       </w:pPr>
       <w:r>
@@ -1900,6 +1962,7 @@
     <w:p>
       <w:pPr>
         <w:spacing w:lineRule="auto" w:line="360" w:after="120"/>
+        <w:ind w:firstLine="720"/>
         <w:jc w:val="both"/>
       </w:pPr>
       <w:r>
@@ -1914,15 +1977,17 @@
     </w:p>
     <w:p>
       <w:pPr>
+        <w:keepNext/>
         <w:spacing w:lineRule="auto" w:line="360" w:before="240" w:after="120"/>
         <w:jc w:val="left"/>
+        <w:outlineLvl w:val="1"/>
       </w:pPr>
       <w:r>
         <w:rPr>
           <w:rFonts w:ascii="Times New Roman" w:hAnsi="Times New Roman" w:cs="Times New Roman"/>
           <w:b/>
           <w:i w:val="0"/>
-          <w:sz w:val="24"/>
+          <w:sz w:val="28"/>
         </w:rPr>
         <w:t>1.5 Scope of the Research</w:t>
       </w:r>
@@ -1930,6 +1995,7 @@
     <w:p>
       <w:pPr>
         <w:spacing w:lineRule="auto" w:line="360" w:after="120"/>
+        <w:ind w:firstLine="720"/>
         <w:jc w:val="both"/>
       </w:pPr>
       <w:r>
@@ -1945,6 +2011,7 @@
     <w:p>
       <w:pPr>
         <w:spacing w:lineRule="auto" w:line="360" w:after="120"/>
+        <w:ind w:firstLine="720"/>
         <w:jc w:val="both"/>
       </w:pPr>
       <w:r>
@@ -1960,6 +2027,7 @@
     <w:p>
       <w:pPr>
         <w:spacing w:lineRule="auto" w:line="360" w:after="120"/>
+        <w:ind w:firstLine="720"/>
         <w:jc w:val="both"/>
       </w:pPr>
       <w:r>
@@ -1974,15 +2042,17 @@
     </w:p>
     <w:p>
       <w:pPr>
+        <w:keepNext/>
         <w:spacing w:lineRule="auto" w:line="360" w:before="240" w:after="120"/>
         <w:jc w:val="left"/>
+        <w:outlineLvl w:val="1"/>
       </w:pPr>
       <w:r>
         <w:rPr>
           <w:rFonts w:ascii="Times New Roman" w:hAnsi="Times New Roman" w:cs="Times New Roman"/>
           <w:b/>
           <w:i w:val="0"/>
-          <w:sz w:val="24"/>
+          <w:sz w:val="28"/>
         </w:rPr>
         <w:t>1.6 Significance of the Research</w:t>
       </w:r>
@@ -1990,6 +2060,7 @@
     <w:p>
       <w:pPr>
         <w:spacing w:lineRule="auto" w:line="360" w:after="120"/>
+        <w:ind w:firstLine="720"/>
         <w:jc w:val="both"/>
       </w:pPr>
       <w:r>
@@ -2005,6 +2076,7 @@
     <w:p>
       <w:pPr>
         <w:spacing w:lineRule="auto" w:line="360" w:after="120"/>
+        <w:ind w:firstLine="720"/>
         <w:jc w:val="both"/>
       </w:pPr>
       <w:r>
@@ -2020,6 +2092,7 @@
     <w:p>
       <w:pPr>
         <w:spacing w:lineRule="auto" w:line="360" w:after="120"/>
+        <w:ind w:firstLine="720"/>
         <w:jc w:val="both"/>
       </w:pPr>
       <w:r>
@@ -2034,15 +2107,17 @@
     </w:p>
     <w:p>
       <w:pPr>
+        <w:keepNext/>
         <w:spacing w:lineRule="auto" w:line="360" w:before="240" w:after="120"/>
         <w:jc w:val="left"/>
+        <w:outlineLvl w:val="1"/>
       </w:pPr>
       <w:r>
         <w:rPr>
           <w:rFonts w:ascii="Times New Roman" w:hAnsi="Times New Roman" w:cs="Times New Roman"/>
           <w:b/>
           <w:i w:val="0"/>
-          <w:sz w:val="24"/>
+          <w:sz w:val="28"/>
         </w:rPr>
         <w:t>1.7 Research Methodology Overview</w:t>
       </w:r>
@@ -2050,6 +2125,7 @@
     <w:p>
       <w:pPr>
         <w:spacing w:lineRule="auto" w:line="360" w:after="120"/>
+        <w:ind w:firstLine="720"/>
         <w:jc w:val="both"/>
       </w:pPr>
       <w:r>
@@ -2065,6 +2141,7 @@
     <w:p>
       <w:pPr>
         <w:spacing w:lineRule="auto" w:line="360" w:after="120"/>
+        <w:ind w:firstLine="720"/>
         <w:jc w:val="both"/>
       </w:pPr>
       <w:r>
@@ -2079,15 +2156,17 @@
     </w:p>
     <w:p>
       <w:pPr>
+        <w:keepNext/>
         <w:spacing w:lineRule="auto" w:line="360" w:before="240" w:after="120"/>
         <w:jc w:val="left"/>
+        <w:outlineLvl w:val="1"/>
       </w:pPr>
       <w:r>
         <w:rPr>
           <w:rFonts w:ascii="Times New Roman" w:hAnsi="Times New Roman" w:cs="Times New Roman"/>
           <w:b/>
           <w:i w:val="0"/>
-          <w:sz w:val="24"/>
+          <w:sz w:val="28"/>
         </w:rPr>
         <w:t>1.8 Thesis Organization</w:t>
       </w:r>
@@ -2095,6 +2174,7 @@
     <w:p>
       <w:pPr>
         <w:spacing w:lineRule="auto" w:line="360" w:after="120"/>
+        <w:ind w:firstLine="720"/>
         <w:jc w:val="both"/>
       </w:pPr>
       <w:r>
@@ -2110,6 +2190,7 @@
     <w:p>
       <w:pPr>
         <w:spacing w:lineRule="auto" w:line="360" w:after="120"/>
+        <w:ind w:firstLine="720"/>
         <w:jc w:val="both"/>
       </w:pPr>
       <w:r>
@@ -2124,15 +2205,17 @@
     </w:p>
     <w:p>
       <w:pPr>
+        <w:keepNext/>
         <w:spacing w:lineRule="auto" w:line="360" w:before="240" w:after="120"/>
         <w:jc w:val="left"/>
+        <w:outlineLvl w:val="1"/>
       </w:pPr>
       <w:r>
         <w:rPr>
           <w:rFonts w:ascii="Times New Roman" w:hAnsi="Times New Roman" w:cs="Times New Roman"/>
           <w:b/>
           <w:i w:val="0"/>
-          <w:sz w:val="24"/>
+          <w:sz w:val="28"/>
         </w:rPr>
         <w:t>1.9 Chapter Summary</w:t>
       </w:r>
@@ -2140,6 +2223,7 @@
     <w:p>
       <w:pPr>
         <w:spacing w:lineRule="auto" w:line="360" w:after="120"/>
+        <w:ind w:firstLine="720"/>
         <w:jc w:val="both"/>
       </w:pPr>
       <w:r>
@@ -2161,6 +2245,7 @@
       <w:pPr>
         <w:spacing w:lineRule="auto" w:line="360" w:before="0" w:after="0"/>
         <w:jc w:val="center"/>
+        <w:outlineLvl w:val="0"/>
       </w:pPr>
       <w:r>
         <w:rPr>
@@ -2190,6 +2275,7 @@
     <w:p>
       <w:pPr>
         <w:spacing w:lineRule="auto" w:line="360" w:after="120"/>
+        <w:ind w:firstLine="720"/>
         <w:jc w:val="both"/>
       </w:pPr>
       <w:r>
@@ -2204,15 +2290,17 @@
     </w:p>
     <w:p>
       <w:pPr>
+        <w:keepNext/>
         <w:spacing w:lineRule="auto" w:line="360" w:before="240" w:after="120"/>
         <w:jc w:val="left"/>
+        <w:outlineLvl w:val="1"/>
       </w:pPr>
       <w:r>
         <w:rPr>
           <w:rFonts w:ascii="Times New Roman" w:hAnsi="Times New Roman" w:cs="Times New Roman"/>
           <w:b/>
           <w:i w:val="0"/>
-          <w:sz w:val="24"/>
+          <w:sz w:val="28"/>
         </w:rPr>
         <w:t>2.1 Introduction</w:t>
       </w:r>
@@ -2220,6 +2308,7 @@
     <w:p>
       <w:pPr>
         <w:spacing w:lineRule="auto" w:line="360" w:after="120"/>
+        <w:ind w:firstLine="720"/>
         <w:jc w:val="both"/>
       </w:pPr>
       <w:r>
@@ -2235,6 +2324,7 @@
     <w:p>
       <w:pPr>
         <w:spacing w:lineRule="auto" w:line="360" w:after="120"/>
+        <w:ind w:firstLine="720"/>
         <w:jc w:val="both"/>
       </w:pPr>
       <w:r>
@@ -2250,6 +2340,7 @@
     <w:p>
       <w:pPr>
         <w:spacing w:lineRule="auto" w:line="360" w:after="120"/>
+        <w:ind w:firstLine="720"/>
         <w:jc w:val="both"/>
       </w:pPr>
       <w:r>
@@ -2264,15 +2355,17 @@
     </w:p>
     <w:p>
       <w:pPr>
+        <w:keepNext/>
         <w:spacing w:lineRule="auto" w:line="360" w:before="240" w:after="120"/>
         <w:jc w:val="left"/>
+        <w:outlineLvl w:val="1"/>
       </w:pPr>
       <w:r>
         <w:rPr>
           <w:rFonts w:ascii="Times New Roman" w:hAnsi="Times New Roman" w:cs="Times New Roman"/>
           <w:b/>
           <w:i w:val="0"/>
-          <w:sz w:val="24"/>
+          <w:sz w:val="28"/>
         </w:rPr>
         <w:t>2.2 Large Language Models and LLM-Based Agents</w:t>
       </w:r>
@@ -2280,6 +2373,7 @@
     <w:p>
       <w:pPr>
         <w:spacing w:lineRule="auto" w:line="360" w:after="120"/>
+        <w:ind w:firstLine="720"/>
         <w:jc w:val="both"/>
       </w:pPr>
       <w:r>
@@ -2295,6 +2389,7 @@
     <w:p>
       <w:pPr>
         <w:spacing w:lineRule="auto" w:line="360" w:after="120"/>
+        <w:ind w:firstLine="720"/>
         <w:jc w:val="both"/>
       </w:pPr>
       <w:r>
@@ -2328,6 +2423,7 @@
     <w:p>
       <w:pPr>
         <w:spacing w:lineRule="auto" w:line="360" w:after="120"/>
+        <w:ind w:firstLine="720"/>
         <w:jc w:val="both"/>
       </w:pPr>
       <w:r>
@@ -2397,6 +2493,7 @@
     <w:p>
       <w:pPr>
         <w:spacing w:lineRule="auto" w:line="360" w:after="120"/>
+        <w:ind w:firstLine="720"/>
         <w:jc w:val="both"/>
       </w:pPr>
       <w:r>
@@ -2412,6 +2509,7 @@
     <w:p>
       <w:pPr>
         <w:spacing w:lineRule="auto" w:line="360" w:after="120"/>
+        <w:ind w:firstLine="720"/>
         <w:jc w:val="both"/>
       </w:pPr>
       <w:r>
@@ -2426,23 +2524,27 @@
     </w:p>
     <w:p>
       <w:pPr>
+        <w:keepNext/>
         <w:spacing w:lineRule="auto" w:line="360" w:before="240" w:after="120"/>
         <w:jc w:val="left"/>
+        <w:outlineLvl w:val="1"/>
       </w:pPr>
       <w:r>
         <w:rPr>
           <w:rFonts w:ascii="Times New Roman" w:hAnsi="Times New Roman" w:cs="Times New Roman"/>
           <w:b/>
           <w:i w:val="0"/>
-          <w:sz w:val="24"/>
+          <w:sz w:val="28"/>
         </w:rPr>
         <w:t>2.3 Agentic AI: Concepts and Evolution</w:t>
       </w:r>
     </w:p>
     <w:p>
       <w:pPr>
+        <w:keepNext/>
         <w:spacing w:lineRule="auto" w:line="360" w:before="240" w:after="120"/>
         <w:jc w:val="left"/>
+        <w:outlineLvl w:val="2"/>
       </w:pPr>
       <w:r>
         <w:rPr>
@@ -2457,6 +2559,7 @@
     <w:p>
       <w:pPr>
         <w:spacing w:lineRule="auto" w:line="360" w:after="120"/>
+        <w:ind w:firstLine="720"/>
         <w:jc w:val="both"/>
       </w:pPr>
       <w:r>
@@ -2472,6 +2575,7 @@
     <w:p>
       <w:pPr>
         <w:spacing w:lineRule="auto" w:line="360" w:after="120"/>
+        <w:ind w:firstLine="720"/>
         <w:jc w:val="both"/>
       </w:pPr>
       <w:r>
@@ -2486,8 +2590,10 @@
     </w:p>
     <w:p>
       <w:pPr>
+        <w:keepNext/>
         <w:spacing w:lineRule="auto" w:line="360" w:before="240" w:after="120"/>
         <w:jc w:val="left"/>
+        <w:outlineLvl w:val="2"/>
       </w:pPr>
       <w:r>
         <w:rPr>
@@ -2502,6 +2608,7 @@
     <w:p>
       <w:pPr>
         <w:spacing w:lineRule="auto" w:line="360" w:after="120"/>
+        <w:ind w:firstLine="720"/>
         <w:jc w:val="both"/>
       </w:pPr>
       <w:r>
@@ -2517,6 +2624,7 @@
     <w:p>
       <w:pPr>
         <w:spacing w:lineRule="auto" w:line="360" w:after="120"/>
+        <w:ind w:firstLine="720"/>
         <w:jc w:val="both"/>
       </w:pPr>
       <w:r>
@@ -2531,8 +2639,10 @@
     </w:p>
     <w:p>
       <w:pPr>
+        <w:keepNext/>
         <w:spacing w:lineRule="auto" w:line="360" w:before="240" w:after="120"/>
         <w:jc w:val="left"/>
+        <w:outlineLvl w:val="2"/>
       </w:pPr>
       <w:r>
         <w:rPr>
@@ -2547,6 +2657,7 @@
     <w:p>
       <w:pPr>
         <w:spacing w:lineRule="auto" w:line="360" w:after="120"/>
+        <w:ind w:firstLine="720"/>
         <w:jc w:val="both"/>
       </w:pPr>
       <w:r>
@@ -2598,6 +2709,7 @@
     <w:p>
       <w:pPr>
         <w:spacing w:lineRule="auto" w:line="360" w:after="120"/>
+        <w:ind w:firstLine="720"/>
         <w:jc w:val="both"/>
       </w:pPr>
       <w:r>
@@ -2675,8 +2787,10 @@
     </w:p>
     <w:p>
       <w:pPr>
+        <w:keepNext/>
         <w:spacing w:lineRule="auto" w:line="360" w:before="240" w:after="120"/>
         <w:jc w:val="left"/>
+        <w:outlineLvl w:val="2"/>
       </w:pPr>
       <w:r>
         <w:rPr>
@@ -2691,6 +2805,7 @@
     <w:p>
       <w:pPr>
         <w:spacing w:lineRule="auto" w:line="360" w:after="120"/>
+        <w:ind w:firstLine="720"/>
         <w:jc w:val="both"/>
       </w:pPr>
       <w:r>
@@ -2706,6 +2821,7 @@
     <w:p>
       <w:pPr>
         <w:spacing w:lineRule="auto" w:line="360" w:after="120"/>
+        <w:ind w:firstLine="720"/>
         <w:jc w:val="both"/>
       </w:pPr>
       <w:r>
@@ -2720,8 +2836,10 @@
     </w:p>
     <w:p>
       <w:pPr>
+        <w:keepNext/>
         <w:spacing w:lineRule="auto" w:line="360" w:before="240" w:after="120"/>
         <w:jc w:val="left"/>
+        <w:outlineLvl w:val="2"/>
       </w:pPr>
       <w:r>
         <w:rPr>
@@ -2736,6 +2854,7 @@
     <w:p>
       <w:pPr>
         <w:spacing w:lineRule="auto" w:line="360" w:after="120"/>
+        <w:ind w:firstLine="720"/>
         <w:jc w:val="both"/>
       </w:pPr>
       <w:r>
@@ -2750,8 +2869,10 @@
     </w:p>
     <w:p>
       <w:pPr>
+        <w:keepNext/>
         <w:spacing w:lineRule="auto" w:line="360" w:before="240" w:after="120"/>
         <w:jc w:val="left"/>
+        <w:outlineLvl w:val="2"/>
       </w:pPr>
       <w:r>
         <w:rPr>
@@ -2766,6 +2887,7 @@
     <w:p>
       <w:pPr>
         <w:spacing w:lineRule="auto" w:line="360" w:after="120"/>
+        <w:ind w:firstLine="720"/>
         <w:jc w:val="both"/>
       </w:pPr>
       <w:r>
@@ -2780,15 +2902,17 @@
     </w:p>
     <w:p>
       <w:pPr>
+        <w:keepNext/>
         <w:spacing w:lineRule="auto" w:line="360" w:before="240" w:after="120"/>
         <w:jc w:val="left"/>
+        <w:outlineLvl w:val="1"/>
       </w:pPr>
       <w:r>
         <w:rPr>
           <w:rFonts w:ascii="Times New Roman" w:hAnsi="Times New Roman" w:cs="Times New Roman"/>
           <w:b/>
           <w:i w:val="0"/>
-          <w:sz w:val="24"/>
+          <w:sz w:val="28"/>
         </w:rPr>
         <w:t>2.4 Agentic AI Frameworks</w:t>
       </w:r>
@@ -2796,6 +2920,7 @@
     <w:p>
       <w:pPr>
         <w:spacing w:lineRule="auto" w:line="360" w:after="120"/>
+        <w:ind w:firstLine="720"/>
         <w:jc w:val="both"/>
       </w:pPr>
       <w:r>
@@ -2811,6 +2936,7 @@
     <w:p>
       <w:pPr>
         <w:spacing w:lineRule="auto" w:line="360" w:after="120"/>
+        <w:ind w:firstLine="720"/>
         <w:jc w:val="both"/>
       </w:pPr>
       <w:r>
@@ -2844,6 +2970,7 @@
     <w:p>
       <w:pPr>
         <w:spacing w:lineRule="auto" w:line="360" w:after="120"/>
+        <w:ind w:firstLine="720"/>
         <w:jc w:val="both"/>
       </w:pPr>
       <w:r>
@@ -2895,6 +3022,7 @@
     <w:p>
       <w:pPr>
         <w:spacing w:lineRule="auto" w:line="360" w:after="120"/>
+        <w:ind w:firstLine="720"/>
         <w:jc w:val="both"/>
       </w:pPr>
       <w:r>
@@ -2946,6 +3074,7 @@
     <w:p>
       <w:pPr>
         <w:spacing w:lineRule="auto" w:line="360" w:after="120"/>
+        <w:ind w:firstLine="720"/>
         <w:jc w:val="both"/>
       </w:pPr>
       <w:r>
@@ -3033,6 +3162,7 @@
     <w:p>
       <w:pPr>
         <w:spacing w:lineRule="auto" w:line="360" w:after="120"/>
+        <w:ind w:firstLine="720"/>
         <w:jc w:val="both"/>
       </w:pPr>
       <w:r>
@@ -3057,12 +3187,13 @@
           <w:i/>
           <w:sz w:val="24"/>
         </w:rPr>
-        <w:t>[Table 2.1 — Comparative analysis of reviewed frameworks — insert table here]</w:t>
+        <w:t>[Table 2.1: Comparative analysis of reviewed frameworks (insert table here)]</w:t>
       </w:r>
     </w:p>
     <w:p>
       <w:pPr>
         <w:spacing w:lineRule="auto" w:line="360" w:after="120"/>
+        <w:ind w:firstLine="720"/>
         <w:jc w:val="both"/>
       </w:pPr>
       <w:r>
@@ -3077,15 +3208,17 @@
     </w:p>
     <w:p>
       <w:pPr>
+        <w:keepNext/>
         <w:spacing w:lineRule="auto" w:line="360" w:before="240" w:after="120"/>
         <w:jc w:val="left"/>
+        <w:outlineLvl w:val="1"/>
       </w:pPr>
       <w:r>
         <w:rPr>
           <w:rFonts w:ascii="Times New Roman" w:hAnsi="Times New Roman" w:cs="Times New Roman"/>
           <w:b/>
           <w:i w:val="0"/>
-          <w:sz w:val="24"/>
+          <w:sz w:val="28"/>
         </w:rPr>
         <w:t>2.5 Taxonomy of LLM-Based Agents</w:t>
       </w:r>
@@ -3093,6 +3226,7 @@
     <w:p>
       <w:pPr>
         <w:spacing w:lineRule="auto" w:line="360" w:after="120"/>
+        <w:ind w:firstLine="720"/>
         <w:jc w:val="both"/>
       </w:pPr>
       <w:r>
@@ -3108,6 +3242,7 @@
     <w:p>
       <w:pPr>
         <w:spacing w:lineRule="auto" w:line="360" w:after="120"/>
+        <w:ind w:firstLine="720"/>
         <w:jc w:val="both"/>
       </w:pPr>
       <w:r>
@@ -3150,6 +3285,7 @@
     <w:p>
       <w:pPr>
         <w:spacing w:lineRule="auto" w:line="360" w:after="120"/>
+        <w:ind w:firstLine="720"/>
         <w:jc w:val="both"/>
       </w:pPr>
       <w:r>
@@ -3210,6 +3346,7 @@
     <w:p>
       <w:pPr>
         <w:spacing w:lineRule="auto" w:line="360" w:after="120"/>
+        <w:ind w:firstLine="720"/>
         <w:jc w:val="both"/>
       </w:pPr>
       <w:r>
@@ -3242,15 +3379,17 @@
     </w:p>
     <w:p>
       <w:pPr>
+        <w:keepNext/>
         <w:spacing w:lineRule="auto" w:line="360" w:before="240" w:after="120"/>
         <w:jc w:val="left"/>
+        <w:outlineLvl w:val="1"/>
       </w:pPr>
       <w:r>
         <w:rPr>
           <w:rFonts w:ascii="Times New Roman" w:hAnsi="Times New Roman" w:cs="Times New Roman"/>
           <w:b/>
           <w:i w:val="0"/>
-          <w:sz w:val="24"/>
+          <w:sz w:val="28"/>
         </w:rPr>
         <w:t>2.6 Artificial Intelligence in Healthcare</w:t>
       </w:r>
@@ -3258,6 +3397,7 @@
     <w:p>
       <w:pPr>
         <w:spacing w:lineRule="auto" w:line="360" w:after="120"/>
+        <w:ind w:firstLine="720"/>
         <w:jc w:val="both"/>
       </w:pPr>
       <w:r>
@@ -3272,8 +3412,10 @@
     </w:p>
     <w:p>
       <w:pPr>
+        <w:keepNext/>
         <w:spacing w:lineRule="auto" w:line="360" w:before="240" w:after="120"/>
         <w:jc w:val="left"/>
+        <w:outlineLvl w:val="2"/>
       </w:pPr>
       <w:r>
         <w:rPr>
@@ -3288,6 +3430,7 @@
     <w:p>
       <w:pPr>
         <w:spacing w:lineRule="auto" w:line="360" w:after="120"/>
+        <w:ind w:firstLine="720"/>
         <w:jc w:val="both"/>
       </w:pPr>
       <w:r>
@@ -3303,6 +3446,7 @@
     <w:p>
       <w:pPr>
         <w:spacing w:lineRule="auto" w:line="360" w:after="120"/>
+        <w:ind w:firstLine="720"/>
         <w:jc w:val="both"/>
       </w:pPr>
       <w:r>
@@ -3317,8 +3461,10 @@
     </w:p>
     <w:p>
       <w:pPr>
+        <w:keepNext/>
         <w:spacing w:lineRule="auto" w:line="360" w:before="240" w:after="120"/>
         <w:jc w:val="left"/>
+        <w:outlineLvl w:val="2"/>
       </w:pPr>
       <w:r>
         <w:rPr>
@@ -3333,6 +3479,7 @@
     <w:p>
       <w:pPr>
         <w:spacing w:lineRule="auto" w:line="360" w:after="120"/>
+        <w:ind w:firstLine="720"/>
         <w:jc w:val="both"/>
       </w:pPr>
       <w:r>
@@ -3420,6 +3567,7 @@
     <w:p>
       <w:pPr>
         <w:spacing w:lineRule="auto" w:line="360" w:after="120"/>
+        <w:ind w:firstLine="720"/>
         <w:jc w:val="both"/>
       </w:pPr>
       <w:r>
@@ -3434,15 +3582,17 @@
     </w:p>
     <w:p>
       <w:pPr>
+        <w:keepNext/>
         <w:spacing w:lineRule="auto" w:line="360" w:before="240" w:after="120"/>
         <w:jc w:val="left"/>
+        <w:outlineLvl w:val="1"/>
       </w:pPr>
       <w:r>
         <w:rPr>
           <w:rFonts w:ascii="Times New Roman" w:hAnsi="Times New Roman" w:cs="Times New Roman"/>
           <w:b/>
           <w:i w:val="0"/>
-          <w:sz w:val="24"/>
+          <w:sz w:val="28"/>
         </w:rPr>
         <w:t>2.7 Clinical Decision Support</w:t>
       </w:r>
@@ -3450,6 +3600,7 @@
     <w:p>
       <w:pPr>
         <w:spacing w:lineRule="auto" w:line="360" w:after="120"/>
+        <w:ind w:firstLine="720"/>
         <w:jc w:val="both"/>
       </w:pPr>
       <w:r>
@@ -3464,8 +3615,10 @@
     </w:p>
     <w:p>
       <w:pPr>
+        <w:keepNext/>
         <w:spacing w:lineRule="auto" w:line="360" w:before="240" w:after="120"/>
         <w:jc w:val="left"/>
+        <w:outlineLvl w:val="2"/>
       </w:pPr>
       <w:r>
         <w:rPr>
@@ -3480,6 +3633,7 @@
     <w:p>
       <w:pPr>
         <w:spacing w:lineRule="auto" w:line="360" w:after="120"/>
+        <w:ind w:firstLine="720"/>
         <w:jc w:val="both"/>
       </w:pPr>
       <w:r>
@@ -3495,6 +3649,7 @@
     <w:p>
       <w:pPr>
         <w:spacing w:lineRule="auto" w:line="360" w:after="120"/>
+        <w:ind w:firstLine="720"/>
         <w:jc w:val="both"/>
       </w:pPr>
       <w:r>
@@ -3509,8 +3664,10 @@
     </w:p>
     <w:p>
       <w:pPr>
+        <w:keepNext/>
         <w:spacing w:lineRule="auto" w:line="360" w:before="240" w:after="120"/>
         <w:jc w:val="left"/>
+        <w:outlineLvl w:val="2"/>
       </w:pPr>
       <w:r>
         <w:rPr>
@@ -3525,6 +3682,7 @@
     <w:p>
       <w:pPr>
         <w:spacing w:lineRule="auto" w:line="360" w:after="120"/>
+        <w:ind w:firstLine="720"/>
         <w:jc w:val="both"/>
       </w:pPr>
       <w:r>
@@ -3540,6 +3698,7 @@
     <w:p>
       <w:pPr>
         <w:spacing w:lineRule="auto" w:line="360" w:after="120"/>
+        <w:ind w:firstLine="720"/>
         <w:jc w:val="both"/>
       </w:pPr>
       <w:r>
@@ -3554,15 +3713,17 @@
     </w:p>
     <w:p>
       <w:pPr>
+        <w:keepNext/>
         <w:spacing w:lineRule="auto" w:line="360" w:before="240" w:after="120"/>
         <w:jc w:val="left"/>
+        <w:outlineLvl w:val="1"/>
       </w:pPr>
       <w:r>
         <w:rPr>
           <w:rFonts w:ascii="Times New Roman" w:hAnsi="Times New Roman" w:cs="Times New Roman"/>
           <w:b/>
           <w:i w:val="0"/>
-          <w:sz w:val="24"/>
+          <w:sz w:val="28"/>
         </w:rPr>
         <w:t>2.8 Retrieval-Augmented Generation in Healthcare</w:t>
       </w:r>
@@ -3570,6 +3731,7 @@
     <w:p>
       <w:pPr>
         <w:spacing w:lineRule="auto" w:line="360" w:after="120"/>
+        <w:ind w:firstLine="720"/>
         <w:jc w:val="both"/>
       </w:pPr>
       <w:r>
@@ -3584,8 +3746,10 @@
     </w:p>
     <w:p>
       <w:pPr>
+        <w:keepNext/>
         <w:spacing w:lineRule="auto" w:line="360" w:before="240" w:after="120"/>
         <w:jc w:val="left"/>
+        <w:outlineLvl w:val="2"/>
       </w:pPr>
       <w:r>
         <w:rPr>
@@ -3600,6 +3764,7 @@
     <w:p>
       <w:pPr>
         <w:spacing w:lineRule="auto" w:line="360" w:after="120"/>
+        <w:ind w:firstLine="720"/>
         <w:jc w:val="both"/>
       </w:pPr>
       <w:r>
@@ -3615,6 +3780,7 @@
     <w:p>
       <w:pPr>
         <w:spacing w:lineRule="auto" w:line="360" w:after="120"/>
+        <w:ind w:firstLine="720"/>
         <w:jc w:val="both"/>
       </w:pPr>
       <w:r>
@@ -3629,8 +3795,10 @@
     </w:p>
     <w:p>
       <w:pPr>
+        <w:keepNext/>
         <w:spacing w:lineRule="auto" w:line="360" w:before="240" w:after="120"/>
         <w:jc w:val="left"/>
+        <w:outlineLvl w:val="2"/>
       </w:pPr>
       <w:r>
         <w:rPr>
@@ -3645,6 +3813,7 @@
     <w:p>
       <w:pPr>
         <w:spacing w:lineRule="auto" w:line="360" w:after="120"/>
+        <w:ind w:firstLine="720"/>
         <w:jc w:val="both"/>
       </w:pPr>
       <w:r>
@@ -3660,6 +3829,7 @@
     <w:p>
       <w:pPr>
         <w:spacing w:lineRule="auto" w:line="360" w:after="120"/>
+        <w:ind w:firstLine="720"/>
         <w:jc w:val="both"/>
       </w:pPr>
       <w:r>
@@ -3674,8 +3844,10 @@
     </w:p>
     <w:p>
       <w:pPr>
+        <w:keepNext/>
         <w:spacing w:lineRule="auto" w:line="360" w:before="240" w:after="120"/>
         <w:jc w:val="left"/>
+        <w:outlineLvl w:val="2"/>
       </w:pPr>
       <w:r>
         <w:rPr>
@@ -3690,6 +3862,7 @@
     <w:p>
       <w:pPr>
         <w:spacing w:lineRule="auto" w:line="360" w:after="120"/>
+        <w:ind w:firstLine="720"/>
         <w:jc w:val="both"/>
       </w:pPr>
       <w:r>
@@ -3705,6 +3878,7 @@
     <w:p>
       <w:pPr>
         <w:spacing w:lineRule="auto" w:line="360" w:after="120"/>
+        <w:ind w:firstLine="720"/>
         <w:jc w:val="both"/>
       </w:pPr>
       <w:r>
@@ -3719,15 +3893,17 @@
     </w:p>
     <w:p>
       <w:pPr>
+        <w:keepNext/>
         <w:spacing w:lineRule="auto" w:line="360" w:before="240" w:after="120"/>
         <w:jc w:val="left"/>
+        <w:outlineLvl w:val="1"/>
       </w:pPr>
       <w:r>
         <w:rPr>
           <w:rFonts w:ascii="Times New Roman" w:hAnsi="Times New Roman" w:cs="Times New Roman"/>
           <w:b/>
           <w:i w:val="0"/>
-          <w:sz w:val="24"/>
+          <w:sz w:val="28"/>
         </w:rPr>
         <w:t>2.9 Trustworthy AI in Clinical Decision Support</w:t>
       </w:r>
@@ -3735,6 +3911,7 @@
     <w:p>
       <w:pPr>
         <w:spacing w:lineRule="auto" w:line="360" w:after="120"/>
+        <w:ind w:firstLine="720"/>
         <w:jc w:val="both"/>
       </w:pPr>
       <w:r>
@@ -3750,6 +3927,7 @@
     <w:p>
       <w:pPr>
         <w:spacing w:lineRule="auto" w:line="360" w:after="120"/>
+        <w:ind w:firstLine="720"/>
         <w:jc w:val="both"/>
       </w:pPr>
       <w:r>
@@ -3765,6 +3943,7 @@
     <w:p>
       <w:pPr>
         <w:spacing w:lineRule="auto" w:line="360" w:after="120"/>
+        <w:ind w:firstLine="720"/>
         <w:jc w:val="both"/>
       </w:pPr>
       <w:r>
@@ -3780,6 +3959,7 @@
     <w:p>
       <w:pPr>
         <w:spacing w:lineRule="auto" w:line="360" w:after="120"/>
+        <w:ind w:firstLine="720"/>
         <w:jc w:val="both"/>
       </w:pPr>
       <w:r>
@@ -3795,6 +3975,7 @@
     <w:p>
       <w:pPr>
         <w:spacing w:lineRule="auto" w:line="360" w:after="120"/>
+        <w:ind w:firstLine="720"/>
         <w:jc w:val="both"/>
       </w:pPr>
       <w:r>
@@ -3809,15 +3990,17 @@
     </w:p>
     <w:p>
       <w:pPr>
+        <w:keepNext/>
         <w:spacing w:lineRule="auto" w:line="360" w:before="240" w:after="120"/>
         <w:jc w:val="left"/>
+        <w:outlineLvl w:val="1"/>
       </w:pPr>
       <w:r>
         <w:rPr>
           <w:rFonts w:ascii="Times New Roman" w:hAnsi="Times New Roman" w:cs="Times New Roman"/>
           <w:b/>
           <w:i w:val="0"/>
-          <w:sz w:val="24"/>
+          <w:sz w:val="28"/>
         </w:rPr>
         <w:t>2.10 Research Gap Analysis</w:t>
       </w:r>
@@ -3825,6 +4008,7 @@
     <w:p>
       <w:pPr>
         <w:spacing w:lineRule="auto" w:line="360" w:after="120"/>
+        <w:ind w:firstLine="720"/>
         <w:jc w:val="both"/>
       </w:pPr>
       <w:r>
@@ -3840,6 +4024,7 @@
     <w:p>
       <w:pPr>
         <w:spacing w:lineRule="auto" w:line="360" w:after="120"/>
+        <w:ind w:firstLine="720"/>
         <w:jc w:val="both"/>
       </w:pPr>
       <w:r>
@@ -3855,6 +4040,7 @@
     <w:p>
       <w:pPr>
         <w:spacing w:lineRule="auto" w:line="360" w:after="120"/>
+        <w:ind w:firstLine="720"/>
         <w:jc w:val="both"/>
       </w:pPr>
       <w:r>
@@ -3870,6 +4056,7 @@
     <w:p>
       <w:pPr>
         <w:spacing w:lineRule="auto" w:line="360" w:after="120"/>
+        <w:ind w:firstLine="720"/>
         <w:jc w:val="both"/>
       </w:pPr>
       <w:r>
@@ -3885,6 +4072,7 @@
     <w:p>
       <w:pPr>
         <w:spacing w:lineRule="auto" w:line="360" w:after="120"/>
+        <w:ind w:firstLine="720"/>
         <w:jc w:val="both"/>
       </w:pPr>
       <w:r>
@@ -3900,6 +4088,7 @@
     <w:p>
       <w:pPr>
         <w:spacing w:lineRule="auto" w:line="360" w:after="120"/>
+        <w:ind w:firstLine="720"/>
         <w:jc w:val="both"/>
       </w:pPr>
       <w:r>
@@ -3924,12 +4113,13 @@
           <w:i/>
           <w:sz w:val="24"/>
         </w:rPr>
-        <w:t>[Table 2.2 — Research gap matrix — insert table here]</w:t>
+        <w:t>[Table 2.2: Research gap matrix (insert table here)]</w:t>
       </w:r>
     </w:p>
     <w:p>
       <w:pPr>
         <w:spacing w:lineRule="auto" w:line="360" w:after="120"/>
+        <w:ind w:firstLine="720"/>
         <w:jc w:val="both"/>
       </w:pPr>
       <w:r>
@@ -3944,15 +4134,17 @@
     </w:p>
     <w:p>
       <w:pPr>
+        <w:keepNext/>
         <w:spacing w:lineRule="auto" w:line="360" w:before="240" w:after="120"/>
         <w:jc w:val="left"/>
+        <w:outlineLvl w:val="1"/>
       </w:pPr>
       <w:r>
         <w:rPr>
           <w:rFonts w:ascii="Times New Roman" w:hAnsi="Times New Roman" w:cs="Times New Roman"/>
           <w:b/>
           <w:i w:val="0"/>
-          <w:sz w:val="24"/>
+          <w:sz w:val="28"/>
         </w:rPr>
         <w:t>2.11 Chapter Summary</w:t>
       </w:r>
@@ -3960,6 +4152,7 @@
     <w:p>
       <w:pPr>
         <w:spacing w:lineRule="auto" w:line="360" w:after="120"/>
+        <w:ind w:firstLine="720"/>
         <w:jc w:val="both"/>
       </w:pPr>
       <w:r>
@@ -3975,6 +4168,7 @@
     <w:p>
       <w:pPr>
         <w:spacing w:lineRule="auto" w:line="360" w:after="120"/>
+        <w:ind w:firstLine="720"/>
         <w:jc w:val="both"/>
       </w:pPr>
       <w:r>
@@ -3996,6 +4190,7 @@
       <w:pPr>
         <w:spacing w:lineRule="auto" w:line="360" w:before="0" w:after="360"/>
         <w:jc w:val="center"/>
+        <w:outlineLvl w:val="0"/>
       </w:pPr>
       <w:r>
         <w:rPr>
@@ -4858,7 +5053,7 @@
       </w:r>
     </w:p>
     <w:sectPr>
-      <w:footerReference w:type="default" r:id="rId11"/>
+      <w:footerReference w:type="default" r:id="rId12"/>
       <w:pgSz w:w="11909" w:h="16834"/>
       <w:pgMar w:top="1440" w:right="1440" w:bottom="1440" w:left="1800" w:header="720" w:footer="720" w:gutter="0"/>
       <w:cols w:space="720"/>

</xml_diff>

<commit_message>
Update thesis document with personalized dedication and acknowledgements
</commit_message>
<xml_diff>
--- a/07_Thesis/Thesis_Ch1_Ch2.docx
+++ b/07_Thesis/Thesis_Ch1_Ch2.docx
@@ -913,7 +913,7 @@
           <w:i/>
           <w:sz w:val="24"/>
         </w:rPr>
-        <w:t>To [dedication text, begins with the word “To”].</w:t>
+        <w:t>To my parents and family.</w:t>
       </w:r>
     </w:p>
     <w:p>
@@ -949,7 +949,22 @@
           <w:i w:val="0"/>
           <w:sz w:val="24"/>
         </w:rPr>
-        <w:t>[Acknowledge your supervisor, collaborators, department, family, and any funding source here. This page is optional and can be personalized before submission.]</w:t>
+        <w:t>I am deeply grateful to my supervisor, Dr. Fawad Nasim, for the invaluable guidance, encouragement, and continuous support provided throughout this research, which shaped both the direction and the rigor of this work.</w:t>
+      </w:r>
+    </w:p>
+    <w:p>
+      <w:pPr>
+        <w:spacing w:lineRule="auto" w:line="360" w:after="120"/>
+        <w:jc w:val="both"/>
+      </w:pPr>
+      <w:r>
+        <w:rPr>
+          <w:rFonts w:ascii="Times New Roman" w:hAnsi="Times New Roman" w:cs="Times New Roman"/>
+          <w:b w:val="0"/>
+          <w:i w:val="0"/>
+          <w:sz w:val="24"/>
+        </w:rPr>
+        <w:t>I also thank the faculty and staff of the Department of Computer Science, The Superior University, Lahore, for the academic environment and resources that made this study possible. Finally, I thank my family for their patience and unwavering support throughout my studies.</w:t>
       </w:r>
     </w:p>
     <w:p>
@@ -3921,7 +3936,7 @@
           <w:i w:val="0"/>
           <w:sz w:val="24"/>
         </w:rPr>
-        <w:t>Accuracy is necessary for clinical AI but nowhere near sufficient. Because a recommendation can change how a patient is treated, the system that produces it has to be reliable, transparent, and answerable in ways a diagnostic classifier never had to be. This is the demand the notion of Trustworthy AI tries to capture: artificial intelligence that is safe, explainable, fair, and accountable rather than merely performant [30][31]. In medicine the stakes give the word "trust" an operational meaning, since a physician who cannot see why a recommendation was made cannot responsibly act on it, and adoption stalls exactly there. The mechanisms that turn trustworthiness from an aspiration into architecture, explainability, safety, fairness, auditability, and human oversight, are examined below, and most current systems name these goals more thoroughly than they implement them.</w:t>
+        <w:t>Accuracy is necessary for clinical AI but nowhere near sufficient. Because a recommendation can change how a patient is treated, the system that produces it has to be reliable, transparent, and answerable in ways a diagnostic classifier never had to be. This is the demand the notion of Trustworthy AI tries to capture: artificial intelligence that is safe, explainable, fair, and accountable rather than merely performant [30]. In medicine the stakes give the word "trust" an operational meaning, since a physician who cannot see why a recommendation was made cannot responsibly act on it, and adoption stalls exactly there. The mechanisms that turn trustworthiness from an aspiration into architecture, explainability, safety, fairness, auditability, and human oversight, are examined below, and most current systems name these goals more thoroughly than they implement them.</w:t>
       </w:r>
     </w:p>
     <w:p>
@@ -3985,7 +4000,7 @@
           <w:i w:val="0"/>
           <w:sz w:val="24"/>
         </w:rPr>
-        <w:t>The proposed framework accordingly carries a dedicated trustworthy-AI layer so these safeguards are structural rather than optional, bringing together an explainability module, a safety-verification module, a bias-monitoring module, an audit-logging system, and human-in-the-loop validation, running alongside the reasoning and orchestration layers so that no recommendation reaches a clinician without supporting evidence and a record of how it was produced [30][31]. Placing trust mechanisms in their own layer is itself a claim, that trustworthiness is a first-class architectural concern, and the burden the thesis accepts is to show these components interacting rather than merely listed. This matters because, although trustworthy AI is now a stated priority, the gap between statement and implementation is wide: many systems report strong predictive performance while lacking coherent mechanisms for transparency, accountability, and continuous monitoring, and most agentic frameworks are built for general-purpose use and never confront the specific ethical and regulatory demands of clinical settings [30][31]. The framework's response is to integrate these safeguards into the architecture rather than append them, while remaining honest that these mechanisms manage risk rather than eliminate it.</w:t>
+        <w:t>The proposed framework accordingly carries a dedicated trustworthy-AI layer so these safeguards are structural rather than optional, bringing together an explainability module, a safety-verification module, a bias-monitoring module, an audit-logging system, and human-in-the-loop validation, running alongside the reasoning and orchestration layers so that no recommendation reaches a clinician without supporting evidence and a record of how it was produced [30]. Placing trust mechanisms in their own layer is itself a claim, that trustworthiness is a first-class architectural concern, and the burden the thesis accepts is to show these components interacting rather than merely listed. This matters because, although trustworthy AI is now a stated priority, the gap between statement and implementation is wide: many systems report strong predictive performance while lacking coherent mechanisms for transparency, accountability, and continuous monitoring, and most agentic frameworks are built for general-purpose use and never confront the specific ethical and regulatory demands of clinical settings [30]. The framework's response is to integrate these safeguards into the architecture rather than append them, while remaining honest that these mechanisms manage risk rather than eliminate it.</w:t>
       </w:r>
     </w:p>
     <w:p>
@@ -4050,7 +4065,7 @@
           <w:i w:val="0"/>
           <w:sz w:val="24"/>
         </w:rPr>
-        <w:t>The first and most consequential shortcoming is evaluation on static examination question answering rather than longitudinal, real clinical records. MedAgents reports its gains on MedQA, MedMCQA, PubMedQA, and MMLU [10][32], and Agent Hospital, despite its evolving simulacrum of doctor and patient agents, ultimately benchmarks the acquired expertise on MedQA drawn from the USMLE [12][32]. AgentClinic moves toward interaction but with simulated rather than real patient trajectories [33]. Examination questions are curated and self-contained, whereas a real intensive-care admission is noisy, incompletely documented, and continually revised, so high exam accuracy offers little assurance that an agent can follow a deteriorating patient across days of MIMIC-IV observations [14]. Effective monitoring requires continuous access to previous admissions, laboratory results, medications, diagnoses, and treatment history, which examination benchmarks do not exercise.</w:t>
+        <w:t>The first and most consequential shortcoming is evaluation on static examination question answering rather than longitudinal, real clinical records. MedAgents reports its gains on MedQA, MedMCQA, PubMedQA, and MMLU [10][31], and Agent Hospital, despite its evolving simulacrum of doctor and patient agents, ultimately benchmarks the acquired expertise on MedQA drawn from the USMLE [12][31]. AgentClinic moves toward interaction but with simulated rather than real patient trajectories [32]. Examination questions are curated and self-contained, whereas a real intensive-care admission is noisy, incompletely documented, and continually revised, so high exam accuracy offers little assurance that an agent can follow a deteriorating patient across days of MIMIC-IV observations [14]. Effective monitoring requires continuous access to previous admissions, laboratory results, medications, diagnoses, and treatment history, which examination benchmarks do not exercise.</w:t>
       </w:r>
     </w:p>
     <w:p>
@@ -4066,7 +4081,7 @@
           <w:i w:val="0"/>
           <w:sz w:val="24"/>
         </w:rPr>
-        <w:t>The second shortcoming concerns what retrieval is grounded in. Several studies address hallucination through Retrieval-Augmented Generation, yet most implementations retrieve from guidelines, textbooks, or literature rather than from the specific patient. MedRAG couples retrieval with a diagnostic knowledge graph but is oriented toward snapshot differential diagnosis and evaluated on datasets rather than a longitudinal ICU record [11]; Med-PaLM encodes clinical knowledge parametrically and does not retrieve from a patient timeline at all [2]; and EHRAgent is the clearest step toward EHR grounding, executing code over structured records, yet it frames the task as answering discrete questions rather than maintaining a running, evidence-linked model of a patient over an admission [34]. What is missing is retrieval anchored to the patient timeline, combining structured EHR evidence with medical literature so that patient-specific evidence enters the decision. The literature also exposes limits in reasoning reliability: Chain-of-Thought prompting, ReAct, and collaborative multi-agent reasoning improve decision quality [20][5][10], but hallucinated responses remain a considerable concern, and many systems still produce recommendations without verifiable evidence, which reduces clinician confidence. A related structural issue is that many healthcare AI systems operate as standalone models rather than collaborative multi-agent environments, so multi-agent collaboration for real-world clinical decision support remains an emerging rather than an established practice [6][18][10].</w:t>
+        <w:t>The second shortcoming concerns what retrieval is grounded in. Several studies address hallucination through Retrieval-Augmented Generation, yet most implementations retrieve from guidelines, textbooks, or literature rather than from the specific patient. MedRAG couples retrieval with a diagnostic knowledge graph but is oriented toward snapshot differential diagnosis and evaluated on datasets rather than a longitudinal ICU record [11]; Med-PaLM encodes clinical knowledge parametrically and does not retrieve from a patient timeline at all [2]; and EHRAgent is the clearest step toward EHR grounding, executing code over structured records, yet it frames the task as answering discrete questions rather than maintaining a running, evidence-linked model of a patient over an admission [33]. What is missing is retrieval anchored to the patient timeline, combining structured EHR evidence with medical literature so that patient-specific evidence enters the decision. The literature also exposes limits in reasoning reliability: Chain-of-Thought prompting, ReAct, and collaborative multi-agent reasoning improve decision quality [20][5][10], but hallucinated responses remain a considerable concern, and many systems still produce recommendations without verifiable evidence, which reduces clinician confidence. A related structural issue is that many healthcare AI systems operate as standalone models rather than collaborative multi-agent environments, so multi-agent collaboration for real-world clinical decision support remains an emerging rather than an established practice [6][18][10].</w:t>
       </w:r>
     </w:p>
     <w:p>
@@ -4098,7 +4113,7 @@
           <w:i w:val="0"/>
           <w:sz w:val="24"/>
         </w:rPr>
-        <w:t>A comparative view makes this concrete. When systems are scored on general capabilities, memory, planning, reasoning, multi-agent collaboration, healthcare focus, and trustworthiness, the rows for ReAct, AutoGen, MetaGPT, MedAgents, Agent Hospital, and MedRAG collapse into nearly identical marks, which is precisely why an integration-based claim to novelty is weak. When the same systems are scored on five differentiating dimensions, patient-timeline RAG grounded in the EHR, a dedicated verification gate, longitudinal per-patient memory, evaluation on real ICU data such as MIMIC-IV, and a faithful audit trail, no prior system carries more than a single mark, and most carry none [10][12][11][34][33][14]. Each prior system misses at least one of these dimensions, so the gap is real rather than rhetorical.</w:t>
+        <w:t>A comparative view makes this concrete. When systems are scored on general capabilities, memory, planning, reasoning, multi-agent collaboration, healthcare focus, and trustworthiness, the rows for ReAct, AutoGen, MetaGPT, MedAgents, Agent Hospital, and MedRAG collapse into nearly identical marks, which is precisely why an integration-based claim to novelty is weak. When the same systems are scored on five differentiating dimensions, patient-timeline RAG grounded in the EHR, a dedicated verification gate, longitudinal per-patient memory, evaluation on real ICU data such as MIMIC-IV, and a faithful audit trail, no prior system carries more than a single mark, and most carry none [10][12][11][33][32][14]. Each prior system misses at least one of these dimensions, so the gap is real rather than rhetorical.</w:t>
       </w:r>
     </w:p>
     <w:p>
@@ -4162,7 +4177,7 @@
           <w:i w:val="0"/>
           <w:sz w:val="24"/>
         </w:rPr>
-        <w:t>This chapter reviewed the literature on Large Language Models, Agentic AI, Retrieval-Augmented Generation, multi-agent systems, and healthcare artificial intelligence, and read it critically to locate a defensible research gap. It traced the evolution of LLMs into LLM-based agents and then into Agentic AI, and examined the architectural components, memory, planning, reasoning, tool use, and multi-agent collaboration, that convert a passive model into a goal-directed system [3][4]. It analyzed influential agent frameworks, including ReAct, AutoGen, CAMEL, MetaGPT, Toolformer, Reflexion, Voyager, and Generative Agents, organizing their capabilities into a taxonomy and showing that each supplies a mechanism a clinical system needs while none supplies the whole [5][6][7][18][23][19][24][8]. Turning to the clinical domain, it reviewed artificial intelligence and Large Language Models in healthcare, clinical decision support, Retrieval-Augmented Generation, and trustworthy-AI mechanisms, examining systems such as Med-PaLM, Med-PaLM 2, Med-PaLM M, Clinical Camel, MedAgents, MedRAG, Agent Hospital, and EHRAgent [2][26][25][13][10][11][12][34].</w:t>
+        <w:t>This chapter reviewed the literature on Large Language Models, Agentic AI, Retrieval-Augmented Generation, multi-agent systems, and healthcare artificial intelligence, and read it critically to locate a defensible research gap. It traced the evolution of LLMs into LLM-based agents and then into Agentic AI, and examined the architectural components, memory, planning, reasoning, tool use, and multi-agent collaboration, that convert a passive model into a goal-directed system [3][4]. It analyzed influential agent frameworks, including ReAct, AutoGen, CAMEL, MetaGPT, Toolformer, Reflexion, Voyager, and Generative Agents, organizing their capabilities into a taxonomy and showing that each supplies a mechanism a clinical system needs while none supplies the whole [5][6][7][18][23][19][24][8]. Turning to the clinical domain, it reviewed artificial intelligence and Large Language Models in healthcare, clinical decision support, Retrieval-Augmented Generation, and trustworthy-AI mechanisms, examining systems such as Med-PaLM, Med-PaLM 2, Med-PaLM M, Clinical Camel, MedAgents, MedRAG, Agent Hospital, and EHRAgent [2][26][25][13][10][11][12][33].</w:t>
       </w:r>
     </w:p>
     <w:p>
@@ -4874,7 +4889,7 @@
           <w:i w:val="0"/>
           <w:sz w:val="24"/>
         </w:rPr>
-        <w:t>T. Tu et al., "Towards conversational diagnostic AI," Nature, 2025. [venue to verify]</w:t>
+        <w:t>T. Tu et al., "Towards conversational diagnostic AI," Nature, 2025.</w:t>
       </w:r>
     </w:p>
     <w:p>
@@ -4974,7 +4989,7 @@
           <w:i w:val="0"/>
           <w:sz w:val="24"/>
         </w:rPr>
-        <w:t>Author(s), "Toward trustworthy AI in healthcare," 2023. [full citation to verify against stored P018 PDF]</w:t>
+        <w:t>D. Jin, E. Pan, N. Oufattole, W.-H. Weng, H. Fang, and P. Szolovits, "What disease does this patient have? A large-scale open domain question answering dataset from medical exams," Appl. Sci., vol. 11, no. 14, p. 6421, 2021.</w:t>
       </w:r>
     </w:p>
     <w:p>
@@ -4999,7 +5014,7 @@
           <w:i w:val="0"/>
           <w:sz w:val="24"/>
         </w:rPr>
-        <w:t>D. Jin, E. Pan, N. Oufattole, W.-H. Weng, H. Fang, and P. Szolovits, "What disease does this patient have? A large-scale open domain question answering dataset from medical exams," Appl. Sci., vol. 11, no. 14, p. 6421, 2021.</w:t>
+        <w:t>S. Schmidgall, R. Ziaei, C. Harris, E. Reis, J. Jopling, and M. Moor, "AgentClinic: A multimodal agent benchmark to evaluate AI in simulated clinical environments," arXiv:2405.07960, 2024.</w:t>
       </w:r>
     </w:p>
     <w:p>
@@ -5016,31 +5031,6 @@
           <w:sz w:val="24"/>
         </w:rPr>
         <w:t xml:space="preserve">[33]  </w:t>
-      </w:r>
-      <w:r>
-        <w:rPr>
-          <w:rFonts w:ascii="Times New Roman" w:hAnsi="Times New Roman" w:cs="Times New Roman"/>
-          <w:b w:val="0"/>
-          <w:i w:val="0"/>
-          <w:sz w:val="24"/>
-        </w:rPr>
-        <w:t>S. Schmidgall, R. Ziaei, C. Harris, E. Reis, J. Jopling, and M. Moor, "AgentClinic: A multimodal agent benchmark to evaluate AI in simulated clinical environments," arXiv:2405.07960, 2024.</w:t>
-      </w:r>
-    </w:p>
-    <w:p>
-      <w:pPr>
-        <w:spacing w:lineRule="auto" w:line="360" w:after="120"/>
-        <w:ind w:left="720" w:hanging="720"/>
-        <w:jc w:val="both"/>
-      </w:pPr>
-      <w:r>
-        <w:rPr>
-          <w:rFonts w:ascii="Times New Roman" w:hAnsi="Times New Roman" w:cs="Times New Roman"/>
-          <w:b w:val="0"/>
-          <w:i w:val="0"/>
-          <w:sz w:val="24"/>
-        </w:rPr>
-        <w:t xml:space="preserve">[34]  </w:t>
       </w:r>
       <w:r>
         <w:rPr>

</xml_diff>

<commit_message>
Verify all citations, close defects D1-D6, complete Chapter 2, secure MIMIC-IV access, implement LLM provider seam
</commit_message>
<xml_diff>
--- a/07_Thesis/Thesis_Ch1_Ch2.docx
+++ b/07_Thesis/Thesis_Ch1_Ch2.docx
@@ -270,7 +270,7 @@
     <w:p>
       <w:pPr>
         <w:sectPr>
-          <w:footerReference w:type="default" r:id="rId10"/>
+          <w:footerReference w:type="default" r:id="rId11"/>
           <w:pgSz w:w="11909" w:h="16834"/>
           <w:pgMar w:top="1440" w:right="1440" w:bottom="1440" w:left="1800" w:header="720" w:footer="720" w:gutter="0"/>
           <w:cols w:space="720"/>
@@ -1482,7 +1482,7 @@
     <w:p>
       <w:pPr>
         <w:sectPr>
-          <w:footerReference w:type="default" r:id="rId11"/>
+          <w:footerReference w:type="default" r:id="rId12"/>
           <w:pgSz w:w="11909" w:h="16834"/>
           <w:pgMar w:top="1440" w:right="1440" w:bottom="1440" w:left="1800" w:header="720" w:footer="720" w:gutter="0"/>
           <w:cols w:space="720"/>
@@ -1519,7 +1519,7 @@
           <w:i w:val="0"/>
           <w:sz w:val="24"/>
         </w:rPr>
-        <w:t>Clinical teams in intensive care generate vast, heterogeneous data, including vital signs, laboratory results, medications, and free-text notes, yet turning this stream into timely, trustworthy decisions remains difficult. Large language models (LLMs) answer medical questions well but behave as passive responders: they lack persistent patient memory, autonomous planning, and verifiable grounding, and they are typically evaluated on static examination-style questions rather than on the longitudinal record of a real patient. This thesis designs an Agentic AI framework for intelligent patient monitoring and clinical decision support that addresses these limitations. The framework organizes specialized LLM agents for monitoring, diagnosis, risk prediction, treatment recommendation, explanation, and a verification gate under a coordinator that routes tasks by patient condition and resolves conflicting recommendations. It couples the ReAct reasoning paradigm with retrieval-augmented generation (RAG) that grounds every recommendation in both the patient’s own electronic health record timeline and external clinical guidelines, and it preserves longitudinal context through a layered memory model. A cross-cutting trustworthy-AI layer provides explainability, audit logging, bias monitoring, confidence calibration, and human-in-the-loop validation so that clinicians retain final authority. The publicly available MIMIC-IV critical-care database is used as the data source, and the study specifies a bounded prototype together with an evaluation protocol that compares the framework against single-LLM, guideline-only RAG, and multi-agent baselines using measures of diagnostic accuracy, factual grounding, risk-prediction discrimination, safety, explanation faithfulness, calibration, and runtime cost. The expected contribution is a coherent, verifiable architecture for longitudinal clinical decision support, an explicit account of how patient-timeline retrieval and a dedicated verification agent affect hallucination and safety, and a reproducible design that future work can implement and validate. The thesis is positioned as a design and methodology contribution that lays the foundation for empirical clinical evaluation.</w:t>
+        <w:t>Clinical teams in intensive care generate vast, heterogeneous data, including vital signs, laboratory results, medications, and free-text notes, yet turning this stream into timely, trustworthy decisions remains difficult. Large language models (LLMs) answer medical questions well but behave as passive responders: they lack persistent patient memory, autonomous planning, and verifiable grounding, and they are typically evaluated on static examination-style questions rather than on the longitudinal record of a real patient. This thesis designs an Agentic AI framework for intelligent patient monitoring and clinical decision support that addresses these limitations. The framework organizes eight specialized LLM agents, for monitoring, planning, data retrieval, diagnosis, risk prediction, treatment recommendation, explanation, and verification, under a coordinator that routes tasks by patient condition and resolves conflicting recommendations. It couples the ReAct reasoning paradigm with retrieval-augmented generation (RAG) that grounds every recommendation in both the patient’s own electronic health record timeline and external clinical guidelines, and it preserves longitudinal context through a layered memory model. A cross-cutting trustworthy-AI layer provides explainability, audit logging, bias monitoring, confidence calibration, and human-in-the-loop validation so that clinicians retain final authority. The publicly available MIMIC-IV critical-care database is used as the data source, and the study specifies a bounded prototype together with an evaluation protocol that compares the framework against single-LLM, guideline-only RAG, and multi-agent baselines using measures of diagnostic accuracy, factual grounding, risk-prediction discrimination, safety, explanation faithfulness, calibration, and runtime cost. A pilot feasibility study on the openly licensed 100-patient MIMIC-IV demo implemented and exercised the non-LLM slice of this design: timeline construction across 140 ICU stays, timestamp-aware retrieval at interactive latency that returned no future information, and a rule-based verification gate that blocked 86% of false alerts while retaining 43% of true alerts at its strictest useful setting, with every logged evidence reference re-resolving exactly to its source record. The expected contribution is a coherent, verifiable architecture for longitudinal clinical decision support, an explicit account of how patient-timeline retrieval and a dedicated verification agent affect hallucination and safety, and a reproducible design that future work can implement and validate. The thesis is positioned as a design and methodology contribution that lays the foundation for empirical clinical evaluation.</w:t>
       </w:r>
     </w:p>
     <w:p>
@@ -3192,6 +3192,21 @@
     </w:p>
     <w:p>
       <w:pPr>
+        <w:spacing w:lineRule="auto" w:line="360" w:before="0" w:after="0"/>
+        <w:jc w:val="center"/>
+      </w:pPr>
+      <w:r>
+        <w:rPr>
+          <w:rFonts w:ascii="Times New Roman" w:hAnsi="Times New Roman" w:cs="Times New Roman"/>
+          <w:b w:val="0"/>
+          <w:i w:val="0"/>
+          <w:sz w:val="24"/>
+        </w:rPr>
+        <w:t>Table 2.1</w:t>
+      </w:r>
+    </w:p>
+    <w:p>
+      <w:pPr>
         <w:spacing w:lineRule="auto" w:line="360" w:before="0" w:after="120"/>
         <w:jc w:val="center"/>
       </w:pPr>
@@ -3202,8 +3217,2195 @@
           <w:i/>
           <w:sz w:val="24"/>
         </w:rPr>
-        <w:t>[Table 2.1: Comparative analysis of reviewed frameworks (insert table here)]</w:t>
-      </w:r>
+        <w:t>Comparative analysis of reviewed frameworks</w:t>
+      </w:r>
+    </w:p>
+    <w:p>
+      <w:pPr>
+        <w:spacing w:lineRule="auto" w:line="360" w:before="0" w:after="60"/>
+        <w:jc w:val="center"/>
+      </w:pPr>
+      <w:r>
+        <w:rPr>
+          <w:rFonts w:ascii="Times New Roman" w:hAnsi="Times New Roman" w:cs="Times New Roman"/>
+          <w:b/>
+          <w:i w:val="0"/>
+          <w:sz w:val="22"/>
+        </w:rPr>
+        <w:t>(a) General capabilities</w:t>
+      </w:r>
+    </w:p>
+    <w:tbl>
+      <w:tblPr>
+        <w:tblStyle w:val="TableGrid"/>
+        <w:tblW w:type="auto" w:w="0"/>
+        <w:jc w:val="center"/>
+        <w:tblLook w:firstColumn="1" w:firstRow="1" w:lastColumn="0" w:lastRow="0" w:noHBand="0" w:noVBand="1" w:val="04A0"/>
+      </w:tblPr>
+      <w:tblGrid>
+        <w:gridCol w:w="1234"/>
+        <w:gridCol w:w="1234"/>
+        <w:gridCol w:w="1234"/>
+        <w:gridCol w:w="1234"/>
+        <w:gridCol w:w="1234"/>
+        <w:gridCol w:w="1234"/>
+        <w:gridCol w:w="1234"/>
+      </w:tblGrid>
+      <w:tr>
+        <w:tc>
+          <w:tcPr>
+            <w:tcW w:type="dxa" w:w="1234"/>
+          </w:tcPr>
+          <w:p>
+            <w:pPr>
+              <w:jc w:val="center"/>
+            </w:pPr>
+            <w:r/>
+            <w:r>
+              <w:rPr>
+                <w:rFonts w:ascii="Times New Roman" w:hAnsi="Times New Roman" w:cs="Times New Roman"/>
+                <w:b/>
+                <w:i w:val="0"/>
+                <w:sz w:val="20"/>
+              </w:rPr>
+              <w:t>Paper</w:t>
+            </w:r>
+          </w:p>
+        </w:tc>
+        <w:tc>
+          <w:tcPr>
+            <w:tcW w:type="dxa" w:w="1234"/>
+          </w:tcPr>
+          <w:p>
+            <w:pPr>
+              <w:jc w:val="center"/>
+            </w:pPr>
+            <w:r/>
+            <w:r>
+              <w:rPr>
+                <w:rFonts w:ascii="Times New Roman" w:hAnsi="Times New Roman" w:cs="Times New Roman"/>
+                <w:b/>
+                <w:i w:val="0"/>
+                <w:sz w:val="20"/>
+              </w:rPr>
+              <w:t>Memory</w:t>
+            </w:r>
+          </w:p>
+        </w:tc>
+        <w:tc>
+          <w:tcPr>
+            <w:tcW w:type="dxa" w:w="1234"/>
+          </w:tcPr>
+          <w:p>
+            <w:pPr>
+              <w:jc w:val="center"/>
+            </w:pPr>
+            <w:r/>
+            <w:r>
+              <w:rPr>
+                <w:rFonts w:ascii="Times New Roman" w:hAnsi="Times New Roman" w:cs="Times New Roman"/>
+                <w:b/>
+                <w:i w:val="0"/>
+                <w:sz w:val="20"/>
+              </w:rPr>
+              <w:t>Planning</w:t>
+            </w:r>
+          </w:p>
+        </w:tc>
+        <w:tc>
+          <w:tcPr>
+            <w:tcW w:type="dxa" w:w="1234"/>
+          </w:tcPr>
+          <w:p>
+            <w:pPr>
+              <w:jc w:val="center"/>
+            </w:pPr>
+            <w:r/>
+            <w:r>
+              <w:rPr>
+                <w:rFonts w:ascii="Times New Roman" w:hAnsi="Times New Roman" w:cs="Times New Roman"/>
+                <w:b/>
+                <w:i w:val="0"/>
+                <w:sz w:val="20"/>
+              </w:rPr>
+              <w:t>Reasoning</w:t>
+            </w:r>
+          </w:p>
+        </w:tc>
+        <w:tc>
+          <w:tcPr>
+            <w:tcW w:type="dxa" w:w="1234"/>
+          </w:tcPr>
+          <w:p>
+            <w:pPr>
+              <w:jc w:val="center"/>
+            </w:pPr>
+            <w:r/>
+            <w:r>
+              <w:rPr>
+                <w:rFonts w:ascii="Times New Roman" w:hAnsi="Times New Roman" w:cs="Times New Roman"/>
+                <w:b/>
+                <w:i w:val="0"/>
+                <w:sz w:val="20"/>
+              </w:rPr>
+              <w:t>Multi-Agent</w:t>
+            </w:r>
+          </w:p>
+        </w:tc>
+        <w:tc>
+          <w:tcPr>
+            <w:tcW w:type="dxa" w:w="1234"/>
+          </w:tcPr>
+          <w:p>
+            <w:pPr>
+              <w:jc w:val="center"/>
+            </w:pPr>
+            <w:r/>
+            <w:r>
+              <w:rPr>
+                <w:rFonts w:ascii="Times New Roman" w:hAnsi="Times New Roman" w:cs="Times New Roman"/>
+                <w:b/>
+                <w:i w:val="0"/>
+                <w:sz w:val="20"/>
+              </w:rPr>
+              <w:t>Healthcare</w:t>
+            </w:r>
+          </w:p>
+        </w:tc>
+        <w:tc>
+          <w:tcPr>
+            <w:tcW w:type="dxa" w:w="1234"/>
+          </w:tcPr>
+          <w:p>
+            <w:pPr>
+              <w:jc w:val="center"/>
+            </w:pPr>
+            <w:r/>
+            <w:r>
+              <w:rPr>
+                <w:rFonts w:ascii="Times New Roman" w:hAnsi="Times New Roman" w:cs="Times New Roman"/>
+                <w:b/>
+                <w:i w:val="0"/>
+                <w:sz w:val="20"/>
+              </w:rPr>
+              <w:t>Trustworthy</w:t>
+            </w:r>
+          </w:p>
+        </w:tc>
+      </w:tr>
+      <w:tr>
+        <w:tc>
+          <w:tcPr>
+            <w:tcW w:type="dxa" w:w="1234"/>
+          </w:tcPr>
+          <w:p>
+            <w:pPr>
+              <w:jc w:val="left"/>
+            </w:pPr>
+            <w:r/>
+            <w:r>
+              <w:rPr>
+                <w:rFonts w:ascii="Times New Roman" w:hAnsi="Times New Roman" w:cs="Times New Roman"/>
+                <w:b w:val="0"/>
+                <w:i w:val="0"/>
+                <w:sz w:val="20"/>
+              </w:rPr>
+              <w:t>ReAct [5]</w:t>
+            </w:r>
+          </w:p>
+        </w:tc>
+        <w:tc>
+          <w:tcPr>
+            <w:tcW w:type="dxa" w:w="1234"/>
+          </w:tcPr>
+          <w:p>
+            <w:pPr>
+              <w:jc w:val="center"/>
+            </w:pPr>
+            <w:r/>
+            <w:r>
+              <w:rPr>
+                <w:rFonts w:ascii="Times New Roman" w:hAnsi="Times New Roman" w:cs="Times New Roman"/>
+                <w:b w:val="0"/>
+                <w:i w:val="0"/>
+                <w:sz w:val="20"/>
+              </w:rPr>
+              <w:t>✗</w:t>
+            </w:r>
+          </w:p>
+        </w:tc>
+        <w:tc>
+          <w:tcPr>
+            <w:tcW w:type="dxa" w:w="1234"/>
+          </w:tcPr>
+          <w:p>
+            <w:pPr>
+              <w:jc w:val="center"/>
+            </w:pPr>
+            <w:r/>
+            <w:r>
+              <w:rPr>
+                <w:rFonts w:ascii="Times New Roman" w:hAnsi="Times New Roman" w:cs="Times New Roman"/>
+                <w:b w:val="0"/>
+                <w:i w:val="0"/>
+                <w:sz w:val="20"/>
+              </w:rPr>
+              <w:t>✓</w:t>
+            </w:r>
+          </w:p>
+        </w:tc>
+        <w:tc>
+          <w:tcPr>
+            <w:tcW w:type="dxa" w:w="1234"/>
+          </w:tcPr>
+          <w:p>
+            <w:pPr>
+              <w:jc w:val="center"/>
+            </w:pPr>
+            <w:r/>
+            <w:r>
+              <w:rPr>
+                <w:rFonts w:ascii="Times New Roman" w:hAnsi="Times New Roman" w:cs="Times New Roman"/>
+                <w:b w:val="0"/>
+                <w:i w:val="0"/>
+                <w:sz w:val="20"/>
+              </w:rPr>
+              <w:t>✓</w:t>
+            </w:r>
+          </w:p>
+        </w:tc>
+        <w:tc>
+          <w:tcPr>
+            <w:tcW w:type="dxa" w:w="1234"/>
+          </w:tcPr>
+          <w:p>
+            <w:pPr>
+              <w:jc w:val="center"/>
+            </w:pPr>
+            <w:r/>
+            <w:r>
+              <w:rPr>
+                <w:rFonts w:ascii="Times New Roman" w:hAnsi="Times New Roman" w:cs="Times New Roman"/>
+                <w:b w:val="0"/>
+                <w:i w:val="0"/>
+                <w:sz w:val="20"/>
+              </w:rPr>
+              <w:t>✗</w:t>
+            </w:r>
+          </w:p>
+        </w:tc>
+        <w:tc>
+          <w:tcPr>
+            <w:tcW w:type="dxa" w:w="1234"/>
+          </w:tcPr>
+          <w:p>
+            <w:pPr>
+              <w:jc w:val="center"/>
+            </w:pPr>
+            <w:r/>
+            <w:r>
+              <w:rPr>
+                <w:rFonts w:ascii="Times New Roman" w:hAnsi="Times New Roman" w:cs="Times New Roman"/>
+                <w:b w:val="0"/>
+                <w:i w:val="0"/>
+                <w:sz w:val="20"/>
+              </w:rPr>
+              <w:t>✗</w:t>
+            </w:r>
+          </w:p>
+        </w:tc>
+        <w:tc>
+          <w:tcPr>
+            <w:tcW w:type="dxa" w:w="1234"/>
+          </w:tcPr>
+          <w:p>
+            <w:pPr>
+              <w:jc w:val="center"/>
+            </w:pPr>
+            <w:r/>
+            <w:r>
+              <w:rPr>
+                <w:rFonts w:ascii="Times New Roman" w:hAnsi="Times New Roman" w:cs="Times New Roman"/>
+                <w:b w:val="0"/>
+                <w:i w:val="0"/>
+                <w:sz w:val="20"/>
+              </w:rPr>
+              <w:t>✓</w:t>
+            </w:r>
+          </w:p>
+        </w:tc>
+      </w:tr>
+      <w:tr>
+        <w:tc>
+          <w:tcPr>
+            <w:tcW w:type="dxa" w:w="1234"/>
+          </w:tcPr>
+          <w:p>
+            <w:pPr>
+              <w:jc w:val="left"/>
+            </w:pPr>
+            <w:r/>
+            <w:r>
+              <w:rPr>
+                <w:rFonts w:ascii="Times New Roman" w:hAnsi="Times New Roman" w:cs="Times New Roman"/>
+                <w:b w:val="0"/>
+                <w:i w:val="0"/>
+                <w:sz w:val="20"/>
+              </w:rPr>
+              <w:t>AutoGen [6]</w:t>
+            </w:r>
+          </w:p>
+        </w:tc>
+        <w:tc>
+          <w:tcPr>
+            <w:tcW w:type="dxa" w:w="1234"/>
+          </w:tcPr>
+          <w:p>
+            <w:pPr>
+              <w:jc w:val="center"/>
+            </w:pPr>
+            <w:r/>
+            <w:r>
+              <w:rPr>
+                <w:rFonts w:ascii="Times New Roman" w:hAnsi="Times New Roman" w:cs="Times New Roman"/>
+                <w:b w:val="0"/>
+                <w:i w:val="0"/>
+                <w:sz w:val="20"/>
+              </w:rPr>
+              <w:t>✗</w:t>
+            </w:r>
+          </w:p>
+        </w:tc>
+        <w:tc>
+          <w:tcPr>
+            <w:tcW w:type="dxa" w:w="1234"/>
+          </w:tcPr>
+          <w:p>
+            <w:pPr>
+              <w:jc w:val="center"/>
+            </w:pPr>
+            <w:r/>
+            <w:r>
+              <w:rPr>
+                <w:rFonts w:ascii="Times New Roman" w:hAnsi="Times New Roman" w:cs="Times New Roman"/>
+                <w:b w:val="0"/>
+                <w:i w:val="0"/>
+                <w:sz w:val="20"/>
+              </w:rPr>
+              <w:t>✓</w:t>
+            </w:r>
+          </w:p>
+        </w:tc>
+        <w:tc>
+          <w:tcPr>
+            <w:tcW w:type="dxa" w:w="1234"/>
+          </w:tcPr>
+          <w:p>
+            <w:pPr>
+              <w:jc w:val="center"/>
+            </w:pPr>
+            <w:r/>
+            <w:r>
+              <w:rPr>
+                <w:rFonts w:ascii="Times New Roman" w:hAnsi="Times New Roman" w:cs="Times New Roman"/>
+                <w:b w:val="0"/>
+                <w:i w:val="0"/>
+                <w:sz w:val="20"/>
+              </w:rPr>
+              <w:t>✓</w:t>
+            </w:r>
+          </w:p>
+        </w:tc>
+        <w:tc>
+          <w:tcPr>
+            <w:tcW w:type="dxa" w:w="1234"/>
+          </w:tcPr>
+          <w:p>
+            <w:pPr>
+              <w:jc w:val="center"/>
+            </w:pPr>
+            <w:r/>
+            <w:r>
+              <w:rPr>
+                <w:rFonts w:ascii="Times New Roman" w:hAnsi="Times New Roman" w:cs="Times New Roman"/>
+                <w:b w:val="0"/>
+                <w:i w:val="0"/>
+                <w:sz w:val="20"/>
+              </w:rPr>
+              <w:t>✓</w:t>
+            </w:r>
+          </w:p>
+        </w:tc>
+        <w:tc>
+          <w:tcPr>
+            <w:tcW w:type="dxa" w:w="1234"/>
+          </w:tcPr>
+          <w:p>
+            <w:pPr>
+              <w:jc w:val="center"/>
+            </w:pPr>
+            <w:r/>
+            <w:r>
+              <w:rPr>
+                <w:rFonts w:ascii="Times New Roman" w:hAnsi="Times New Roman" w:cs="Times New Roman"/>
+                <w:b w:val="0"/>
+                <w:i w:val="0"/>
+                <w:sz w:val="20"/>
+              </w:rPr>
+              <w:t>✗</w:t>
+            </w:r>
+          </w:p>
+        </w:tc>
+        <w:tc>
+          <w:tcPr>
+            <w:tcW w:type="dxa" w:w="1234"/>
+          </w:tcPr>
+          <w:p>
+            <w:pPr>
+              <w:jc w:val="center"/>
+            </w:pPr>
+            <w:r/>
+            <w:r>
+              <w:rPr>
+                <w:rFonts w:ascii="Times New Roman" w:hAnsi="Times New Roman" w:cs="Times New Roman"/>
+                <w:b w:val="0"/>
+                <w:i w:val="0"/>
+                <w:sz w:val="20"/>
+              </w:rPr>
+              <w:t>✓</w:t>
+            </w:r>
+          </w:p>
+        </w:tc>
+      </w:tr>
+      <w:tr>
+        <w:tc>
+          <w:tcPr>
+            <w:tcW w:type="dxa" w:w="1234"/>
+          </w:tcPr>
+          <w:p>
+            <w:pPr>
+              <w:jc w:val="left"/>
+            </w:pPr>
+            <w:r/>
+            <w:r>
+              <w:rPr>
+                <w:rFonts w:ascii="Times New Roman" w:hAnsi="Times New Roman" w:cs="Times New Roman"/>
+                <w:b w:val="0"/>
+                <w:i w:val="0"/>
+                <w:sz w:val="20"/>
+              </w:rPr>
+              <w:t>MetaGPT [18]</w:t>
+            </w:r>
+          </w:p>
+        </w:tc>
+        <w:tc>
+          <w:tcPr>
+            <w:tcW w:type="dxa" w:w="1234"/>
+          </w:tcPr>
+          <w:p>
+            <w:pPr>
+              <w:jc w:val="center"/>
+            </w:pPr>
+            <w:r/>
+            <w:r>
+              <w:rPr>
+                <w:rFonts w:ascii="Times New Roman" w:hAnsi="Times New Roman" w:cs="Times New Roman"/>
+                <w:b w:val="0"/>
+                <w:i w:val="0"/>
+                <w:sz w:val="20"/>
+              </w:rPr>
+              <w:t>✓</w:t>
+            </w:r>
+          </w:p>
+        </w:tc>
+        <w:tc>
+          <w:tcPr>
+            <w:tcW w:type="dxa" w:w="1234"/>
+          </w:tcPr>
+          <w:p>
+            <w:pPr>
+              <w:jc w:val="center"/>
+            </w:pPr>
+            <w:r/>
+            <w:r>
+              <w:rPr>
+                <w:rFonts w:ascii="Times New Roman" w:hAnsi="Times New Roman" w:cs="Times New Roman"/>
+                <w:b w:val="0"/>
+                <w:i w:val="0"/>
+                <w:sz w:val="20"/>
+              </w:rPr>
+              <w:t>✓</w:t>
+            </w:r>
+          </w:p>
+        </w:tc>
+        <w:tc>
+          <w:tcPr>
+            <w:tcW w:type="dxa" w:w="1234"/>
+          </w:tcPr>
+          <w:p>
+            <w:pPr>
+              <w:jc w:val="center"/>
+            </w:pPr>
+            <w:r/>
+            <w:r>
+              <w:rPr>
+                <w:rFonts w:ascii="Times New Roman" w:hAnsi="Times New Roman" w:cs="Times New Roman"/>
+                <w:b w:val="0"/>
+                <w:i w:val="0"/>
+                <w:sz w:val="20"/>
+              </w:rPr>
+              <w:t>✓</w:t>
+            </w:r>
+          </w:p>
+        </w:tc>
+        <w:tc>
+          <w:tcPr>
+            <w:tcW w:type="dxa" w:w="1234"/>
+          </w:tcPr>
+          <w:p>
+            <w:pPr>
+              <w:jc w:val="center"/>
+            </w:pPr>
+            <w:r/>
+            <w:r>
+              <w:rPr>
+                <w:rFonts w:ascii="Times New Roman" w:hAnsi="Times New Roman" w:cs="Times New Roman"/>
+                <w:b w:val="0"/>
+                <w:i w:val="0"/>
+                <w:sz w:val="20"/>
+              </w:rPr>
+              <w:t>✓</w:t>
+            </w:r>
+          </w:p>
+        </w:tc>
+        <w:tc>
+          <w:tcPr>
+            <w:tcW w:type="dxa" w:w="1234"/>
+          </w:tcPr>
+          <w:p>
+            <w:pPr>
+              <w:jc w:val="center"/>
+            </w:pPr>
+            <w:r/>
+            <w:r>
+              <w:rPr>
+                <w:rFonts w:ascii="Times New Roman" w:hAnsi="Times New Roman" w:cs="Times New Roman"/>
+                <w:b w:val="0"/>
+                <w:i w:val="0"/>
+                <w:sz w:val="20"/>
+              </w:rPr>
+              <w:t>✗</w:t>
+            </w:r>
+          </w:p>
+        </w:tc>
+        <w:tc>
+          <w:tcPr>
+            <w:tcW w:type="dxa" w:w="1234"/>
+          </w:tcPr>
+          <w:p>
+            <w:pPr>
+              <w:jc w:val="center"/>
+            </w:pPr>
+            <w:r/>
+            <w:r>
+              <w:rPr>
+                <w:rFonts w:ascii="Times New Roman" w:hAnsi="Times New Roman" w:cs="Times New Roman"/>
+                <w:b w:val="0"/>
+                <w:i w:val="0"/>
+                <w:sz w:val="20"/>
+              </w:rPr>
+              <w:t>✓</w:t>
+            </w:r>
+          </w:p>
+        </w:tc>
+      </w:tr>
+      <w:tr>
+        <w:tc>
+          <w:tcPr>
+            <w:tcW w:type="dxa" w:w="1234"/>
+          </w:tcPr>
+          <w:p>
+            <w:pPr>
+              <w:jc w:val="left"/>
+            </w:pPr>
+            <w:r/>
+            <w:r>
+              <w:rPr>
+                <w:rFonts w:ascii="Times New Roman" w:hAnsi="Times New Roman" w:cs="Times New Roman"/>
+                <w:b w:val="0"/>
+                <w:i w:val="0"/>
+                <w:sz w:val="20"/>
+              </w:rPr>
+              <w:t>MedAgents [10]</w:t>
+            </w:r>
+          </w:p>
+        </w:tc>
+        <w:tc>
+          <w:tcPr>
+            <w:tcW w:type="dxa" w:w="1234"/>
+          </w:tcPr>
+          <w:p>
+            <w:pPr>
+              <w:jc w:val="center"/>
+            </w:pPr>
+            <w:r/>
+            <w:r>
+              <w:rPr>
+                <w:rFonts w:ascii="Times New Roman" w:hAnsi="Times New Roman" w:cs="Times New Roman"/>
+                <w:b w:val="0"/>
+                <w:i w:val="0"/>
+                <w:sz w:val="20"/>
+              </w:rPr>
+              <w:t>✗</w:t>
+            </w:r>
+          </w:p>
+        </w:tc>
+        <w:tc>
+          <w:tcPr>
+            <w:tcW w:type="dxa" w:w="1234"/>
+          </w:tcPr>
+          <w:p>
+            <w:pPr>
+              <w:jc w:val="center"/>
+            </w:pPr>
+            <w:r/>
+            <w:r>
+              <w:rPr>
+                <w:rFonts w:ascii="Times New Roman" w:hAnsi="Times New Roman" w:cs="Times New Roman"/>
+                <w:b w:val="0"/>
+                <w:i w:val="0"/>
+                <w:sz w:val="20"/>
+              </w:rPr>
+              <w:t>✓</w:t>
+            </w:r>
+          </w:p>
+        </w:tc>
+        <w:tc>
+          <w:tcPr>
+            <w:tcW w:type="dxa" w:w="1234"/>
+          </w:tcPr>
+          <w:p>
+            <w:pPr>
+              <w:jc w:val="center"/>
+            </w:pPr>
+            <w:r/>
+            <w:r>
+              <w:rPr>
+                <w:rFonts w:ascii="Times New Roman" w:hAnsi="Times New Roman" w:cs="Times New Roman"/>
+                <w:b w:val="0"/>
+                <w:i w:val="0"/>
+                <w:sz w:val="20"/>
+              </w:rPr>
+              <w:t>✓</w:t>
+            </w:r>
+          </w:p>
+        </w:tc>
+        <w:tc>
+          <w:tcPr>
+            <w:tcW w:type="dxa" w:w="1234"/>
+          </w:tcPr>
+          <w:p>
+            <w:pPr>
+              <w:jc w:val="center"/>
+            </w:pPr>
+            <w:r/>
+            <w:r>
+              <w:rPr>
+                <w:rFonts w:ascii="Times New Roman" w:hAnsi="Times New Roman" w:cs="Times New Roman"/>
+                <w:b w:val="0"/>
+                <w:i w:val="0"/>
+                <w:sz w:val="20"/>
+              </w:rPr>
+              <w:t>✓</w:t>
+            </w:r>
+          </w:p>
+        </w:tc>
+        <w:tc>
+          <w:tcPr>
+            <w:tcW w:type="dxa" w:w="1234"/>
+          </w:tcPr>
+          <w:p>
+            <w:pPr>
+              <w:jc w:val="center"/>
+            </w:pPr>
+            <w:r/>
+            <w:r>
+              <w:rPr>
+                <w:rFonts w:ascii="Times New Roman" w:hAnsi="Times New Roman" w:cs="Times New Roman"/>
+                <w:b w:val="0"/>
+                <w:i w:val="0"/>
+                <w:sz w:val="20"/>
+              </w:rPr>
+              <w:t>✓</w:t>
+            </w:r>
+          </w:p>
+        </w:tc>
+        <w:tc>
+          <w:tcPr>
+            <w:tcW w:type="dxa" w:w="1234"/>
+          </w:tcPr>
+          <w:p>
+            <w:pPr>
+              <w:jc w:val="center"/>
+            </w:pPr>
+            <w:r/>
+            <w:r>
+              <w:rPr>
+                <w:rFonts w:ascii="Times New Roman" w:hAnsi="Times New Roman" w:cs="Times New Roman"/>
+                <w:b w:val="0"/>
+                <w:i w:val="0"/>
+                <w:sz w:val="20"/>
+              </w:rPr>
+              <w:t>✓</w:t>
+            </w:r>
+          </w:p>
+        </w:tc>
+      </w:tr>
+      <w:tr>
+        <w:tc>
+          <w:tcPr>
+            <w:tcW w:type="dxa" w:w="1234"/>
+          </w:tcPr>
+          <w:p>
+            <w:pPr>
+              <w:jc w:val="left"/>
+            </w:pPr>
+            <w:r/>
+            <w:r>
+              <w:rPr>
+                <w:rFonts w:ascii="Times New Roman" w:hAnsi="Times New Roman" w:cs="Times New Roman"/>
+                <w:b w:val="0"/>
+                <w:i w:val="0"/>
+                <w:sz w:val="20"/>
+              </w:rPr>
+              <w:t>Agent Hospital [12]</w:t>
+            </w:r>
+          </w:p>
+        </w:tc>
+        <w:tc>
+          <w:tcPr>
+            <w:tcW w:type="dxa" w:w="1234"/>
+          </w:tcPr>
+          <w:p>
+            <w:pPr>
+              <w:jc w:val="center"/>
+            </w:pPr>
+            <w:r/>
+            <w:r>
+              <w:rPr>
+                <w:rFonts w:ascii="Times New Roman" w:hAnsi="Times New Roman" w:cs="Times New Roman"/>
+                <w:b w:val="0"/>
+                <w:i w:val="0"/>
+                <w:sz w:val="20"/>
+              </w:rPr>
+              <w:t>✓</w:t>
+            </w:r>
+          </w:p>
+        </w:tc>
+        <w:tc>
+          <w:tcPr>
+            <w:tcW w:type="dxa" w:w="1234"/>
+          </w:tcPr>
+          <w:p>
+            <w:pPr>
+              <w:jc w:val="center"/>
+            </w:pPr>
+            <w:r/>
+            <w:r>
+              <w:rPr>
+                <w:rFonts w:ascii="Times New Roman" w:hAnsi="Times New Roman" w:cs="Times New Roman"/>
+                <w:b w:val="0"/>
+                <w:i w:val="0"/>
+                <w:sz w:val="20"/>
+              </w:rPr>
+              <w:t>✓</w:t>
+            </w:r>
+          </w:p>
+        </w:tc>
+        <w:tc>
+          <w:tcPr>
+            <w:tcW w:type="dxa" w:w="1234"/>
+          </w:tcPr>
+          <w:p>
+            <w:pPr>
+              <w:jc w:val="center"/>
+            </w:pPr>
+            <w:r/>
+            <w:r>
+              <w:rPr>
+                <w:rFonts w:ascii="Times New Roman" w:hAnsi="Times New Roman" w:cs="Times New Roman"/>
+                <w:b w:val="0"/>
+                <w:i w:val="0"/>
+                <w:sz w:val="20"/>
+              </w:rPr>
+              <w:t>✓</w:t>
+            </w:r>
+          </w:p>
+        </w:tc>
+        <w:tc>
+          <w:tcPr>
+            <w:tcW w:type="dxa" w:w="1234"/>
+          </w:tcPr>
+          <w:p>
+            <w:pPr>
+              <w:jc w:val="center"/>
+            </w:pPr>
+            <w:r/>
+            <w:r>
+              <w:rPr>
+                <w:rFonts w:ascii="Times New Roman" w:hAnsi="Times New Roman" w:cs="Times New Roman"/>
+                <w:b w:val="0"/>
+                <w:i w:val="0"/>
+                <w:sz w:val="20"/>
+              </w:rPr>
+              <w:t>✓</w:t>
+            </w:r>
+          </w:p>
+        </w:tc>
+        <w:tc>
+          <w:tcPr>
+            <w:tcW w:type="dxa" w:w="1234"/>
+          </w:tcPr>
+          <w:p>
+            <w:pPr>
+              <w:jc w:val="center"/>
+            </w:pPr>
+            <w:r/>
+            <w:r>
+              <w:rPr>
+                <w:rFonts w:ascii="Times New Roman" w:hAnsi="Times New Roman" w:cs="Times New Roman"/>
+                <w:b w:val="0"/>
+                <w:i w:val="0"/>
+                <w:sz w:val="20"/>
+              </w:rPr>
+              <w:t>✓</w:t>
+            </w:r>
+          </w:p>
+        </w:tc>
+        <w:tc>
+          <w:tcPr>
+            <w:tcW w:type="dxa" w:w="1234"/>
+          </w:tcPr>
+          <w:p>
+            <w:pPr>
+              <w:jc w:val="center"/>
+            </w:pPr>
+            <w:r/>
+            <w:r>
+              <w:rPr>
+                <w:rFonts w:ascii="Times New Roman" w:hAnsi="Times New Roman" w:cs="Times New Roman"/>
+                <w:b w:val="0"/>
+                <w:i w:val="0"/>
+                <w:sz w:val="20"/>
+              </w:rPr>
+              <w:t>✓</w:t>
+            </w:r>
+          </w:p>
+        </w:tc>
+      </w:tr>
+      <w:tr>
+        <w:tc>
+          <w:tcPr>
+            <w:tcW w:type="dxa" w:w="1234"/>
+          </w:tcPr>
+          <w:p>
+            <w:pPr>
+              <w:jc w:val="left"/>
+            </w:pPr>
+            <w:r/>
+            <w:r>
+              <w:rPr>
+                <w:rFonts w:ascii="Times New Roman" w:hAnsi="Times New Roman" w:cs="Times New Roman"/>
+                <w:b w:val="0"/>
+                <w:i w:val="0"/>
+                <w:sz w:val="20"/>
+              </w:rPr>
+              <w:t>MedRAG [11]</w:t>
+            </w:r>
+          </w:p>
+        </w:tc>
+        <w:tc>
+          <w:tcPr>
+            <w:tcW w:type="dxa" w:w="1234"/>
+          </w:tcPr>
+          <w:p>
+            <w:pPr>
+              <w:jc w:val="center"/>
+            </w:pPr>
+            <w:r/>
+            <w:r>
+              <w:rPr>
+                <w:rFonts w:ascii="Times New Roman" w:hAnsi="Times New Roman" w:cs="Times New Roman"/>
+                <w:b w:val="0"/>
+                <w:i w:val="0"/>
+                <w:sz w:val="20"/>
+              </w:rPr>
+              <w:t>✓</w:t>
+            </w:r>
+          </w:p>
+        </w:tc>
+        <w:tc>
+          <w:tcPr>
+            <w:tcW w:type="dxa" w:w="1234"/>
+          </w:tcPr>
+          <w:p>
+            <w:pPr>
+              <w:jc w:val="center"/>
+            </w:pPr>
+            <w:r/>
+            <w:r>
+              <w:rPr>
+                <w:rFonts w:ascii="Times New Roman" w:hAnsi="Times New Roman" w:cs="Times New Roman"/>
+                <w:b w:val="0"/>
+                <w:i w:val="0"/>
+                <w:sz w:val="20"/>
+              </w:rPr>
+              <w:t>✓</w:t>
+            </w:r>
+          </w:p>
+        </w:tc>
+        <w:tc>
+          <w:tcPr>
+            <w:tcW w:type="dxa" w:w="1234"/>
+          </w:tcPr>
+          <w:p>
+            <w:pPr>
+              <w:jc w:val="center"/>
+            </w:pPr>
+            <w:r/>
+            <w:r>
+              <w:rPr>
+                <w:rFonts w:ascii="Times New Roman" w:hAnsi="Times New Roman" w:cs="Times New Roman"/>
+                <w:b w:val="0"/>
+                <w:i w:val="0"/>
+                <w:sz w:val="20"/>
+              </w:rPr>
+              <w:t>✓</w:t>
+            </w:r>
+          </w:p>
+        </w:tc>
+        <w:tc>
+          <w:tcPr>
+            <w:tcW w:type="dxa" w:w="1234"/>
+          </w:tcPr>
+          <w:p>
+            <w:pPr>
+              <w:jc w:val="center"/>
+            </w:pPr>
+            <w:r/>
+            <w:r>
+              <w:rPr>
+                <w:rFonts w:ascii="Times New Roman" w:hAnsi="Times New Roman" w:cs="Times New Roman"/>
+                <w:b w:val="0"/>
+                <w:i w:val="0"/>
+                <w:sz w:val="20"/>
+              </w:rPr>
+              <w:t>✗</w:t>
+            </w:r>
+          </w:p>
+        </w:tc>
+        <w:tc>
+          <w:tcPr>
+            <w:tcW w:type="dxa" w:w="1234"/>
+          </w:tcPr>
+          <w:p>
+            <w:pPr>
+              <w:jc w:val="center"/>
+            </w:pPr>
+            <w:r/>
+            <w:r>
+              <w:rPr>
+                <w:rFonts w:ascii="Times New Roman" w:hAnsi="Times New Roman" w:cs="Times New Roman"/>
+                <w:b w:val="0"/>
+                <w:i w:val="0"/>
+                <w:sz w:val="20"/>
+              </w:rPr>
+              <w:t>✓</w:t>
+            </w:r>
+          </w:p>
+        </w:tc>
+        <w:tc>
+          <w:tcPr>
+            <w:tcW w:type="dxa" w:w="1234"/>
+          </w:tcPr>
+          <w:p>
+            <w:pPr>
+              <w:jc w:val="center"/>
+            </w:pPr>
+            <w:r/>
+            <w:r>
+              <w:rPr>
+                <w:rFonts w:ascii="Times New Roman" w:hAnsi="Times New Roman" w:cs="Times New Roman"/>
+                <w:b w:val="0"/>
+                <w:i w:val="0"/>
+                <w:sz w:val="20"/>
+              </w:rPr>
+              <w:t>✓</w:t>
+            </w:r>
+          </w:p>
+        </w:tc>
+      </w:tr>
+      <w:tr>
+        <w:tc>
+          <w:tcPr>
+            <w:tcW w:type="dxa" w:w="1234"/>
+          </w:tcPr>
+          <w:p>
+            <w:pPr>
+              <w:jc w:val="left"/>
+            </w:pPr>
+            <w:r/>
+            <w:r>
+              <w:rPr>
+                <w:rFonts w:ascii="Times New Roman" w:hAnsi="Times New Roman" w:cs="Times New Roman"/>
+                <w:b/>
+                <w:i w:val="0"/>
+                <w:sz w:val="20"/>
+              </w:rPr>
+              <w:t>Proposed Framework</w:t>
+            </w:r>
+          </w:p>
+        </w:tc>
+        <w:tc>
+          <w:tcPr>
+            <w:tcW w:type="dxa" w:w="1234"/>
+          </w:tcPr>
+          <w:p>
+            <w:pPr>
+              <w:jc w:val="center"/>
+            </w:pPr>
+            <w:r/>
+            <w:r>
+              <w:rPr>
+                <w:rFonts w:ascii="Times New Roman" w:hAnsi="Times New Roman" w:cs="Times New Roman"/>
+                <w:b w:val="0"/>
+                <w:i w:val="0"/>
+                <w:sz w:val="20"/>
+              </w:rPr>
+              <w:t>✓</w:t>
+            </w:r>
+          </w:p>
+        </w:tc>
+        <w:tc>
+          <w:tcPr>
+            <w:tcW w:type="dxa" w:w="1234"/>
+          </w:tcPr>
+          <w:p>
+            <w:pPr>
+              <w:jc w:val="center"/>
+            </w:pPr>
+            <w:r/>
+            <w:r>
+              <w:rPr>
+                <w:rFonts w:ascii="Times New Roman" w:hAnsi="Times New Roman" w:cs="Times New Roman"/>
+                <w:b w:val="0"/>
+                <w:i w:val="0"/>
+                <w:sz w:val="20"/>
+              </w:rPr>
+              <w:t>✓</w:t>
+            </w:r>
+          </w:p>
+        </w:tc>
+        <w:tc>
+          <w:tcPr>
+            <w:tcW w:type="dxa" w:w="1234"/>
+          </w:tcPr>
+          <w:p>
+            <w:pPr>
+              <w:jc w:val="center"/>
+            </w:pPr>
+            <w:r/>
+            <w:r>
+              <w:rPr>
+                <w:rFonts w:ascii="Times New Roman" w:hAnsi="Times New Roman" w:cs="Times New Roman"/>
+                <w:b w:val="0"/>
+                <w:i w:val="0"/>
+                <w:sz w:val="20"/>
+              </w:rPr>
+              <w:t>✓</w:t>
+            </w:r>
+          </w:p>
+        </w:tc>
+        <w:tc>
+          <w:tcPr>
+            <w:tcW w:type="dxa" w:w="1234"/>
+          </w:tcPr>
+          <w:p>
+            <w:pPr>
+              <w:jc w:val="center"/>
+            </w:pPr>
+            <w:r/>
+            <w:r>
+              <w:rPr>
+                <w:rFonts w:ascii="Times New Roman" w:hAnsi="Times New Roman" w:cs="Times New Roman"/>
+                <w:b w:val="0"/>
+                <w:i w:val="0"/>
+                <w:sz w:val="20"/>
+              </w:rPr>
+              <w:t>✓</w:t>
+            </w:r>
+          </w:p>
+        </w:tc>
+        <w:tc>
+          <w:tcPr>
+            <w:tcW w:type="dxa" w:w="1234"/>
+          </w:tcPr>
+          <w:p>
+            <w:pPr>
+              <w:jc w:val="center"/>
+            </w:pPr>
+            <w:r/>
+            <w:r>
+              <w:rPr>
+                <w:rFonts w:ascii="Times New Roman" w:hAnsi="Times New Roman" w:cs="Times New Roman"/>
+                <w:b w:val="0"/>
+                <w:i w:val="0"/>
+                <w:sz w:val="20"/>
+              </w:rPr>
+              <w:t>✓</w:t>
+            </w:r>
+          </w:p>
+        </w:tc>
+        <w:tc>
+          <w:tcPr>
+            <w:tcW w:type="dxa" w:w="1234"/>
+          </w:tcPr>
+          <w:p>
+            <w:pPr>
+              <w:jc w:val="center"/>
+            </w:pPr>
+            <w:r/>
+            <w:r>
+              <w:rPr>
+                <w:rFonts w:ascii="Times New Roman" w:hAnsi="Times New Roman" w:cs="Times New Roman"/>
+                <w:b w:val="0"/>
+                <w:i w:val="0"/>
+                <w:sz w:val="20"/>
+              </w:rPr>
+              <w:t>✓</w:t>
+            </w:r>
+          </w:p>
+        </w:tc>
+      </w:tr>
+    </w:tbl>
+    <w:p>
+      <w:pPr>
+        <w:spacing w:lineRule="auto" w:line="360" w:before="0" w:after="120"/>
+        <w:jc w:val="both"/>
+      </w:pPr>
+    </w:p>
+    <w:p>
+      <w:pPr>
+        <w:spacing w:lineRule="auto" w:line="360" w:before="0" w:after="60"/>
+        <w:jc w:val="center"/>
+      </w:pPr>
+      <w:r>
+        <w:rPr>
+          <w:rFonts w:ascii="Times New Roman" w:hAnsi="Times New Roman" w:cs="Times New Roman"/>
+          <w:b/>
+          <w:i w:val="0"/>
+          <w:sz w:val="22"/>
+        </w:rPr>
+        <w:t>(b) Differentiating capabilities</w:t>
+      </w:r>
+    </w:p>
+    <w:tbl>
+      <w:tblPr>
+        <w:tblStyle w:val="TableGrid"/>
+        <w:tblW w:type="auto" w:w="0"/>
+        <w:jc w:val="center"/>
+        <w:tblLook w:firstColumn="1" w:firstRow="1" w:lastColumn="0" w:lastRow="0" w:noHBand="0" w:noVBand="1" w:val="04A0"/>
+      </w:tblPr>
+      <w:tblGrid>
+        <w:gridCol w:w="1440"/>
+        <w:gridCol w:w="1440"/>
+        <w:gridCol w:w="1440"/>
+        <w:gridCol w:w="1440"/>
+        <w:gridCol w:w="1440"/>
+        <w:gridCol w:w="1440"/>
+      </w:tblGrid>
+      <w:tr>
+        <w:tc>
+          <w:tcPr>
+            <w:tcW w:type="dxa" w:w="1440"/>
+          </w:tcPr>
+          <w:p>
+            <w:pPr>
+              <w:jc w:val="center"/>
+            </w:pPr>
+            <w:r/>
+            <w:r>
+              <w:rPr>
+                <w:rFonts w:ascii="Times New Roman" w:hAnsi="Times New Roman" w:cs="Times New Roman"/>
+                <w:b/>
+                <w:i w:val="0"/>
+                <w:sz w:val="20"/>
+              </w:rPr>
+              <w:t>Paper</w:t>
+            </w:r>
+          </w:p>
+        </w:tc>
+        <w:tc>
+          <w:tcPr>
+            <w:tcW w:type="dxa" w:w="1440"/>
+          </w:tcPr>
+          <w:p>
+            <w:pPr>
+              <w:jc w:val="center"/>
+            </w:pPr>
+            <w:r/>
+            <w:r>
+              <w:rPr>
+                <w:rFonts w:ascii="Times New Roman" w:hAnsi="Times New Roman" w:cs="Times New Roman"/>
+                <w:b/>
+                <w:i w:val="0"/>
+                <w:sz w:val="20"/>
+              </w:rPr>
+              <w:t>Patient-timeline RAG (EHR-grounded)</w:t>
+            </w:r>
+          </w:p>
+        </w:tc>
+        <w:tc>
+          <w:tcPr>
+            <w:tcW w:type="dxa" w:w="1440"/>
+          </w:tcPr>
+          <w:p>
+            <w:pPr>
+              <w:jc w:val="center"/>
+            </w:pPr>
+            <w:r/>
+            <w:r>
+              <w:rPr>
+                <w:rFonts w:ascii="Times New Roman" w:hAnsi="Times New Roman" w:cs="Times New Roman"/>
+                <w:b/>
+                <w:i w:val="0"/>
+                <w:sz w:val="20"/>
+              </w:rPr>
+              <w:t>Dedicated Verification Gate</w:t>
+            </w:r>
+          </w:p>
+        </w:tc>
+        <w:tc>
+          <w:tcPr>
+            <w:tcW w:type="dxa" w:w="1440"/>
+          </w:tcPr>
+          <w:p>
+            <w:pPr>
+              <w:jc w:val="center"/>
+            </w:pPr>
+            <w:r/>
+            <w:r>
+              <w:rPr>
+                <w:rFonts w:ascii="Times New Roman" w:hAnsi="Times New Roman" w:cs="Times New Roman"/>
+                <w:b/>
+                <w:i w:val="0"/>
+                <w:sz w:val="20"/>
+              </w:rPr>
+              <w:t>Longitudinal Memory</w:t>
+            </w:r>
+          </w:p>
+        </w:tc>
+        <w:tc>
+          <w:tcPr>
+            <w:tcW w:type="dxa" w:w="1440"/>
+          </w:tcPr>
+          <w:p>
+            <w:pPr>
+              <w:jc w:val="center"/>
+            </w:pPr>
+            <w:r/>
+            <w:r>
+              <w:rPr>
+                <w:rFonts w:ascii="Times New Roman" w:hAnsi="Times New Roman" w:cs="Times New Roman"/>
+                <w:b/>
+                <w:i w:val="0"/>
+                <w:sz w:val="20"/>
+              </w:rPr>
+              <w:t>Real ICU data (MIMIC-IV)</w:t>
+            </w:r>
+          </w:p>
+        </w:tc>
+        <w:tc>
+          <w:tcPr>
+            <w:tcW w:type="dxa" w:w="1440"/>
+          </w:tcPr>
+          <w:p>
+            <w:pPr>
+              <w:jc w:val="center"/>
+            </w:pPr>
+            <w:r/>
+            <w:r>
+              <w:rPr>
+                <w:rFonts w:ascii="Times New Roman" w:hAnsi="Times New Roman" w:cs="Times New Roman"/>
+                <w:b/>
+                <w:i w:val="0"/>
+                <w:sz w:val="20"/>
+              </w:rPr>
+              <w:t>Faithful Audit Trail</w:t>
+            </w:r>
+          </w:p>
+        </w:tc>
+      </w:tr>
+      <w:tr>
+        <w:tc>
+          <w:tcPr>
+            <w:tcW w:type="dxa" w:w="1440"/>
+          </w:tcPr>
+          <w:p>
+            <w:pPr>
+              <w:jc w:val="left"/>
+            </w:pPr>
+            <w:r/>
+            <w:r>
+              <w:rPr>
+                <w:rFonts w:ascii="Times New Roman" w:hAnsi="Times New Roman" w:cs="Times New Roman"/>
+                <w:b w:val="0"/>
+                <w:i w:val="0"/>
+                <w:sz w:val="20"/>
+              </w:rPr>
+              <w:t>ReAct [5]</w:t>
+            </w:r>
+          </w:p>
+        </w:tc>
+        <w:tc>
+          <w:tcPr>
+            <w:tcW w:type="dxa" w:w="1440"/>
+          </w:tcPr>
+          <w:p>
+            <w:pPr>
+              <w:jc w:val="center"/>
+            </w:pPr>
+            <w:r/>
+            <w:r>
+              <w:rPr>
+                <w:rFonts w:ascii="Times New Roman" w:hAnsi="Times New Roman" w:cs="Times New Roman"/>
+                <w:b w:val="0"/>
+                <w:i w:val="0"/>
+                <w:sz w:val="20"/>
+              </w:rPr>
+              <w:t>✗</w:t>
+            </w:r>
+          </w:p>
+        </w:tc>
+        <w:tc>
+          <w:tcPr>
+            <w:tcW w:type="dxa" w:w="1440"/>
+          </w:tcPr>
+          <w:p>
+            <w:pPr>
+              <w:jc w:val="center"/>
+            </w:pPr>
+            <w:r/>
+            <w:r>
+              <w:rPr>
+                <w:rFonts w:ascii="Times New Roman" w:hAnsi="Times New Roman" w:cs="Times New Roman"/>
+                <w:b w:val="0"/>
+                <w:i w:val="0"/>
+                <w:sz w:val="20"/>
+              </w:rPr>
+              <w:t>✗</w:t>
+            </w:r>
+          </w:p>
+        </w:tc>
+        <w:tc>
+          <w:tcPr>
+            <w:tcW w:type="dxa" w:w="1440"/>
+          </w:tcPr>
+          <w:p>
+            <w:pPr>
+              <w:jc w:val="center"/>
+            </w:pPr>
+            <w:r/>
+            <w:r>
+              <w:rPr>
+                <w:rFonts w:ascii="Times New Roman" w:hAnsi="Times New Roman" w:cs="Times New Roman"/>
+                <w:b w:val="0"/>
+                <w:i w:val="0"/>
+                <w:sz w:val="20"/>
+              </w:rPr>
+              <w:t>✗</w:t>
+            </w:r>
+          </w:p>
+        </w:tc>
+        <w:tc>
+          <w:tcPr>
+            <w:tcW w:type="dxa" w:w="1440"/>
+          </w:tcPr>
+          <w:p>
+            <w:pPr>
+              <w:jc w:val="center"/>
+            </w:pPr>
+            <w:r/>
+            <w:r>
+              <w:rPr>
+                <w:rFonts w:ascii="Times New Roman" w:hAnsi="Times New Roman" w:cs="Times New Roman"/>
+                <w:b w:val="0"/>
+                <w:i w:val="0"/>
+                <w:sz w:val="20"/>
+              </w:rPr>
+              <w:t>✗</w:t>
+            </w:r>
+          </w:p>
+        </w:tc>
+        <w:tc>
+          <w:tcPr>
+            <w:tcW w:type="dxa" w:w="1440"/>
+          </w:tcPr>
+          <w:p>
+            <w:pPr>
+              <w:jc w:val="center"/>
+            </w:pPr>
+            <w:r/>
+            <w:r>
+              <w:rPr>
+                <w:rFonts w:ascii="Times New Roman" w:hAnsi="Times New Roman" w:cs="Times New Roman"/>
+                <w:b w:val="0"/>
+                <w:i w:val="0"/>
+                <w:sz w:val="20"/>
+              </w:rPr>
+              <w:t>✗</w:t>
+            </w:r>
+          </w:p>
+        </w:tc>
+      </w:tr>
+      <w:tr>
+        <w:tc>
+          <w:tcPr>
+            <w:tcW w:type="dxa" w:w="1440"/>
+          </w:tcPr>
+          <w:p>
+            <w:pPr>
+              <w:jc w:val="left"/>
+            </w:pPr>
+            <w:r/>
+            <w:r>
+              <w:rPr>
+                <w:rFonts w:ascii="Times New Roman" w:hAnsi="Times New Roman" w:cs="Times New Roman"/>
+                <w:b w:val="0"/>
+                <w:i w:val="0"/>
+                <w:sz w:val="20"/>
+              </w:rPr>
+              <w:t>AutoGen [6]</w:t>
+            </w:r>
+          </w:p>
+        </w:tc>
+        <w:tc>
+          <w:tcPr>
+            <w:tcW w:type="dxa" w:w="1440"/>
+          </w:tcPr>
+          <w:p>
+            <w:pPr>
+              <w:jc w:val="center"/>
+            </w:pPr>
+            <w:r/>
+            <w:r>
+              <w:rPr>
+                <w:rFonts w:ascii="Times New Roman" w:hAnsi="Times New Roman" w:cs="Times New Roman"/>
+                <w:b w:val="0"/>
+                <w:i w:val="0"/>
+                <w:sz w:val="20"/>
+              </w:rPr>
+              <w:t>✗</w:t>
+            </w:r>
+          </w:p>
+        </w:tc>
+        <w:tc>
+          <w:tcPr>
+            <w:tcW w:type="dxa" w:w="1440"/>
+          </w:tcPr>
+          <w:p>
+            <w:pPr>
+              <w:jc w:val="center"/>
+            </w:pPr>
+            <w:r/>
+            <w:r>
+              <w:rPr>
+                <w:rFonts w:ascii="Times New Roman" w:hAnsi="Times New Roman" w:cs="Times New Roman"/>
+                <w:b w:val="0"/>
+                <w:i w:val="0"/>
+                <w:sz w:val="20"/>
+              </w:rPr>
+              <w:t>✗</w:t>
+            </w:r>
+          </w:p>
+        </w:tc>
+        <w:tc>
+          <w:tcPr>
+            <w:tcW w:type="dxa" w:w="1440"/>
+          </w:tcPr>
+          <w:p>
+            <w:pPr>
+              <w:jc w:val="center"/>
+            </w:pPr>
+            <w:r/>
+            <w:r>
+              <w:rPr>
+                <w:rFonts w:ascii="Times New Roman" w:hAnsi="Times New Roman" w:cs="Times New Roman"/>
+                <w:b w:val="0"/>
+                <w:i w:val="0"/>
+                <w:sz w:val="20"/>
+              </w:rPr>
+              <w:t>✗</w:t>
+            </w:r>
+          </w:p>
+        </w:tc>
+        <w:tc>
+          <w:tcPr>
+            <w:tcW w:type="dxa" w:w="1440"/>
+          </w:tcPr>
+          <w:p>
+            <w:pPr>
+              <w:jc w:val="center"/>
+            </w:pPr>
+            <w:r/>
+            <w:r>
+              <w:rPr>
+                <w:rFonts w:ascii="Times New Roman" w:hAnsi="Times New Roman" w:cs="Times New Roman"/>
+                <w:b w:val="0"/>
+                <w:i w:val="0"/>
+                <w:sz w:val="20"/>
+              </w:rPr>
+              <w:t>✗</w:t>
+            </w:r>
+          </w:p>
+        </w:tc>
+        <w:tc>
+          <w:tcPr>
+            <w:tcW w:type="dxa" w:w="1440"/>
+          </w:tcPr>
+          <w:p>
+            <w:pPr>
+              <w:jc w:val="center"/>
+            </w:pPr>
+            <w:r/>
+            <w:r>
+              <w:rPr>
+                <w:rFonts w:ascii="Times New Roman" w:hAnsi="Times New Roman" w:cs="Times New Roman"/>
+                <w:b w:val="0"/>
+                <w:i w:val="0"/>
+                <w:sz w:val="20"/>
+              </w:rPr>
+              <w:t>✗</w:t>
+            </w:r>
+          </w:p>
+        </w:tc>
+      </w:tr>
+      <w:tr>
+        <w:tc>
+          <w:tcPr>
+            <w:tcW w:type="dxa" w:w="1440"/>
+          </w:tcPr>
+          <w:p>
+            <w:pPr>
+              <w:jc w:val="left"/>
+            </w:pPr>
+            <w:r/>
+            <w:r>
+              <w:rPr>
+                <w:rFonts w:ascii="Times New Roman" w:hAnsi="Times New Roman" w:cs="Times New Roman"/>
+                <w:b w:val="0"/>
+                <w:i w:val="0"/>
+                <w:sz w:val="20"/>
+              </w:rPr>
+              <w:t>MetaGPT [18]</w:t>
+            </w:r>
+          </w:p>
+        </w:tc>
+        <w:tc>
+          <w:tcPr>
+            <w:tcW w:type="dxa" w:w="1440"/>
+          </w:tcPr>
+          <w:p>
+            <w:pPr>
+              <w:jc w:val="center"/>
+            </w:pPr>
+            <w:r/>
+            <w:r>
+              <w:rPr>
+                <w:rFonts w:ascii="Times New Roman" w:hAnsi="Times New Roman" w:cs="Times New Roman"/>
+                <w:b w:val="0"/>
+                <w:i w:val="0"/>
+                <w:sz w:val="20"/>
+              </w:rPr>
+              <w:t>✗</w:t>
+            </w:r>
+          </w:p>
+        </w:tc>
+        <w:tc>
+          <w:tcPr>
+            <w:tcW w:type="dxa" w:w="1440"/>
+          </w:tcPr>
+          <w:p>
+            <w:pPr>
+              <w:jc w:val="center"/>
+            </w:pPr>
+            <w:r/>
+            <w:r>
+              <w:rPr>
+                <w:rFonts w:ascii="Times New Roman" w:hAnsi="Times New Roman" w:cs="Times New Roman"/>
+                <w:b w:val="0"/>
+                <w:i w:val="0"/>
+                <w:sz w:val="20"/>
+              </w:rPr>
+              <w:t>✗</w:t>
+            </w:r>
+          </w:p>
+        </w:tc>
+        <w:tc>
+          <w:tcPr>
+            <w:tcW w:type="dxa" w:w="1440"/>
+          </w:tcPr>
+          <w:p>
+            <w:pPr>
+              <w:jc w:val="center"/>
+            </w:pPr>
+            <w:r/>
+            <w:r>
+              <w:rPr>
+                <w:rFonts w:ascii="Times New Roman" w:hAnsi="Times New Roman" w:cs="Times New Roman"/>
+                <w:b w:val="0"/>
+                <w:i w:val="0"/>
+                <w:sz w:val="20"/>
+              </w:rPr>
+              <w:t>✗</w:t>
+            </w:r>
+          </w:p>
+        </w:tc>
+        <w:tc>
+          <w:tcPr>
+            <w:tcW w:type="dxa" w:w="1440"/>
+          </w:tcPr>
+          <w:p>
+            <w:pPr>
+              <w:jc w:val="center"/>
+            </w:pPr>
+            <w:r/>
+            <w:r>
+              <w:rPr>
+                <w:rFonts w:ascii="Times New Roman" w:hAnsi="Times New Roman" w:cs="Times New Roman"/>
+                <w:b w:val="0"/>
+                <w:i w:val="0"/>
+                <w:sz w:val="20"/>
+              </w:rPr>
+              <w:t>✗</w:t>
+            </w:r>
+          </w:p>
+        </w:tc>
+        <w:tc>
+          <w:tcPr>
+            <w:tcW w:type="dxa" w:w="1440"/>
+          </w:tcPr>
+          <w:p>
+            <w:pPr>
+              <w:jc w:val="center"/>
+            </w:pPr>
+            <w:r/>
+            <w:r>
+              <w:rPr>
+                <w:rFonts w:ascii="Times New Roman" w:hAnsi="Times New Roman" w:cs="Times New Roman"/>
+                <w:b w:val="0"/>
+                <w:i w:val="0"/>
+                <w:sz w:val="20"/>
+              </w:rPr>
+              <w:t>✗</w:t>
+            </w:r>
+          </w:p>
+        </w:tc>
+      </w:tr>
+      <w:tr>
+        <w:tc>
+          <w:tcPr>
+            <w:tcW w:type="dxa" w:w="1440"/>
+          </w:tcPr>
+          <w:p>
+            <w:pPr>
+              <w:jc w:val="left"/>
+            </w:pPr>
+            <w:r/>
+            <w:r>
+              <w:rPr>
+                <w:rFonts w:ascii="Times New Roman" w:hAnsi="Times New Roman" w:cs="Times New Roman"/>
+                <w:b w:val="0"/>
+                <w:i w:val="0"/>
+                <w:sz w:val="20"/>
+              </w:rPr>
+              <w:t>MedAgents [10]</w:t>
+            </w:r>
+          </w:p>
+        </w:tc>
+        <w:tc>
+          <w:tcPr>
+            <w:tcW w:type="dxa" w:w="1440"/>
+          </w:tcPr>
+          <w:p>
+            <w:pPr>
+              <w:jc w:val="center"/>
+            </w:pPr>
+            <w:r/>
+            <w:r>
+              <w:rPr>
+                <w:rFonts w:ascii="Times New Roman" w:hAnsi="Times New Roman" w:cs="Times New Roman"/>
+                <w:b w:val="0"/>
+                <w:i w:val="0"/>
+                <w:sz w:val="20"/>
+              </w:rPr>
+              <w:t>✗</w:t>
+            </w:r>
+          </w:p>
+        </w:tc>
+        <w:tc>
+          <w:tcPr>
+            <w:tcW w:type="dxa" w:w="1440"/>
+          </w:tcPr>
+          <w:p>
+            <w:pPr>
+              <w:jc w:val="center"/>
+            </w:pPr>
+            <w:r/>
+            <w:r>
+              <w:rPr>
+                <w:rFonts w:ascii="Times New Roman" w:hAnsi="Times New Roman" w:cs="Times New Roman"/>
+                <w:b w:val="0"/>
+                <w:i w:val="0"/>
+                <w:sz w:val="20"/>
+              </w:rPr>
+              <w:t>✗</w:t>
+            </w:r>
+          </w:p>
+        </w:tc>
+        <w:tc>
+          <w:tcPr>
+            <w:tcW w:type="dxa" w:w="1440"/>
+          </w:tcPr>
+          <w:p>
+            <w:pPr>
+              <w:jc w:val="center"/>
+            </w:pPr>
+            <w:r/>
+            <w:r>
+              <w:rPr>
+                <w:rFonts w:ascii="Times New Roman" w:hAnsi="Times New Roman" w:cs="Times New Roman"/>
+                <w:b w:val="0"/>
+                <w:i w:val="0"/>
+                <w:sz w:val="20"/>
+              </w:rPr>
+              <w:t>✗</w:t>
+            </w:r>
+          </w:p>
+        </w:tc>
+        <w:tc>
+          <w:tcPr>
+            <w:tcW w:type="dxa" w:w="1440"/>
+          </w:tcPr>
+          <w:p>
+            <w:pPr>
+              <w:jc w:val="center"/>
+            </w:pPr>
+            <w:r/>
+            <w:r>
+              <w:rPr>
+                <w:rFonts w:ascii="Times New Roman" w:hAnsi="Times New Roman" w:cs="Times New Roman"/>
+                <w:b w:val="0"/>
+                <w:i w:val="0"/>
+                <w:sz w:val="20"/>
+              </w:rPr>
+              <w:t>✗</w:t>
+            </w:r>
+          </w:p>
+        </w:tc>
+        <w:tc>
+          <w:tcPr>
+            <w:tcW w:type="dxa" w:w="1440"/>
+          </w:tcPr>
+          <w:p>
+            <w:pPr>
+              <w:jc w:val="center"/>
+            </w:pPr>
+            <w:r/>
+            <w:r>
+              <w:rPr>
+                <w:rFonts w:ascii="Times New Roman" w:hAnsi="Times New Roman" w:cs="Times New Roman"/>
+                <w:b w:val="0"/>
+                <w:i w:val="0"/>
+                <w:sz w:val="20"/>
+              </w:rPr>
+              <w:t>✗</w:t>
+            </w:r>
+          </w:p>
+        </w:tc>
+      </w:tr>
+      <w:tr>
+        <w:tc>
+          <w:tcPr>
+            <w:tcW w:type="dxa" w:w="1440"/>
+          </w:tcPr>
+          <w:p>
+            <w:pPr>
+              <w:jc w:val="left"/>
+            </w:pPr>
+            <w:r/>
+            <w:r>
+              <w:rPr>
+                <w:rFonts w:ascii="Times New Roman" w:hAnsi="Times New Roman" w:cs="Times New Roman"/>
+                <w:b w:val="0"/>
+                <w:i w:val="0"/>
+                <w:sz w:val="20"/>
+              </w:rPr>
+              <w:t>Agent Hospital [12]</w:t>
+            </w:r>
+          </w:p>
+        </w:tc>
+        <w:tc>
+          <w:tcPr>
+            <w:tcW w:type="dxa" w:w="1440"/>
+          </w:tcPr>
+          <w:p>
+            <w:pPr>
+              <w:jc w:val="center"/>
+            </w:pPr>
+            <w:r/>
+            <w:r>
+              <w:rPr>
+                <w:rFonts w:ascii="Times New Roman" w:hAnsi="Times New Roman" w:cs="Times New Roman"/>
+                <w:b w:val="0"/>
+                <w:i w:val="0"/>
+                <w:sz w:val="20"/>
+              </w:rPr>
+              <w:t>✗</w:t>
+            </w:r>
+          </w:p>
+        </w:tc>
+        <w:tc>
+          <w:tcPr>
+            <w:tcW w:type="dxa" w:w="1440"/>
+          </w:tcPr>
+          <w:p>
+            <w:pPr>
+              <w:jc w:val="center"/>
+            </w:pPr>
+            <w:r/>
+            <w:r>
+              <w:rPr>
+                <w:rFonts w:ascii="Times New Roman" w:hAnsi="Times New Roman" w:cs="Times New Roman"/>
+                <w:b w:val="0"/>
+                <w:i w:val="0"/>
+                <w:sz w:val="20"/>
+              </w:rPr>
+              <w:t>✗</w:t>
+            </w:r>
+          </w:p>
+        </w:tc>
+        <w:tc>
+          <w:tcPr>
+            <w:tcW w:type="dxa" w:w="1440"/>
+          </w:tcPr>
+          <w:p>
+            <w:pPr>
+              <w:jc w:val="center"/>
+            </w:pPr>
+            <w:r/>
+            <w:r>
+              <w:rPr>
+                <w:rFonts w:ascii="Times New Roman" w:hAnsi="Times New Roman" w:cs="Times New Roman"/>
+                <w:b w:val="0"/>
+                <w:i w:val="0"/>
+                <w:sz w:val="20"/>
+              </w:rPr>
+              <w:t>✗</w:t>
+            </w:r>
+          </w:p>
+        </w:tc>
+        <w:tc>
+          <w:tcPr>
+            <w:tcW w:type="dxa" w:w="1440"/>
+          </w:tcPr>
+          <w:p>
+            <w:pPr>
+              <w:jc w:val="center"/>
+            </w:pPr>
+            <w:r/>
+            <w:r>
+              <w:rPr>
+                <w:rFonts w:ascii="Times New Roman" w:hAnsi="Times New Roman" w:cs="Times New Roman"/>
+                <w:b w:val="0"/>
+                <w:i w:val="0"/>
+                <w:sz w:val="20"/>
+              </w:rPr>
+              <w:t>✗</w:t>
+            </w:r>
+          </w:p>
+        </w:tc>
+        <w:tc>
+          <w:tcPr>
+            <w:tcW w:type="dxa" w:w="1440"/>
+          </w:tcPr>
+          <w:p>
+            <w:pPr>
+              <w:jc w:val="center"/>
+            </w:pPr>
+            <w:r/>
+            <w:r>
+              <w:rPr>
+                <w:rFonts w:ascii="Times New Roman" w:hAnsi="Times New Roman" w:cs="Times New Roman"/>
+                <w:b w:val="0"/>
+                <w:i w:val="0"/>
+                <w:sz w:val="20"/>
+              </w:rPr>
+              <w:t>✗</w:t>
+            </w:r>
+          </w:p>
+        </w:tc>
+      </w:tr>
+      <w:tr>
+        <w:tc>
+          <w:tcPr>
+            <w:tcW w:type="dxa" w:w="1440"/>
+          </w:tcPr>
+          <w:p>
+            <w:pPr>
+              <w:jc w:val="left"/>
+            </w:pPr>
+            <w:r/>
+            <w:r>
+              <w:rPr>
+                <w:rFonts w:ascii="Times New Roman" w:hAnsi="Times New Roman" w:cs="Times New Roman"/>
+                <w:b w:val="0"/>
+                <w:i w:val="0"/>
+                <w:sz w:val="20"/>
+              </w:rPr>
+              <w:t>MedRAG [11]</w:t>
+            </w:r>
+          </w:p>
+        </w:tc>
+        <w:tc>
+          <w:tcPr>
+            <w:tcW w:type="dxa" w:w="1440"/>
+          </w:tcPr>
+          <w:p>
+            <w:pPr>
+              <w:jc w:val="center"/>
+            </w:pPr>
+            <w:r/>
+            <w:r>
+              <w:rPr>
+                <w:rFonts w:ascii="Times New Roman" w:hAnsi="Times New Roman" w:cs="Times New Roman"/>
+                <w:b w:val="0"/>
+                <w:i w:val="0"/>
+                <w:sz w:val="20"/>
+              </w:rPr>
+              <w:t>✗</w:t>
+            </w:r>
+          </w:p>
+        </w:tc>
+        <w:tc>
+          <w:tcPr>
+            <w:tcW w:type="dxa" w:w="1440"/>
+          </w:tcPr>
+          <w:p>
+            <w:pPr>
+              <w:jc w:val="center"/>
+            </w:pPr>
+            <w:r/>
+            <w:r>
+              <w:rPr>
+                <w:rFonts w:ascii="Times New Roman" w:hAnsi="Times New Roman" w:cs="Times New Roman"/>
+                <w:b w:val="0"/>
+                <w:i w:val="0"/>
+                <w:sz w:val="20"/>
+              </w:rPr>
+              <w:t>✗</w:t>
+            </w:r>
+          </w:p>
+        </w:tc>
+        <w:tc>
+          <w:tcPr>
+            <w:tcW w:type="dxa" w:w="1440"/>
+          </w:tcPr>
+          <w:p>
+            <w:pPr>
+              <w:jc w:val="center"/>
+            </w:pPr>
+            <w:r/>
+            <w:r>
+              <w:rPr>
+                <w:rFonts w:ascii="Times New Roman" w:hAnsi="Times New Roman" w:cs="Times New Roman"/>
+                <w:b w:val="0"/>
+                <w:i w:val="0"/>
+                <w:sz w:val="20"/>
+              </w:rPr>
+              <w:t>✗</w:t>
+            </w:r>
+          </w:p>
+        </w:tc>
+        <w:tc>
+          <w:tcPr>
+            <w:tcW w:type="dxa" w:w="1440"/>
+          </w:tcPr>
+          <w:p>
+            <w:pPr>
+              <w:jc w:val="center"/>
+            </w:pPr>
+            <w:r/>
+            <w:r>
+              <w:rPr>
+                <w:rFonts w:ascii="Times New Roman" w:hAnsi="Times New Roman" w:cs="Times New Roman"/>
+                <w:b w:val="0"/>
+                <w:i w:val="0"/>
+                <w:sz w:val="20"/>
+              </w:rPr>
+              <w:t>✗</w:t>
+            </w:r>
+          </w:p>
+        </w:tc>
+        <w:tc>
+          <w:tcPr>
+            <w:tcW w:type="dxa" w:w="1440"/>
+          </w:tcPr>
+          <w:p>
+            <w:pPr>
+              <w:jc w:val="center"/>
+            </w:pPr>
+            <w:r/>
+            <w:r>
+              <w:rPr>
+                <w:rFonts w:ascii="Times New Roman" w:hAnsi="Times New Roman" w:cs="Times New Roman"/>
+                <w:b w:val="0"/>
+                <w:i w:val="0"/>
+                <w:sz w:val="20"/>
+              </w:rPr>
+              <w:t>✗</w:t>
+            </w:r>
+          </w:p>
+        </w:tc>
+      </w:tr>
+      <w:tr>
+        <w:tc>
+          <w:tcPr>
+            <w:tcW w:type="dxa" w:w="1440"/>
+          </w:tcPr>
+          <w:p>
+            <w:pPr>
+              <w:jc w:val="left"/>
+            </w:pPr>
+            <w:r/>
+            <w:r>
+              <w:rPr>
+                <w:rFonts w:ascii="Times New Roman" w:hAnsi="Times New Roman" w:cs="Times New Roman"/>
+                <w:b/>
+                <w:i w:val="0"/>
+                <w:sz w:val="20"/>
+              </w:rPr>
+              <w:t>Proposed Framework</w:t>
+            </w:r>
+          </w:p>
+        </w:tc>
+        <w:tc>
+          <w:tcPr>
+            <w:tcW w:type="dxa" w:w="1440"/>
+          </w:tcPr>
+          <w:p>
+            <w:pPr>
+              <w:jc w:val="center"/>
+            </w:pPr>
+            <w:r/>
+            <w:r>
+              <w:rPr>
+                <w:rFonts w:ascii="Times New Roman" w:hAnsi="Times New Roman" w:cs="Times New Roman"/>
+                <w:b w:val="0"/>
+                <w:i w:val="0"/>
+                <w:sz w:val="20"/>
+              </w:rPr>
+              <w:t>✓</w:t>
+            </w:r>
+          </w:p>
+        </w:tc>
+        <w:tc>
+          <w:tcPr>
+            <w:tcW w:type="dxa" w:w="1440"/>
+          </w:tcPr>
+          <w:p>
+            <w:pPr>
+              <w:jc w:val="center"/>
+            </w:pPr>
+            <w:r/>
+            <w:r>
+              <w:rPr>
+                <w:rFonts w:ascii="Times New Roman" w:hAnsi="Times New Roman" w:cs="Times New Roman"/>
+                <w:b w:val="0"/>
+                <w:i w:val="0"/>
+                <w:sz w:val="20"/>
+              </w:rPr>
+              <w:t>✓</w:t>
+            </w:r>
+          </w:p>
+        </w:tc>
+        <w:tc>
+          <w:tcPr>
+            <w:tcW w:type="dxa" w:w="1440"/>
+          </w:tcPr>
+          <w:p>
+            <w:pPr>
+              <w:jc w:val="center"/>
+            </w:pPr>
+            <w:r/>
+            <w:r>
+              <w:rPr>
+                <w:rFonts w:ascii="Times New Roman" w:hAnsi="Times New Roman" w:cs="Times New Roman"/>
+                <w:b w:val="0"/>
+                <w:i w:val="0"/>
+                <w:sz w:val="20"/>
+              </w:rPr>
+              <w:t>✓</w:t>
+            </w:r>
+          </w:p>
+        </w:tc>
+        <w:tc>
+          <w:tcPr>
+            <w:tcW w:type="dxa" w:w="1440"/>
+          </w:tcPr>
+          <w:p>
+            <w:pPr>
+              <w:jc w:val="center"/>
+            </w:pPr>
+            <w:r/>
+            <w:r>
+              <w:rPr>
+                <w:rFonts w:ascii="Times New Roman" w:hAnsi="Times New Roman" w:cs="Times New Roman"/>
+                <w:b w:val="0"/>
+                <w:i w:val="0"/>
+                <w:sz w:val="20"/>
+              </w:rPr>
+              <w:t>✓</w:t>
+            </w:r>
+          </w:p>
+        </w:tc>
+        <w:tc>
+          <w:tcPr>
+            <w:tcW w:type="dxa" w:w="1440"/>
+          </w:tcPr>
+          <w:p>
+            <w:pPr>
+              <w:jc w:val="center"/>
+            </w:pPr>
+            <w:r/>
+            <w:r>
+              <w:rPr>
+                <w:rFonts w:ascii="Times New Roman" w:hAnsi="Times New Roman" w:cs="Times New Roman"/>
+                <w:b w:val="0"/>
+                <w:i w:val="0"/>
+                <w:sz w:val="20"/>
+              </w:rPr>
+              <w:t>✓</w:t>
+            </w:r>
+          </w:p>
+        </w:tc>
+      </w:tr>
+    </w:tbl>
+    <w:p>
+      <w:pPr>
+        <w:spacing w:lineRule="auto" w:line="360" w:before="0" w:after="120"/>
+        <w:jc w:val="both"/>
+      </w:pPr>
     </w:p>
     <w:p>
       <w:pPr>
@@ -3251,7 +5453,71 @@
           <w:i w:val="0"/>
           <w:sz w:val="24"/>
         </w:rPr>
-        <w:t>Because LLM-based agents differ widely in capability, architecture, and application, it helps to classify them along the functional dimensions that recur across the literature. A workable taxonomy organizes agents by six capabilities, memory, planning, reasoning, tool use, multi-agent collaboration, and healthcare application, and reading existing systems against these dimensions clarifies what an intelligent healthcare agent must combine and where prior work stops short [4].</w:t>
+        <w:t>Because LLM-based agents differ widely in capability, architecture, and application, it helps to classify them along the functional dimensions that recur across the literature. A workable taxonomy organizes agents by six capabilities, memory, planning, reasoning, tool use, multi-agent collaboration, and healthcare application, and reading existing systems against these dimensions clarifies what an intelligent healthcare agent must combine and where prior work stops short [4]. Figure 2.1 presents this taxonomy with representative systems placed under each dimension; the same systems recur under several dimensions, which is precisely the point — each supplies one capability a clinical agent needs, and none supplies them all.</w:t>
+      </w:r>
+    </w:p>
+    <w:p>
+      <w:pPr>
+        <w:spacing w:before="120"/>
+        <w:jc w:val="center"/>
+      </w:pPr>
+      <w:r>
+        <w:drawing>
+          <wp:inline xmlns:a="http://schemas.openxmlformats.org/drawingml/2006/main" xmlns:pic="http://schemas.openxmlformats.org/drawingml/2006/picture">
+            <wp:extent cx="5486400" cy="1611009"/>
+            <wp:docPr id="2" name="Picture 2"/>
+            <wp:cNvGraphicFramePr>
+              <a:graphicFrameLocks noChangeAspect="1"/>
+            </wp:cNvGraphicFramePr>
+            <a:graphic>
+              <a:graphicData uri="http://schemas.openxmlformats.org/drawingml/2006/picture">
+                <pic:pic>
+                  <pic:nvPicPr>
+                    <pic:cNvPr id="0" name="taxonomy.png"/>
+                    <pic:cNvPicPr/>
+                  </pic:nvPicPr>
+                  <pic:blipFill>
+                    <a:blip r:embed="rId10"/>
+                    <a:stretch>
+                      <a:fillRect/>
+                    </a:stretch>
+                  </pic:blipFill>
+                  <pic:spPr>
+                    <a:xfrm>
+                      <a:off x="0" y="0"/>
+                      <a:ext cx="5486400" cy="1611009"/>
+                    </a:xfrm>
+                    <a:prstGeom prst="rect"/>
+                  </pic:spPr>
+                </pic:pic>
+              </a:graphicData>
+            </a:graphic>
+          </wp:inline>
+        </w:drawing>
+      </w:r>
+    </w:p>
+    <w:p>
+      <w:pPr>
+        <w:spacing w:after="240"/>
+        <w:jc w:val="center"/>
+      </w:pPr>
+      <w:r>
+        <w:rPr>
+          <w:rFonts w:ascii="Times New Roman" w:hAnsi="Times New Roman" w:cs="Times New Roman"/>
+          <w:b w:val="0"/>
+          <w:i/>
+          <w:sz w:val="22"/>
+        </w:rPr>
+        <w:t xml:space="preserve">Figure 2.1. </w:t>
+      </w:r>
+      <w:r>
+        <w:rPr>
+          <w:rFonts w:ascii="Times New Roman" w:hAnsi="Times New Roman" w:cs="Times New Roman"/>
+          <w:b w:val="0"/>
+          <w:i w:val="0"/>
+          <w:sz w:val="22"/>
+        </w:rPr>
+        <w:t>Taxonomy of LLM-based agents across the six capability dimensions, with representative systems placed under each dimension.</w:t>
       </w:r>
     </w:p>
     <w:p>
@@ -4118,6 +6384,21 @@
     </w:p>
     <w:p>
       <w:pPr>
+        <w:spacing w:lineRule="auto" w:line="360" w:before="0" w:after="0"/>
+        <w:jc w:val="center"/>
+      </w:pPr>
+      <w:r>
+        <w:rPr>
+          <w:rFonts w:ascii="Times New Roman" w:hAnsi="Times New Roman" w:cs="Times New Roman"/>
+          <w:b w:val="0"/>
+          <w:i w:val="0"/>
+          <w:sz w:val="24"/>
+        </w:rPr>
+        <w:t>Table 2.2</w:t>
+      </w:r>
+    </w:p>
+    <w:p>
+      <w:pPr>
         <w:spacing w:lineRule="auto" w:line="360" w:before="0" w:after="120"/>
         <w:jc w:val="center"/>
       </w:pPr>
@@ -4128,8 +6409,762 @@
           <w:i/>
           <w:sz w:val="24"/>
         </w:rPr>
-        <w:t>[Table 2.2: Research gap matrix (insert table here)]</w:t>
-      </w:r>
+        <w:t>Research gap matrix</w:t>
+      </w:r>
+    </w:p>
+    <w:tbl>
+      <w:tblPr>
+        <w:tblStyle w:val="TableGrid"/>
+        <w:tblW w:type="auto" w:w="0"/>
+        <w:jc w:val="center"/>
+        <w:tblLook w:firstColumn="1" w:firstRow="1" w:lastColumn="0" w:lastRow="0" w:noHBand="0" w:noVBand="1" w:val="04A0"/>
+      </w:tblPr>
+      <w:tblGrid>
+        <w:gridCol w:w="1440"/>
+        <w:gridCol w:w="1440"/>
+        <w:gridCol w:w="1440"/>
+        <w:gridCol w:w="1440"/>
+        <w:gridCol w:w="1440"/>
+        <w:gridCol w:w="1440"/>
+      </w:tblGrid>
+      <w:tr>
+        <w:tc>
+          <w:tcPr>
+            <w:tcW w:type="dxa" w:w="1440"/>
+          </w:tcPr>
+          <w:p>
+            <w:pPr>
+              <w:jc w:val="center"/>
+            </w:pPr>
+            <w:r/>
+            <w:r>
+              <w:rPr>
+                <w:rFonts w:ascii="Times New Roman" w:hAnsi="Times New Roman" w:cs="Times New Roman"/>
+                <w:b/>
+                <w:i w:val="0"/>
+                <w:sz w:val="20"/>
+              </w:rPr>
+              <w:t>Theme</w:t>
+            </w:r>
+          </w:p>
+        </w:tc>
+        <w:tc>
+          <w:tcPr>
+            <w:tcW w:type="dxa" w:w="1440"/>
+          </w:tcPr>
+          <w:p>
+            <w:pPr>
+              <w:jc w:val="center"/>
+            </w:pPr>
+            <w:r/>
+            <w:r>
+              <w:rPr>
+                <w:rFonts w:ascii="Times New Roman" w:hAnsi="Times New Roman" w:cs="Times New Roman"/>
+                <w:b/>
+                <w:i w:val="0"/>
+                <w:sz w:val="20"/>
+              </w:rPr>
+              <w:t>Papers</w:t>
+            </w:r>
+          </w:p>
+        </w:tc>
+        <w:tc>
+          <w:tcPr>
+            <w:tcW w:type="dxa" w:w="1440"/>
+          </w:tcPr>
+          <w:p>
+            <w:pPr>
+              <w:jc w:val="center"/>
+            </w:pPr>
+            <w:r/>
+            <w:r>
+              <w:rPr>
+                <w:rFonts w:ascii="Times New Roman" w:hAnsi="Times New Roman" w:cs="Times New Roman"/>
+                <w:b/>
+                <w:i w:val="0"/>
+                <w:sz w:val="20"/>
+              </w:rPr>
+              <w:t>Current State</w:t>
+            </w:r>
+          </w:p>
+        </w:tc>
+        <w:tc>
+          <w:tcPr>
+            <w:tcW w:type="dxa" w:w="1440"/>
+          </w:tcPr>
+          <w:p>
+            <w:pPr>
+              <w:jc w:val="center"/>
+            </w:pPr>
+            <w:r/>
+            <w:r>
+              <w:rPr>
+                <w:rFonts w:ascii="Times New Roman" w:hAnsi="Times New Roman" w:cs="Times New Roman"/>
+                <w:b/>
+                <w:i w:val="0"/>
+                <w:sz w:val="20"/>
+              </w:rPr>
+              <w:t>Limitation</w:t>
+            </w:r>
+          </w:p>
+        </w:tc>
+        <w:tc>
+          <w:tcPr>
+            <w:tcW w:type="dxa" w:w="1440"/>
+          </w:tcPr>
+          <w:p>
+            <w:pPr>
+              <w:jc w:val="center"/>
+            </w:pPr>
+            <w:r/>
+            <w:r>
+              <w:rPr>
+                <w:rFonts w:ascii="Times New Roman" w:hAnsi="Times New Roman" w:cs="Times New Roman"/>
+                <w:b/>
+                <w:i w:val="0"/>
+                <w:sz w:val="20"/>
+              </w:rPr>
+              <w:t>Gap</w:t>
+            </w:r>
+          </w:p>
+        </w:tc>
+        <w:tc>
+          <w:tcPr>
+            <w:tcW w:type="dxa" w:w="1440"/>
+          </w:tcPr>
+          <w:p>
+            <w:pPr>
+              <w:jc w:val="center"/>
+            </w:pPr>
+            <w:r/>
+            <w:r>
+              <w:rPr>
+                <w:rFonts w:ascii="Times New Roman" w:hAnsi="Times New Roman" w:cs="Times New Roman"/>
+                <w:b/>
+                <w:i w:val="0"/>
+                <w:sz w:val="20"/>
+              </w:rPr>
+              <w:t>Thesis Contribution</w:t>
+            </w:r>
+          </w:p>
+        </w:tc>
+      </w:tr>
+      <w:tr>
+        <w:tc>
+          <w:tcPr>
+            <w:tcW w:type="dxa" w:w="1440"/>
+          </w:tcPr>
+          <w:p>
+            <w:pPr>
+              <w:jc w:val="left"/>
+            </w:pPr>
+            <w:r/>
+            <w:r>
+              <w:rPr>
+                <w:rFonts w:ascii="Times New Roman" w:hAnsi="Times New Roman" w:cs="Times New Roman"/>
+                <w:b w:val="0"/>
+                <w:i w:val="0"/>
+                <w:sz w:val="20"/>
+              </w:rPr>
+              <w:t>Memory</w:t>
+            </w:r>
+          </w:p>
+        </w:tc>
+        <w:tc>
+          <w:tcPr>
+            <w:tcW w:type="dxa" w:w="1440"/>
+          </w:tcPr>
+          <w:p>
+            <w:pPr>
+              <w:jc w:val="left"/>
+            </w:pPr>
+            <w:r/>
+            <w:r>
+              <w:rPr>
+                <w:rFonts w:ascii="Times New Roman" w:hAnsi="Times New Roman" w:cs="Times New Roman"/>
+                <w:b w:val="0"/>
+                <w:i w:val="0"/>
+                <w:sz w:val="20"/>
+              </w:rPr>
+              <w:t>[3], [8], [4], [12]</w:t>
+            </w:r>
+          </w:p>
+        </w:tc>
+        <w:tc>
+          <w:tcPr>
+            <w:tcW w:type="dxa" w:w="1440"/>
+          </w:tcPr>
+          <w:p>
+            <w:pPr>
+              <w:jc w:val="left"/>
+            </w:pPr>
+            <w:r/>
+            <w:r>
+              <w:rPr>
+                <w:rFonts w:ascii="Times New Roman" w:hAnsi="Times New Roman" w:cs="Times New Roman"/>
+                <w:b w:val="0"/>
+                <w:i w:val="0"/>
+                <w:sz w:val="20"/>
+              </w:rPr>
+              <w:t>Episodic and semantic memories</w:t>
+            </w:r>
+          </w:p>
+        </w:tc>
+        <w:tc>
+          <w:tcPr>
+            <w:tcW w:type="dxa" w:w="1440"/>
+          </w:tcPr>
+          <w:p>
+            <w:pPr>
+              <w:jc w:val="left"/>
+            </w:pPr>
+            <w:r/>
+            <w:r>
+              <w:rPr>
+                <w:rFonts w:ascii="Times New Roman" w:hAnsi="Times New Roman" w:cs="Times New Roman"/>
+                <w:b w:val="0"/>
+                <w:i w:val="0"/>
+                <w:sz w:val="20"/>
+              </w:rPr>
+              <w:t>Little support for continuous patient monitoring</w:t>
+            </w:r>
+          </w:p>
+        </w:tc>
+        <w:tc>
+          <w:tcPr>
+            <w:tcW w:type="dxa" w:w="1440"/>
+          </w:tcPr>
+          <w:p>
+            <w:pPr>
+              <w:jc w:val="left"/>
+            </w:pPr>
+            <w:r/>
+            <w:r>
+              <w:rPr>
+                <w:rFonts w:ascii="Times New Roman" w:hAnsi="Times New Roman" w:cs="Times New Roman"/>
+                <w:b w:val="0"/>
+                <w:i w:val="0"/>
+                <w:sz w:val="20"/>
+              </w:rPr>
+              <w:t>Need patient-centric long-term memory</w:t>
+            </w:r>
+          </w:p>
+        </w:tc>
+        <w:tc>
+          <w:tcPr>
+            <w:tcW w:type="dxa" w:w="1440"/>
+          </w:tcPr>
+          <w:p>
+            <w:pPr>
+              <w:jc w:val="left"/>
+            </w:pPr>
+            <w:r/>
+            <w:r>
+              <w:rPr>
+                <w:rFonts w:ascii="Times New Roman" w:hAnsi="Times New Roman" w:cs="Times New Roman"/>
+                <w:b w:val="0"/>
+                <w:i w:val="0"/>
+                <w:sz w:val="20"/>
+              </w:rPr>
+              <w:t>Longitudinal patient memory</w:t>
+            </w:r>
+          </w:p>
+        </w:tc>
+      </w:tr>
+      <w:tr>
+        <w:tc>
+          <w:tcPr>
+            <w:tcW w:type="dxa" w:w="1440"/>
+          </w:tcPr>
+          <w:p>
+            <w:pPr>
+              <w:jc w:val="left"/>
+            </w:pPr>
+            <w:r/>
+            <w:r>
+              <w:rPr>
+                <w:rFonts w:ascii="Times New Roman" w:hAnsi="Times New Roman" w:cs="Times New Roman"/>
+                <w:b w:val="0"/>
+                <w:i w:val="0"/>
+                <w:sz w:val="20"/>
+              </w:rPr>
+              <w:t>Planning</w:t>
+            </w:r>
+          </w:p>
+        </w:tc>
+        <w:tc>
+          <w:tcPr>
+            <w:tcW w:type="dxa" w:w="1440"/>
+          </w:tcPr>
+          <w:p>
+            <w:pPr>
+              <w:jc w:val="left"/>
+            </w:pPr>
+            <w:r/>
+            <w:r>
+              <w:rPr>
+                <w:rFonts w:ascii="Times New Roman" w:hAnsi="Times New Roman" w:cs="Times New Roman"/>
+                <w:b w:val="0"/>
+                <w:i w:val="0"/>
+                <w:sz w:val="20"/>
+              </w:rPr>
+              <w:t>[3], [5], [6]</w:t>
+            </w:r>
+          </w:p>
+        </w:tc>
+        <w:tc>
+          <w:tcPr>
+            <w:tcW w:type="dxa" w:w="1440"/>
+          </w:tcPr>
+          <w:p>
+            <w:pPr>
+              <w:jc w:val="left"/>
+            </w:pPr>
+            <w:r/>
+            <w:r>
+              <w:rPr>
+                <w:rFonts w:ascii="Times New Roman" w:hAnsi="Times New Roman" w:cs="Times New Roman"/>
+                <w:b w:val="0"/>
+                <w:i w:val="0"/>
+                <w:sz w:val="20"/>
+              </w:rPr>
+              <w:t>Task decomposition</w:t>
+            </w:r>
+          </w:p>
+        </w:tc>
+        <w:tc>
+          <w:tcPr>
+            <w:tcW w:type="dxa" w:w="1440"/>
+          </w:tcPr>
+          <w:p>
+            <w:pPr>
+              <w:jc w:val="left"/>
+            </w:pPr>
+            <w:r/>
+            <w:r>
+              <w:rPr>
+                <w:rFonts w:ascii="Times New Roman" w:hAnsi="Times New Roman" w:cs="Times New Roman"/>
+                <w:b w:val="0"/>
+                <w:i w:val="0"/>
+                <w:sz w:val="20"/>
+              </w:rPr>
+              <w:t>No clinical workflow planning</w:t>
+            </w:r>
+          </w:p>
+        </w:tc>
+        <w:tc>
+          <w:tcPr>
+            <w:tcW w:type="dxa" w:w="1440"/>
+          </w:tcPr>
+          <w:p>
+            <w:pPr>
+              <w:jc w:val="left"/>
+            </w:pPr>
+            <w:r/>
+            <w:r>
+              <w:rPr>
+                <w:rFonts w:ascii="Times New Roman" w:hAnsi="Times New Roman" w:cs="Times New Roman"/>
+                <w:b w:val="0"/>
+                <w:i w:val="0"/>
+                <w:sz w:val="20"/>
+              </w:rPr>
+              <w:t>Clinical care planning</w:t>
+            </w:r>
+          </w:p>
+        </w:tc>
+        <w:tc>
+          <w:tcPr>
+            <w:tcW w:type="dxa" w:w="1440"/>
+          </w:tcPr>
+          <w:p>
+            <w:pPr>
+              <w:jc w:val="left"/>
+            </w:pPr>
+            <w:r/>
+            <w:r>
+              <w:rPr>
+                <w:rFonts w:ascii="Times New Roman" w:hAnsi="Times New Roman" w:cs="Times New Roman"/>
+                <w:b w:val="0"/>
+                <w:i w:val="0"/>
+                <w:sz w:val="20"/>
+              </w:rPr>
+              <w:t>Intelligent treatment planning</w:t>
+            </w:r>
+          </w:p>
+        </w:tc>
+      </w:tr>
+      <w:tr>
+        <w:tc>
+          <w:tcPr>
+            <w:tcW w:type="dxa" w:w="1440"/>
+          </w:tcPr>
+          <w:p>
+            <w:pPr>
+              <w:jc w:val="left"/>
+            </w:pPr>
+            <w:r/>
+            <w:r>
+              <w:rPr>
+                <w:rFonts w:ascii="Times New Roman" w:hAnsi="Times New Roman" w:cs="Times New Roman"/>
+                <w:b w:val="0"/>
+                <w:i w:val="0"/>
+                <w:sz w:val="20"/>
+              </w:rPr>
+              <w:t>Multi-Agent</w:t>
+            </w:r>
+          </w:p>
+        </w:tc>
+        <w:tc>
+          <w:tcPr>
+            <w:tcW w:type="dxa" w:w="1440"/>
+          </w:tcPr>
+          <w:p>
+            <w:pPr>
+              <w:jc w:val="left"/>
+            </w:pPr>
+            <w:r/>
+            <w:r>
+              <w:rPr>
+                <w:rFonts w:ascii="Times New Roman" w:hAnsi="Times New Roman" w:cs="Times New Roman"/>
+                <w:b w:val="0"/>
+                <w:i w:val="0"/>
+                <w:sz w:val="20"/>
+              </w:rPr>
+              <w:t>[8], [6], [7], [18], [10]</w:t>
+            </w:r>
+          </w:p>
+        </w:tc>
+        <w:tc>
+          <w:tcPr>
+            <w:tcW w:type="dxa" w:w="1440"/>
+          </w:tcPr>
+          <w:p>
+            <w:pPr>
+              <w:jc w:val="left"/>
+            </w:pPr>
+            <w:r/>
+            <w:r>
+              <w:rPr>
+                <w:rFonts w:ascii="Times New Roman" w:hAnsi="Times New Roman" w:cs="Times New Roman"/>
+                <w:b w:val="0"/>
+                <w:i w:val="0"/>
+                <w:sz w:val="20"/>
+              </w:rPr>
+              <w:t>Agent collaboration</w:t>
+            </w:r>
+          </w:p>
+        </w:tc>
+        <w:tc>
+          <w:tcPr>
+            <w:tcW w:type="dxa" w:w="1440"/>
+          </w:tcPr>
+          <w:p>
+            <w:pPr>
+              <w:jc w:val="left"/>
+            </w:pPr>
+            <w:r/>
+            <w:r>
+              <w:rPr>
+                <w:rFonts w:ascii="Times New Roman" w:hAnsi="Times New Roman" w:cs="Times New Roman"/>
+                <w:b w:val="0"/>
+                <w:i w:val="0"/>
+                <w:sz w:val="20"/>
+              </w:rPr>
+              <w:t>Limited healthcare orchestration</w:t>
+            </w:r>
+          </w:p>
+        </w:tc>
+        <w:tc>
+          <w:tcPr>
+            <w:tcW w:type="dxa" w:w="1440"/>
+          </w:tcPr>
+          <w:p>
+            <w:pPr>
+              <w:jc w:val="left"/>
+            </w:pPr>
+            <w:r/>
+            <w:r>
+              <w:rPr>
+                <w:rFonts w:ascii="Times New Roman" w:hAnsi="Times New Roman" w:cs="Times New Roman"/>
+                <w:b w:val="0"/>
+                <w:i w:val="0"/>
+                <w:sz w:val="20"/>
+              </w:rPr>
+              <w:t>Specialized clinical agents</w:t>
+            </w:r>
+          </w:p>
+        </w:tc>
+        <w:tc>
+          <w:tcPr>
+            <w:tcW w:type="dxa" w:w="1440"/>
+          </w:tcPr>
+          <w:p>
+            <w:pPr>
+              <w:jc w:val="left"/>
+            </w:pPr>
+            <w:r/>
+            <w:r>
+              <w:rPr>
+                <w:rFonts w:ascii="Times New Roman" w:hAnsi="Times New Roman" w:cs="Times New Roman"/>
+                <w:b w:val="0"/>
+                <w:i w:val="0"/>
+                <w:sz w:val="20"/>
+              </w:rPr>
+              <w:t>Clinical multi-agent architecture</w:t>
+            </w:r>
+          </w:p>
+        </w:tc>
+      </w:tr>
+      <w:tr>
+        <w:tc>
+          <w:tcPr>
+            <w:tcW w:type="dxa" w:w="1440"/>
+          </w:tcPr>
+          <w:p>
+            <w:pPr>
+              <w:jc w:val="center"/>
+            </w:pPr>
+            <w:r/>
+            <w:r>
+              <w:rPr>
+                <w:rFonts w:ascii="Times New Roman" w:hAnsi="Times New Roman" w:cs="Times New Roman"/>
+                <w:b w:val="0"/>
+                <w:i w:val="0"/>
+                <w:sz w:val="20"/>
+              </w:rPr>
+              <w:t>RAG</w:t>
+            </w:r>
+          </w:p>
+        </w:tc>
+        <w:tc>
+          <w:tcPr>
+            <w:tcW w:type="dxa" w:w="1440"/>
+          </w:tcPr>
+          <w:p>
+            <w:pPr>
+              <w:jc w:val="left"/>
+            </w:pPr>
+            <w:r/>
+            <w:r>
+              <w:rPr>
+                <w:rFonts w:ascii="Times New Roman" w:hAnsi="Times New Roman" w:cs="Times New Roman"/>
+                <w:b w:val="0"/>
+                <w:i w:val="0"/>
+                <w:sz w:val="20"/>
+              </w:rPr>
+              <w:t>[23], [4], [11]</w:t>
+            </w:r>
+          </w:p>
+        </w:tc>
+        <w:tc>
+          <w:tcPr>
+            <w:tcW w:type="dxa" w:w="1440"/>
+          </w:tcPr>
+          <w:p>
+            <w:pPr>
+              <w:jc w:val="left"/>
+            </w:pPr>
+            <w:r/>
+            <w:r>
+              <w:rPr>
+                <w:rFonts w:ascii="Times New Roman" w:hAnsi="Times New Roman" w:cs="Times New Roman"/>
+                <w:b w:val="0"/>
+                <w:i w:val="0"/>
+                <w:sz w:val="20"/>
+              </w:rPr>
+              <w:t>External knowledge retrieval</w:t>
+            </w:r>
+          </w:p>
+        </w:tc>
+        <w:tc>
+          <w:tcPr>
+            <w:tcW w:type="dxa" w:w="1440"/>
+          </w:tcPr>
+          <w:p>
+            <w:pPr>
+              <w:jc w:val="left"/>
+            </w:pPr>
+            <w:r/>
+            <w:r>
+              <w:rPr>
+                <w:rFonts w:ascii="Times New Roman" w:hAnsi="Times New Roman" w:cs="Times New Roman"/>
+                <w:b w:val="0"/>
+                <w:i w:val="0"/>
+                <w:sz w:val="20"/>
+              </w:rPr>
+              <w:t>Limited EHR integration</w:t>
+            </w:r>
+          </w:p>
+        </w:tc>
+        <w:tc>
+          <w:tcPr>
+            <w:tcW w:type="dxa" w:w="1440"/>
+          </w:tcPr>
+          <w:p>
+            <w:pPr>
+              <w:jc w:val="left"/>
+            </w:pPr>
+            <w:r/>
+            <w:r>
+              <w:rPr>
+                <w:rFonts w:ascii="Times New Roman" w:hAnsi="Times New Roman" w:cs="Times New Roman"/>
+                <w:b w:val="0"/>
+                <w:i w:val="0"/>
+                <w:sz w:val="20"/>
+              </w:rPr>
+              <w:t>Healthcare-specific RAG</w:t>
+            </w:r>
+          </w:p>
+        </w:tc>
+        <w:tc>
+          <w:tcPr>
+            <w:tcW w:type="dxa" w:w="1440"/>
+          </w:tcPr>
+          <w:p>
+            <w:pPr>
+              <w:jc w:val="left"/>
+            </w:pPr>
+            <w:r/>
+            <w:r>
+              <w:rPr>
+                <w:rFonts w:ascii="Times New Roman" w:hAnsi="Times New Roman" w:cs="Times New Roman"/>
+                <w:b w:val="0"/>
+                <w:i w:val="0"/>
+                <w:sz w:val="20"/>
+              </w:rPr>
+              <w:t>EHR + Guidelines + Medical Literature</w:t>
+            </w:r>
+          </w:p>
+        </w:tc>
+      </w:tr>
+      <w:tr>
+        <w:tc>
+          <w:tcPr>
+            <w:tcW w:type="dxa" w:w="1440"/>
+          </w:tcPr>
+          <w:p>
+            <w:pPr>
+              <w:jc w:val="left"/>
+            </w:pPr>
+            <w:r/>
+            <w:r>
+              <w:rPr>
+                <w:rFonts w:ascii="Times New Roman" w:hAnsi="Times New Roman" w:cs="Times New Roman"/>
+                <w:b w:val="0"/>
+                <w:i w:val="0"/>
+                <w:sz w:val="20"/>
+              </w:rPr>
+              <w:t>Trustworthy AI</w:t>
+            </w:r>
+          </w:p>
+        </w:tc>
+        <w:tc>
+          <w:tcPr>
+            <w:tcW w:type="dxa" w:w="1440"/>
+          </w:tcPr>
+          <w:p>
+            <w:pPr>
+              <w:jc w:val="left"/>
+            </w:pPr>
+            <w:r/>
+            <w:r>
+              <w:rPr>
+                <w:rFonts w:ascii="Times New Roman" w:hAnsi="Times New Roman" w:cs="Times New Roman"/>
+                <w:b w:val="0"/>
+                <w:i w:val="0"/>
+                <w:sz w:val="20"/>
+              </w:rPr>
+              <w:t>[3], [12], [2], [16]</w:t>
+            </w:r>
+          </w:p>
+        </w:tc>
+        <w:tc>
+          <w:tcPr>
+            <w:tcW w:type="dxa" w:w="1440"/>
+          </w:tcPr>
+          <w:p>
+            <w:pPr>
+              <w:jc w:val="left"/>
+            </w:pPr>
+            <w:r/>
+            <w:r>
+              <w:rPr>
+                <w:rFonts w:ascii="Times New Roman" w:hAnsi="Times New Roman" w:cs="Times New Roman"/>
+                <w:b w:val="0"/>
+                <w:i w:val="0"/>
+                <w:sz w:val="20"/>
+              </w:rPr>
+              <w:t>Hallucination reduction</w:t>
+            </w:r>
+          </w:p>
+        </w:tc>
+        <w:tc>
+          <w:tcPr>
+            <w:tcW w:type="dxa" w:w="1440"/>
+          </w:tcPr>
+          <w:p>
+            <w:pPr>
+              <w:jc w:val="left"/>
+            </w:pPr>
+            <w:r/>
+            <w:r>
+              <w:rPr>
+                <w:rFonts w:ascii="Times New Roman" w:hAnsi="Times New Roman" w:cs="Times New Roman"/>
+                <w:b w:val="0"/>
+                <w:i w:val="0"/>
+                <w:sz w:val="20"/>
+              </w:rPr>
+              <w:t>Lack of explainability</w:t>
+            </w:r>
+          </w:p>
+        </w:tc>
+        <w:tc>
+          <w:tcPr>
+            <w:tcW w:type="dxa" w:w="1440"/>
+          </w:tcPr>
+          <w:p>
+            <w:pPr>
+              <w:jc w:val="left"/>
+            </w:pPr>
+            <w:r/>
+            <w:r>
+              <w:rPr>
+                <w:rFonts w:ascii="Times New Roman" w:hAnsi="Times New Roman" w:cs="Times New Roman"/>
+                <w:b w:val="0"/>
+                <w:i w:val="0"/>
+                <w:sz w:val="20"/>
+              </w:rPr>
+              <w:t>Explainable decisions</w:t>
+            </w:r>
+          </w:p>
+        </w:tc>
+        <w:tc>
+          <w:tcPr>
+            <w:tcW w:type="dxa" w:w="1440"/>
+          </w:tcPr>
+          <w:p>
+            <w:pPr>
+              <w:jc w:val="left"/>
+            </w:pPr>
+            <w:r/>
+            <w:r>
+              <w:rPr>
+                <w:rFonts w:ascii="Times New Roman" w:hAnsi="Times New Roman" w:cs="Times New Roman"/>
+                <w:b w:val="0"/>
+                <w:i w:val="0"/>
+                <w:sz w:val="20"/>
+              </w:rPr>
+              <w:t>Explainable clinical reasoning</w:t>
+            </w:r>
+          </w:p>
+        </w:tc>
+      </w:tr>
+    </w:tbl>
+    <w:p>
+      <w:pPr>
+        <w:spacing w:lineRule="auto" w:line="360" w:before="0" w:after="120"/>
+        <w:jc w:val="both"/>
+      </w:pPr>
     </w:p>
     <w:p>
       <w:pPr>
@@ -4144,7 +7179,7 @@
           <w:i w:val="0"/>
           <w:sz w:val="24"/>
         </w:rPr>
-        <w:t>These observations point to the need for an Agentic AI framework that grounds retrieval in the patient's own longitudinal EHR timeline, coordinates specialized clinical agents, and treats verification and faithful auditability as evaluated components rather than aspirations, supporting intelligent monitoring while providing transparent, evidence-based recommendations that assist clinicians without replacing their judgment. The proposed research addresses these gaps by designing such a framework using the MIMIC-IV dataset [14], combining longitudinal patient memory, ReAct-based reasoning [5], patient-timeline Retrieval-Augmented Generation over EHR data and medical literature, coordinated specialized agents, a dedicated verification gate, and human-in-the-loop validation to improve the quality, transparency, and reliability of AI-assisted clinical decision making. The architecture that realizes these components is presented in detail in Chapter 3.</w:t>
+        <w:t>These observations point to the need for an Agentic AI framework that grounds retrieval in the patient's own longitudinal EHR timeline, coordinates specialized clinical agents, and treats verification and faithful auditability as evaluated components rather than aspirations, supporting intelligent monitoring while providing transparent, evidence-based recommendations that assist clinicians without replacing their judgment. The proposed research addresses these gaps by designing such a framework using the MIMIC-IV dataset [14], combining longitudinal patient memory, ReAct-based reasoning [5], patient-timeline Retrieval-Augmented Generation over EHR data and medical literature, coordinated specialized agents, a dedicated verification gate, and human-in-the-loop validation to improve the quality, transparency, and reliability of AI-assisted clinical decision making. The architecture that realizes these components is presented in detail in Chapter 3. Before the chapter concludes, Section 2.11 tests this gap analysis against the 2025–2026 literature.</w:t>
       </w:r>
     </w:p>
     <w:p>
@@ -4161,7 +7196,7 @@
           <w:i w:val="0"/>
           <w:sz w:val="28"/>
         </w:rPr>
-        <w:t>2.11 Chapter Summary</w:t>
+        <w:t>2.11 Recent Advances (2025–2026)</w:t>
       </w:r>
     </w:p>
     <w:p>
@@ -4177,7 +7212,24 @@
           <w:i w:val="0"/>
           <w:sz w:val="24"/>
         </w:rPr>
-        <w:t>This chapter reviewed the literature on Large Language Models, Agentic AI, Retrieval-Augmented Generation, multi-agent systems, and healthcare artificial intelligence, and read it critically to locate a defensible research gap. It traced the evolution of LLMs into LLM-based agents and then into Agentic AI, and examined the architectural components, memory, planning, reasoning, tool use, and multi-agent collaboration, that convert a passive model into a goal-directed system [3][4]. It analyzed influential agent frameworks, including ReAct, AutoGen, CAMEL, MetaGPT, Toolformer, Reflexion, Voyager, and Generative Agents, organizing their capabilities into a taxonomy and showing that each supplies a mechanism a clinical system needs while none supplies the whole [5][6][7][18][23][19][24][8]. Turning to the clinical domain, it reviewed artificial intelligence and Large Language Models in healthcare, clinical decision support, Retrieval-Augmented Generation, and trustworthy-AI mechanisms, examining systems such as Med-PaLM, Med-PaLM 2, Med-PaLM M, Clinical Camel, MedAgents, MedRAG, Agent Hospital, and EHRAgent [2][26][25][13][10][11][12][33].</w:t>
+        <w:t>The two years covered by this section changed the shape of the field more than they changed its substance. The components reviewed earlier in this chapter — reasoning strategies, memory, retrieval, multi-agent coordination — stopped being research proposals and became infrastructure. What did not change is the evidence standard: most systems are still validated far from the bedside, and that distance is where this thesis positions its contribution.</w:t>
+      </w:r>
+    </w:p>
+    <w:p>
+      <w:pPr>
+        <w:keepNext/>
+        <w:spacing w:lineRule="auto" w:line="360" w:before="240" w:after="120"/>
+        <w:jc w:val="left"/>
+        <w:outlineLvl w:val="2"/>
+      </w:pPr>
+      <w:r>
+        <w:rPr>
+          <w:rFonts w:ascii="Times New Roman" w:hAnsi="Times New Roman" w:cs="Times New Roman"/>
+          <w:b/>
+          <w:i w:val="0"/>
+          <w:sz w:val="24"/>
+        </w:rPr>
+        <w:t>2.11.1 Medical Agents Displace Medical Chatbots</w:t>
       </w:r>
     </w:p>
     <w:p>
@@ -4193,6 +7245,285 @@
           <w:i w:val="0"/>
           <w:sz w:val="24"/>
         </w:rPr>
+        <w:t>The clearest shift is architectural. Where the previous generation asked a fine-tuned model a question and graded the answer [26], the systems of 2025 act. TxAgent selects among 211 biomedical tools to reason about drug interactions and contraindications before recommending a treatment [34]. RiskAgent routes risk-prediction queries to validated clinical calculators rather than trusting parametric knowledge, and reports better faithfulness precisely because the arithmetic happens outside the model [35]. MedRAX wraps chest X-ray analysis tools in a ReAct-style loop and reaches state-of-the-art performance on complex radiology queries without any additional training [36]. DoctorAgent-RL goes further and trains the consultation behavior itself, casting multi-turn history-taking as a reinforcement learning problem between a doctor agent and a patient agent [37]. A broad survey of medical LLM agents organizes this landscape and concludes that clinical decision-making is the application area with the most activity and the least deployment evidence [38]. Tool use, in short, moved from a differentiator to a baseline expectation. None of these systems, however, maintains a longitudinal model of a specific patient: the tools are called per query, and the patient state is rebuilt from the prompt each time.</w:t>
+      </w:r>
+    </w:p>
+    <w:p>
+      <w:pPr>
+        <w:keepNext/>
+        <w:spacing w:lineRule="auto" w:line="360" w:before="240" w:after="120"/>
+        <w:jc w:val="left"/>
+        <w:outlineLvl w:val="2"/>
+      </w:pPr>
+      <w:r>
+        <w:rPr>
+          <w:rFonts w:ascii="Times New Roman" w:hAnsi="Times New Roman" w:cs="Times New Roman"/>
+          <w:b/>
+          <w:i w:val="0"/>
+          <w:sz w:val="24"/>
+        </w:rPr>
+        <w:t>2.11.2 Longitudinal and Multimodal Clinical Dialogue</w:t>
+      </w:r>
+    </w:p>
+    <w:p>
+      <w:pPr>
+        <w:spacing w:lineRule="auto" w:line="360" w:after="120"/>
+        <w:ind w:firstLine="720"/>
+        <w:jc w:val="both"/>
+      </w:pPr>
+      <w:r>
+        <w:rPr>
+          <w:rFonts w:ascii="Times New Roman" w:hAnsi="Times New Roman" w:cs="Times New Roman"/>
+          <w:b w:val="0"/>
+          <w:i w:val="0"/>
+          <w:sz w:val="24"/>
+        </w:rPr>
+        <w:t>Google's AMIE line illustrates both the progress and the residue. The management-reasoning extension handles multi-visit disease trajectories, tracking therapy response and aligning prescriptions with guidelines, and matched or exceeded primary care physicians on management quality across simulated longitudinal cases [39]. A companion system adds state-aware multimodal reasoning, requesting and interpreting images, ECGs, and documents mid-conversation [40]. These are the closest existing analogues to the monitoring loop this thesis proposes. The critical caveat is the substrate: both are evaluated on objective structured clinical examination scenarios with simulated patients, not on the noisy, incomplete, internally contradictory record of a real ICU admission [14]. Longitudinality achieved on scripted cases does not establish longitudinality on real records, and that distinction carries the first research gap of Section 2.10 into the present.</w:t>
+      </w:r>
+    </w:p>
+    <w:p>
+      <w:pPr>
+        <w:keepNext/>
+        <w:spacing w:lineRule="auto" w:line="360" w:before="240" w:after="120"/>
+        <w:jc w:val="left"/>
+        <w:outlineLvl w:val="2"/>
+      </w:pPr>
+      <w:r>
+        <w:rPr>
+          <w:rFonts w:ascii="Times New Roman" w:hAnsi="Times New Roman" w:cs="Times New Roman"/>
+          <w:b/>
+          <w:i w:val="0"/>
+          <w:sz w:val="24"/>
+        </w:rPr>
+        <w:t>2.11.3 Retrieval Becomes Agentic</w:t>
+      </w:r>
+    </w:p>
+    <w:p>
+      <w:pPr>
+        <w:spacing w:lineRule="auto" w:line="360" w:after="120"/>
+        <w:ind w:firstLine="720"/>
+        <w:jc w:val="both"/>
+      </w:pPr>
+      <w:r>
+        <w:rPr>
+          <w:rFonts w:ascii="Times New Roman" w:hAnsi="Times New Roman" w:cs="Times New Roman"/>
+          <w:b w:val="0"/>
+          <w:i w:val="0"/>
+          <w:sz w:val="24"/>
+        </w:rPr>
+        <w:t>Retrieval-augmented generation absorbed the agent loop. The agentic RAG literature reframes retrieval as something an agent plans, executes iteratively, critiques, and repeats, rather than a single pre-generation lookup [41]. The empirical case for grounding strengthened as well: a ten-model npj Digital Medicine study of guideline-grounded RAG for preoperative fitness assessment found the best configuration exceeded human accuracy while eliminating observed hallucinations [42]. What retrieval is grounded *in* has barely moved, though. Guidelines, literature, and curated knowledge remain the default corpora; the patient's own timeline — prior labs, prior admissions, the trend of a vital sign — is still not treated as a retrieval target. The second gap identified in Section 2.10 therefore survives the agentic-RAG turn intact.</w:t>
+      </w:r>
+    </w:p>
+    <w:p>
+      <w:pPr>
+        <w:spacing w:lineRule="auto" w:line="360" w:after="120"/>
+        <w:ind w:firstLine="720"/>
+        <w:jc w:val="both"/>
+      </w:pPr>
+      <w:r>
+        <w:rPr>
+          <w:rFonts w:ascii="Times New Roman" w:hAnsi="Times New Roman" w:cs="Times New Roman"/>
+          <w:b w:val="0"/>
+          <w:i w:val="0"/>
+          <w:sz w:val="24"/>
+        </w:rPr>
+        <w:t>Late in the review window, a distinct line of work emerged that does treat the longitudinal record as the substrate, and it deserves separate weight because it is the nearest neighbor to what this thesis proposes. CliCARE compiles multi-year cancer records — routinely exceeding twenty thousand tokens — into patient-specific temporal knowledge graphs and aligns each trajectory against normative paths derived from clinical guidelines before generating recommendations [43]. Traj-CoA takes an agentic route to the same length problem: a chain of worker agents reads time-ordered chunks of a five-year multimodal record, depositing salient events into a shared timestamped memory that survives the chain's progressive summarization, applied to lung-cancer risk prediction [44]. Its successor TrajOnco scales that recipe, without any training, to early detection across fifteen cancer types on records drawn from more than thirty United States health systems [45]. TIMER approaches the problem from the data side, first showing that existing instruction resources cluster questions at the edges of patient timelines — over half of MedAlign's clinician-written questions target the final quarter — and then tuning models on timestamp-linked instruction pairs so that answers must justify claims with dated evidence [46]. RGAR makes the conceptual case explicit: it separates the patient record as a *factual* knowledge source from *conceptual* corpus knowledge and retrieves from both ends recurrently, arguing that mainstream medical RAG had simply ignored the record side of retrieval [47].</w:t>
+      </w:r>
+    </w:p>
+    <w:p>
+      <w:pPr>
+        <w:spacing w:lineRule="auto" w:line="360" w:after="120"/>
+        <w:ind w:firstLine="720"/>
+        <w:jc w:val="both"/>
+      </w:pPr>
+      <w:r>
+        <w:rPr>
+          <w:rFonts w:ascii="Times New Roman" w:hAnsi="Times New Roman" w:cs="Times New Roman"/>
+          <w:b w:val="0"/>
+          <w:i w:val="0"/>
+          <w:sz w:val="24"/>
+        </w:rPr>
+        <w:t>Read together, these systems establish that longitudinal grounding is feasible and valuable — and reading them critically shows what they do not yet do. CliCARE judges its recommendations with a holistic five-point rubric, with no per-claim check against the patient evidence and no audit-trail artifact [43]. Traj-CoA explains which events its agents found salient but not how those events become a prediction, and works without external knowledge grounding [44]; TrajOnco names per-decision verification of its generated evidence as open work and excludes clinical notes entirely [45]. TIMER improves temporal reasoning without verifying outputs — a hallucinated dated claim is penalized only statistically by the evaluation judge [46] — and RGAR, for all its factual-knowledge framing, ignores the temporal structure of the record and reports multiple-choice accuracy alone [47]. In every case the record serves prediction, summarization, or question answering as input to be compressed or aligned: none couples timestamp-addressable patient evidence to individual recommendations, verifies a recommendation against the evidence retrieved for it, or measures whether its trail is faithful. The line is also oncology- and question-answering-centric, so continuous deterioration monitoring on an ICU stream remains untouched. The second gap of Section 2.10 accordingly emerges from 2025–2026 sharpened rather than closed: the patient timeline has become a substrate, but not yet instrumented evidence.</w:t>
+      </w:r>
+    </w:p>
+    <w:p>
+      <w:pPr>
+        <w:keepNext/>
+        <w:spacing w:lineRule="auto" w:line="360" w:before="240" w:after="120"/>
+        <w:jc w:val="left"/>
+        <w:outlineLvl w:val="2"/>
+      </w:pPr>
+      <w:r>
+        <w:rPr>
+          <w:rFonts w:ascii="Times New Roman" w:hAnsi="Times New Roman" w:cs="Times New Roman"/>
+          <w:b/>
+          <w:i w:val="0"/>
+          <w:sz w:val="24"/>
+        </w:rPr>
+        <w:t>2.11.4 Trust, Safety, and the Arrival of Regulation</w:t>
+      </w:r>
+    </w:p>
+    <w:p>
+      <w:pPr>
+        <w:spacing w:lineRule="auto" w:line="360" w:after="120"/>
+        <w:ind w:firstLine="720"/>
+        <w:jc w:val="both"/>
+      </w:pPr>
+      <w:r>
+        <w:rPr>
+          <w:rFonts w:ascii="Times New Roman" w:hAnsi="Times New Roman" w:cs="Times New Roman"/>
+          <w:b w:val="0"/>
+          <w:i w:val="0"/>
+          <w:sz w:val="24"/>
+        </w:rPr>
+        <w:t>Trustworthiness stopped being a discussion section and became a research object. A large multi-institution study defines and taxonomizes medical hallucination, benchmarks eleven foundation models on hallucination-prone tasks, and documents through a multi-national clinician survey how often these errors already reach practice [48]. Work on uncertainty quantification argues that a clinical model must communicate calibrated confidence, not just an answer [49]. At the system level, the TrustAgent survey organizes threats and countermeasures across an agent's brain, memory, and tools [50], and MedSentry stress-tests medical multi-agent topologies with adversarial prompts, showing that architecture choice materially changes how far a poisoned agent can propagate harm [51]. The regulatory literature caught up in parallel: unconstrained general-purpose models demonstrably produce output meeting the criteria of a regulated medical device even when instructed not to [52]; deployment logs supply the demand side, with 5.9% of thirty thousand chat threads at one academic medical center — 98% of them from non-clinician staff — seeking medical knowledge from a general-purpose chatbot without verification or grounding, occasionally down to a patient-specific differential [53]; and a proposed framework for "unconfined non-deterministic clinical software" prescribes red-teaming, guardrails, agent moderation, and retrieval grounding as conditions of deployment [54]. Evidence on the human side is soberly mixed: a meta-analysis of clinician–LLM collaboration finds a suggestive but statistically fragile improvement over clinician-only workflows, with error rates that remain clinically significant [55]. Almost all of this work evaluates whether a system *sounds* safe; verification of a specific recommendation against the specific patient evidence, with a measured audit trail, remains rare — the third gap of Section 2.10.</w:t>
+      </w:r>
+    </w:p>
+    <w:p>
+      <w:pPr>
+        <w:keepNext/>
+        <w:spacing w:lineRule="auto" w:line="360" w:before="240" w:after="120"/>
+        <w:jc w:val="left"/>
+        <w:outlineLvl w:val="2"/>
+      </w:pPr>
+      <w:r>
+        <w:rPr>
+          <w:rFonts w:ascii="Times New Roman" w:hAnsi="Times New Roman" w:cs="Times New Roman"/>
+          <w:b/>
+          <w:i w:val="0"/>
+          <w:sz w:val="24"/>
+        </w:rPr>
+        <w:t>2.11.5 Benchmarks Move Toward the Bedside, Slowly</w:t>
+      </w:r>
+    </w:p>
+    <w:p>
+      <w:pPr>
+        <w:spacing w:lineRule="auto" w:line="360" w:after="120"/>
+        <w:ind w:firstLine="720"/>
+        <w:jc w:val="both"/>
+      </w:pPr>
+      <w:r>
+        <w:rPr>
+          <w:rFonts w:ascii="Times New Roman" w:hAnsi="Times New Roman" w:cs="Times New Roman"/>
+          <w:b w:val="0"/>
+          <w:i w:val="0"/>
+          <w:sz w:val="24"/>
+        </w:rPr>
+        <w:t>Evaluation practice improved visibly. MedAgentBench embeds agents in a FHIR-compliant virtual EHR with 300 physician-authored tasks over realistic patient profiles, and the best contemporary model completes only about seventy percent of them [56]. HealthBench grades 5,000 multi-turn health conversations against physician-written rubrics rather than multiple-choice keys [57]. MedHELM widens the lens beyond agents and chatbots: a clinician-validated taxonomy of 121 medical tasks, 37 benchmarks — a third built on real EHR data — and an LLM jury whose agreement with clinicians matches clinicians' agreement with each other, which exposed frontier models as strongest at note generation and weakest at quantitative record work while measuring neither calibration nor uncertainty, by its authors' own account [58]. A general survey of agent evaluation catalogs benchmarks for planning, tool use, memory, and reflection while flagging safety and cost as under-measured [59]. Closest to this thesis, a revisited MIMIC-IV benchmark shows text-based language models are competitive with tabular classifiers for mortality prediction [60], and the COMPOSER-LLM sepsis system crossed into prospective bedside deployment, using an LLM over unstructured notes to adjudicate high-uncertainty alerts and cut false alarms [61]. SmartAlert went furthest along this ladder: a randomized controlled pilot across 9,270 admissions in which an EHR-integrated stability predictor cut repetitive blood-count testing by 15% with no detected harm — the strongest deployment evidence yet that precision suppression of low-value actions is safe, and instructive precisely because it was achieved by a single-test, non-LLM classifier under a heavyweight governance process of silent prospective validation, clinician co-design, and formal model assessment [62]. The trajectory is right and the destination is not reached: virtual EHRs and rubric-graded conversations are still synthetic instruments, prospective deployments remain confined to single health systems and single tasks, and no current benchmark scores an agent on maintaining a grounded, evidence-linked model of one patient across days of real observations.</w:t>
+      </w:r>
+    </w:p>
+    <w:p>
+      <w:pPr>
+        <w:keepNext/>
+        <w:spacing w:lineRule="auto" w:line="360" w:before="240" w:after="120"/>
+        <w:jc w:val="left"/>
+        <w:outlineLvl w:val="2"/>
+      </w:pPr>
+      <w:r>
+        <w:rPr>
+          <w:rFonts w:ascii="Times New Roman" w:hAnsi="Times New Roman" w:cs="Times New Roman"/>
+          <w:b/>
+          <w:i w:val="0"/>
+          <w:sz w:val="24"/>
+        </w:rPr>
+        <w:t>2.11.6 Agent Infrastructure Standardizes</w:t>
+      </w:r>
+    </w:p>
+    <w:p>
+      <w:pPr>
+        <w:spacing w:lineRule="auto" w:line="360" w:after="120"/>
+        <w:ind w:firstLine="720"/>
+        <w:jc w:val="both"/>
+      </w:pPr>
+      <w:r>
+        <w:rPr>
+          <w:rFonts w:ascii="Times New Roman" w:hAnsi="Times New Roman" w:cs="Times New Roman"/>
+          <w:b w:val="0"/>
+          <w:i w:val="0"/>
+          <w:sz w:val="24"/>
+        </w:rPr>
+        <w:t>The plumbing consolidated. Surveys of interoperability protocols — MCP for tool access, A2A and ACP for agent-to-agent exchange, ANP for open networks — describe a stack that makes multi-agent systems composable across vendors [63], and taxonomies of collaboration mechanisms give design vocabulary for cooperation structures and coordination strategies [64]. Memory research matured similarly: a dedicated survey organizes construction, management, and retrieval of agent memory into a reusable taxonomy [65], and the foundation-agents survey assembles the full modular picture, from memory and world models to collective intelligence and safety [66]. For a hospital deployment this standardization matters practically — an EHR-facing monitoring agent should speak MCP rather than a bespoke API. But protocol standardization is orthogonal to clinical grounding: a well-connected agent can still recommend from thin air.</w:t>
+      </w:r>
+    </w:p>
+    <w:p>
+      <w:pPr>
+        <w:keepNext/>
+        <w:spacing w:lineRule="auto" w:line="360" w:before="240" w:after="120"/>
+        <w:jc w:val="left"/>
+        <w:outlineLvl w:val="2"/>
+      </w:pPr>
+      <w:r>
+        <w:rPr>
+          <w:rFonts w:ascii="Times New Roman" w:hAnsi="Times New Roman" w:cs="Times New Roman"/>
+          <w:b/>
+          <w:i w:val="0"/>
+          <w:sz w:val="24"/>
+        </w:rPr>
+        <w:t>2.11.7 Implications for the Proposed Framework</w:t>
+      </w:r>
+    </w:p>
+    <w:p>
+      <w:pPr>
+        <w:spacing w:lineRule="auto" w:line="360" w:after="120"/>
+        <w:ind w:firstLine="720"/>
+        <w:jc w:val="both"/>
+      </w:pPr>
+      <w:r>
+        <w:rPr>
+          <w:rFonts w:ascii="Times New Roman" w:hAnsi="Times New Roman" w:cs="Times New Roman"/>
+          <w:b w:val="0"/>
+          <w:i w:val="0"/>
+          <w:sz w:val="24"/>
+        </w:rPr>
+        <w:t>Three implications follow for this thesis. First, the framework's building blocks — tool-using agents, agentic retrieval, structured memory, multi-agent coordination — are now well-attested, which lowers integration risk and raises the bar for claiming novelty from integration alone; the novelty must come from what remains unmeasured, exactly as Section 2.10 argues. Second, the new evaluation instruments are usable scaffolding: MedAgentBench-style task framing, HealthBench-style rubric grading, and the revisited MIMIC-IV baselines [56], [57], [60] give the Chapter 4 evaluation design comparators that did not exist when this project began. Third, the safety literature now supplies concrete requirements — hallucination taxonomies to detect against [48], communicated uncertainty [49], moderation of inter-agent influence [51], and regulator-shaped guardrails [54], [52] — that the framework's verification gate and audit trail are designed to satisfy and, unlike most of the surveyed work, to measure. The field built the agent; it has not yet built the evidence that the agent can be trusted with a specific patient over time. That is the space this thesis occupies.</w:t>
+      </w:r>
+    </w:p>
+    <w:p>
+      <w:pPr>
+        <w:keepNext/>
+        <w:spacing w:lineRule="auto" w:line="360" w:before="240" w:after="120"/>
+        <w:jc w:val="left"/>
+        <w:outlineLvl w:val="1"/>
+      </w:pPr>
+      <w:r>
+        <w:rPr>
+          <w:rFonts w:ascii="Times New Roman" w:hAnsi="Times New Roman" w:cs="Times New Roman"/>
+          <w:b/>
+          <w:i w:val="0"/>
+          <w:sz w:val="28"/>
+        </w:rPr>
+        <w:t>2.12 Chapter Summary</w:t>
+      </w:r>
+    </w:p>
+    <w:p>
+      <w:pPr>
+        <w:spacing w:lineRule="auto" w:line="360" w:after="120"/>
+        <w:ind w:firstLine="720"/>
+        <w:jc w:val="both"/>
+      </w:pPr>
+      <w:r>
+        <w:rPr>
+          <w:rFonts w:ascii="Times New Roman" w:hAnsi="Times New Roman" w:cs="Times New Roman"/>
+          <w:b w:val="0"/>
+          <w:i w:val="0"/>
+          <w:sz w:val="24"/>
+        </w:rPr>
+        <w:t>This chapter reviewed the literature on Large Language Models, Agentic AI, Retrieval-Augmented Generation, multi-agent systems, and healthcare artificial intelligence, and read it critically to locate a defensible research gap. It traced the evolution of LLMs into LLM-based agents and then into Agentic AI, and examined the architectural components, memory, planning, reasoning, tool use, and multi-agent collaboration, that convert a passive model into a goal-directed system [3][4]. It analyzed influential agent frameworks, including ReAct, AutoGen, CAMEL, MetaGPT, Toolformer, Reflexion, Voyager, and Generative Agents, organizing their capabilities into a taxonomy and showing that each supplies a mechanism a clinical system needs while none supplies the whole [5][6][7][18][23][19][24][8]. Turning to the clinical domain, it reviewed artificial intelligence and Large Language Models in healthcare, clinical decision support, Retrieval-Augmented Generation, and trustworthy-AI mechanisms, examining systems such as Med-PaLM, Med-PaLM 2, Med-PaLM M, Clinical Camel, MedAgents, MedRAG, Agent Hospital, and EHRAgent [2][26][25][13][10][11][12][33]. Section 2.11 then tested these findings against the 2025–2026 literature, which shows the field consolidating agent infrastructure — tool use, agentic retrieval, structured memory, interoperability protocols — without closing the three gaps identified in Section 2.10.</w:t>
+      </w:r>
+    </w:p>
+    <w:p>
+      <w:pPr>
+        <w:spacing w:lineRule="auto" w:line="360" w:after="120"/>
+        <w:ind w:firstLine="720"/>
+        <w:jc w:val="both"/>
+      </w:pPr>
+      <w:r>
+        <w:rPr>
+          <w:rFonts w:ascii="Times New Roman" w:hAnsi="Times New Roman" w:cs="Times New Roman"/>
+          <w:b w:val="0"/>
+          <w:i w:val="0"/>
+          <w:sz w:val="24"/>
+        </w:rPr>
         <w:t>The recurring finding is that existing research has advanced the individual capabilities, autonomous reasoning, knowledge retrieval, and collaborative agents, while leaving their integration under clinical supervision unrealized. Current approaches are evaluated largely on static examination benchmarks rather than longitudinal ICU records, ground retrieval in general knowledge rather than the specific patient's timeline, and rarely treat verification and faithful auditability as measured components. These gaps motivate the proposed Agentic AI Framework for Intelligent Patient Monitoring and Clinical Decision Support, which grounds retrieval in the patient's longitudinal EHR timeline, coordinates specialized agents with persistent memory and ReAct-based reasoning, and embeds a verification gate and human-in-the-loop validation, all grounded in the MIMIC-IV dataset [14][5][15]. The findings established here provide the theoretical and technical foundation for the research methodology and proposed architecture presented in the next chapter.</w:t>
       </w:r>
     </w:p>
@@ -4289,7 +7620,7 @@
           <w:i w:val="0"/>
           <w:sz w:val="24"/>
         </w:rPr>
-        <w:t>Z. Xi et al., "The rise and potential of large language model based agents: A survey," arXiv:2309.07864, 2023.</w:t>
+        <w:t>Z. Xi et al., "The rise and potential of large language model based agents: A survey," Sci. China Inf. Sci., vol. 68, no. 2, 2025.</w:t>
       </w:r>
     </w:p>
     <w:p>
@@ -4889,7 +8220,7 @@
           <w:i w:val="0"/>
           <w:sz w:val="24"/>
         </w:rPr>
-        <w:t>T. Tu et al., "Towards conversational diagnostic AI," Nature, 2025.</w:t>
+        <w:t>T. Tu et al., "Towards conversational diagnostic artificial intelligence," Nature, vol. 642, no. 8067, pp. 442-450, 2025.</w:t>
       </w:r>
     </w:p>
     <w:p>
@@ -5039,11 +8370,836 @@
           <w:i w:val="0"/>
           <w:sz w:val="24"/>
         </w:rPr>
-        <w:t>W. Shi et al., "EHRAgent: Code empowers large language models for few-shot complex tabular reasoning on electronic health records," in Proc. EMNLP, 2024.</w:t>
+        <w:t>W. Shi et al., "EHRAgent: Code empowers large language models for few-shot complex tabular reasoning on electronic health records," in Proc. EMNLP, 2024, pp. 22315-22339.</w:t>
+      </w:r>
+    </w:p>
+    <w:p>
+      <w:pPr>
+        <w:spacing w:lineRule="auto" w:line="360" w:after="120"/>
+        <w:ind w:left="720" w:hanging="720"/>
+        <w:jc w:val="both"/>
+      </w:pPr>
+      <w:r>
+        <w:rPr>
+          <w:rFonts w:ascii="Times New Roman" w:hAnsi="Times New Roman" w:cs="Times New Roman"/>
+          <w:b w:val="0"/>
+          <w:i w:val="0"/>
+          <w:sz w:val="24"/>
+        </w:rPr>
+        <w:t xml:space="preserve">[34]  </w:t>
+      </w:r>
+      <w:r>
+        <w:rPr>
+          <w:rFonts w:ascii="Times New Roman" w:hAnsi="Times New Roman" w:cs="Times New Roman"/>
+          <w:b w:val="0"/>
+          <w:i w:val="0"/>
+          <w:sz w:val="24"/>
+        </w:rPr>
+        <w:t>S. Gao, R. Zhu, Z. Kong et al., "TxAgent: An AI agent for therapeutic reasoning across a universe of tools," arXiv:2503.10970, 2025.</w:t>
+      </w:r>
+    </w:p>
+    <w:p>
+      <w:pPr>
+        <w:spacing w:lineRule="auto" w:line="360" w:after="120"/>
+        <w:ind w:left="720" w:hanging="720"/>
+        <w:jc w:val="both"/>
+      </w:pPr>
+      <w:r>
+        <w:rPr>
+          <w:rFonts w:ascii="Times New Roman" w:hAnsi="Times New Roman" w:cs="Times New Roman"/>
+          <w:b w:val="0"/>
+          <w:i w:val="0"/>
+          <w:sz w:val="24"/>
+        </w:rPr>
+        <w:t xml:space="preserve">[35]  </w:t>
+      </w:r>
+      <w:r>
+        <w:rPr>
+          <w:rFonts w:ascii="Times New Roman" w:hAnsi="Times New Roman" w:cs="Times New Roman"/>
+          <w:b w:val="0"/>
+          <w:i w:val="0"/>
+          <w:sz w:val="24"/>
+        </w:rPr>
+        <w:t>F. Liu, J. Wu, H. Zhou et al., "RiskAgent: Synergizing language models with validated tools for evidence-based risk prediction," arXiv:2503.03802, 2025.</w:t>
+      </w:r>
+    </w:p>
+    <w:p>
+      <w:pPr>
+        <w:spacing w:lineRule="auto" w:line="360" w:after="120"/>
+        <w:ind w:left="720" w:hanging="720"/>
+        <w:jc w:val="both"/>
+      </w:pPr>
+      <w:r>
+        <w:rPr>
+          <w:rFonts w:ascii="Times New Roman" w:hAnsi="Times New Roman" w:cs="Times New Roman"/>
+          <w:b w:val="0"/>
+          <w:i w:val="0"/>
+          <w:sz w:val="24"/>
+        </w:rPr>
+        <w:t xml:space="preserve">[36]  </w:t>
+      </w:r>
+      <w:r>
+        <w:rPr>
+          <w:rFonts w:ascii="Times New Roman" w:hAnsi="Times New Roman" w:cs="Times New Roman"/>
+          <w:b w:val="0"/>
+          <w:i w:val="0"/>
+          <w:sz w:val="24"/>
+        </w:rPr>
+        <w:t>A. Fallahpour, J. Ma, A. Munim et al., "MedRAX: Medical reasoning agent for chest X-ray," in Proc. 42nd Int. Conf. Mach. Learn. (ICML), PMLR, vol. 267, 2025, pp. 15661–15676.</w:t>
+      </w:r>
+    </w:p>
+    <w:p>
+      <w:pPr>
+        <w:spacing w:lineRule="auto" w:line="360" w:after="120"/>
+        <w:ind w:left="720" w:hanging="720"/>
+        <w:jc w:val="both"/>
+      </w:pPr>
+      <w:r>
+        <w:rPr>
+          <w:rFonts w:ascii="Times New Roman" w:hAnsi="Times New Roman" w:cs="Times New Roman"/>
+          <w:b w:val="0"/>
+          <w:i w:val="0"/>
+          <w:sz w:val="24"/>
+        </w:rPr>
+        <w:t xml:space="preserve">[37]  </w:t>
+      </w:r>
+      <w:r>
+        <w:rPr>
+          <w:rFonts w:ascii="Times New Roman" w:hAnsi="Times New Roman" w:cs="Times New Roman"/>
+          <w:b w:val="0"/>
+          <w:i w:val="0"/>
+          <w:sz w:val="24"/>
+        </w:rPr>
+        <w:t>Y. Feng, J. Wang, L. Zhou et al., "DoctorAgent-RL: Real-world doctor agent with proactive consultation through multi-agent reinforcement learning," arXiv:2505.19630, 2025.</w:t>
+      </w:r>
+    </w:p>
+    <w:p>
+      <w:pPr>
+        <w:spacing w:lineRule="auto" w:line="360" w:after="120"/>
+        <w:ind w:left="720" w:hanging="720"/>
+        <w:jc w:val="both"/>
+      </w:pPr>
+      <w:r>
+        <w:rPr>
+          <w:rFonts w:ascii="Times New Roman" w:hAnsi="Times New Roman" w:cs="Times New Roman"/>
+          <w:b w:val="0"/>
+          <w:i w:val="0"/>
+          <w:sz w:val="24"/>
+        </w:rPr>
+        <w:t xml:space="preserve">[38]  </w:t>
+      </w:r>
+      <w:r>
+        <w:rPr>
+          <w:rFonts w:ascii="Times New Roman" w:hAnsi="Times New Roman" w:cs="Times New Roman"/>
+          <w:b w:val="0"/>
+          <w:i w:val="0"/>
+          <w:sz w:val="24"/>
+        </w:rPr>
+        <w:t>W. Wang, Z. Ma, Z. Wang et al., "A survey of LLM-based agents in medicine: How far are we from Baymax?" in Findings Assoc. Comput. Linguist. (ACL Findings), 2025.</w:t>
+      </w:r>
+    </w:p>
+    <w:p>
+      <w:pPr>
+        <w:spacing w:lineRule="auto" w:line="360" w:after="120"/>
+        <w:ind w:left="720" w:hanging="720"/>
+        <w:jc w:val="both"/>
+      </w:pPr>
+      <w:r>
+        <w:rPr>
+          <w:rFonts w:ascii="Times New Roman" w:hAnsi="Times New Roman" w:cs="Times New Roman"/>
+          <w:b w:val="0"/>
+          <w:i w:val="0"/>
+          <w:sz w:val="24"/>
+        </w:rPr>
+        <w:t xml:space="preserve">[39]  </w:t>
+      </w:r>
+      <w:r>
+        <w:rPr>
+          <w:rFonts w:ascii="Times New Roman" w:hAnsi="Times New Roman" w:cs="Times New Roman"/>
+          <w:b w:val="0"/>
+          <w:i w:val="0"/>
+          <w:sz w:val="24"/>
+        </w:rPr>
+        <w:t>A. Palepu, V. Lievin, W.-H. Weng et al., "Towards conversational AI for disease management," arXiv:2503.06074, 2025.</w:t>
+      </w:r>
+    </w:p>
+    <w:p>
+      <w:pPr>
+        <w:spacing w:lineRule="auto" w:line="360" w:after="120"/>
+        <w:ind w:left="720" w:hanging="720"/>
+        <w:jc w:val="both"/>
+      </w:pPr>
+      <w:r>
+        <w:rPr>
+          <w:rFonts w:ascii="Times New Roman" w:hAnsi="Times New Roman" w:cs="Times New Roman"/>
+          <w:b w:val="0"/>
+          <w:i w:val="0"/>
+          <w:sz w:val="24"/>
+        </w:rPr>
+        <w:t xml:space="preserve">[40]  </w:t>
+      </w:r>
+      <w:r>
+        <w:rPr>
+          <w:rFonts w:ascii="Times New Roman" w:hAnsi="Times New Roman" w:cs="Times New Roman"/>
+          <w:b w:val="0"/>
+          <w:i w:val="0"/>
+          <w:sz w:val="24"/>
+        </w:rPr>
+        <w:t>K. Saab, J. Freyberg, C. Park et al., "Advancing conversational diagnostic AI with multimodal reasoning," arXiv:2505.04653, 2025.</w:t>
+      </w:r>
+    </w:p>
+    <w:p>
+      <w:pPr>
+        <w:spacing w:lineRule="auto" w:line="360" w:after="120"/>
+        <w:ind w:left="720" w:hanging="720"/>
+        <w:jc w:val="both"/>
+      </w:pPr>
+      <w:r>
+        <w:rPr>
+          <w:rFonts w:ascii="Times New Roman" w:hAnsi="Times New Roman" w:cs="Times New Roman"/>
+          <w:b w:val="0"/>
+          <w:i w:val="0"/>
+          <w:sz w:val="24"/>
+        </w:rPr>
+        <w:t xml:space="preserve">[41]  </w:t>
+      </w:r>
+      <w:r>
+        <w:rPr>
+          <w:rFonts w:ascii="Times New Roman" w:hAnsi="Times New Roman" w:cs="Times New Roman"/>
+          <w:b w:val="0"/>
+          <w:i w:val="0"/>
+          <w:sz w:val="24"/>
+        </w:rPr>
+        <w:t>A. Singh, A. Ehtesham, S. Kumar et al., "Agentic retrieval-augmented generation: A survey on agentic RAG," arXiv:2501.09136, 2025.</w:t>
+      </w:r>
+    </w:p>
+    <w:p>
+      <w:pPr>
+        <w:spacing w:lineRule="auto" w:line="360" w:after="120"/>
+        <w:ind w:left="720" w:hanging="720"/>
+        <w:jc w:val="both"/>
+      </w:pPr>
+      <w:r>
+        <w:rPr>
+          <w:rFonts w:ascii="Times New Roman" w:hAnsi="Times New Roman" w:cs="Times New Roman"/>
+          <w:b w:val="0"/>
+          <w:i w:val="0"/>
+          <w:sz w:val="24"/>
+        </w:rPr>
+        <w:t xml:space="preserve">[42]  </w:t>
+      </w:r>
+      <w:r>
+        <w:rPr>
+          <w:rFonts w:ascii="Times New Roman" w:hAnsi="Times New Roman" w:cs="Times New Roman"/>
+          <w:b w:val="0"/>
+          <w:i w:val="0"/>
+          <w:sz w:val="24"/>
+        </w:rPr>
+        <w:t>Y. H. Ke, L. Jin, K. Elangovan et al., "Retrieval augmented generation for 10 large language models and its generalizability in assessing medical fitness," npj Digit. Med., 2025.</w:t>
+      </w:r>
+    </w:p>
+    <w:p>
+      <w:pPr>
+        <w:spacing w:lineRule="auto" w:line="360" w:after="120"/>
+        <w:ind w:left="720" w:hanging="720"/>
+        <w:jc w:val="both"/>
+      </w:pPr>
+      <w:r>
+        <w:rPr>
+          <w:rFonts w:ascii="Times New Roman" w:hAnsi="Times New Roman" w:cs="Times New Roman"/>
+          <w:b w:val="0"/>
+          <w:i w:val="0"/>
+          <w:sz w:val="24"/>
+        </w:rPr>
+        <w:t xml:space="preserve">[43]  </w:t>
+      </w:r>
+      <w:r>
+        <w:rPr>
+          <w:rFonts w:ascii="Times New Roman" w:hAnsi="Times New Roman" w:cs="Times New Roman"/>
+          <w:b w:val="0"/>
+          <w:i w:val="0"/>
+          <w:sz w:val="24"/>
+        </w:rPr>
+        <w:t>D. Li, J. Liang, W. Li et al., "CliCARE: Grounding large language models in clinical guidelines for decision support over longitudinal cancer electronic health records," in Proc. AAAI Conf. Artif. Intell., vol. 40, no. 37, 2026, pp. 31554–31562.</w:t>
+      </w:r>
+    </w:p>
+    <w:p>
+      <w:pPr>
+        <w:spacing w:lineRule="auto" w:line="360" w:after="120"/>
+        <w:ind w:left="720" w:hanging="720"/>
+        <w:jc w:val="both"/>
+      </w:pPr>
+      <w:r>
+        <w:rPr>
+          <w:rFonts w:ascii="Times New Roman" w:hAnsi="Times New Roman" w:cs="Times New Roman"/>
+          <w:b w:val="0"/>
+          <w:i w:val="0"/>
+          <w:sz w:val="24"/>
+        </w:rPr>
+        <w:t xml:space="preserve">[44]  </w:t>
+      </w:r>
+      <w:r>
+        <w:rPr>
+          <w:rFonts w:ascii="Times New Roman" w:hAnsi="Times New Roman" w:cs="Times New Roman"/>
+          <w:b w:val="0"/>
+          <w:i w:val="0"/>
+          <w:sz w:val="24"/>
+        </w:rPr>
+        <w:t>S. Zeng, Y. Fu, S. Zhou et al., "Traj-CoA: Patient trajectory modeling via chain-of-agents for lung cancer risk prediction," in NeurIPS GenAI4Health Workshop, 2025. arXiv:2510.10454.</w:t>
+      </w:r>
+    </w:p>
+    <w:p>
+      <w:pPr>
+        <w:spacing w:lineRule="auto" w:line="360" w:after="120"/>
+        <w:ind w:left="720" w:hanging="720"/>
+        <w:jc w:val="both"/>
+      </w:pPr>
+      <w:r>
+        <w:rPr>
+          <w:rFonts w:ascii="Times New Roman" w:hAnsi="Times New Roman" w:cs="Times New Roman"/>
+          <w:b w:val="0"/>
+          <w:i w:val="0"/>
+          <w:sz w:val="24"/>
+        </w:rPr>
+        <w:t xml:space="preserve">[45]  </w:t>
+      </w:r>
+      <w:r>
+        <w:rPr>
+          <w:rFonts w:ascii="Times New Roman" w:hAnsi="Times New Roman" w:cs="Times New Roman"/>
+          <w:b w:val="0"/>
+          <w:i w:val="0"/>
+          <w:sz w:val="24"/>
+        </w:rPr>
+        <w:t>S. Zeng, Y. W. Kim, W. Lau et al., "TrajOnco: A multi-agent framework for temporal reasoning over longitudinal EHR for multi-cancer early detection," arXiv:2604.10386, 2026.</w:t>
+      </w:r>
+    </w:p>
+    <w:p>
+      <w:pPr>
+        <w:spacing w:lineRule="auto" w:line="360" w:after="120"/>
+        <w:ind w:left="720" w:hanging="720"/>
+        <w:jc w:val="both"/>
+      </w:pPr>
+      <w:r>
+        <w:rPr>
+          <w:rFonts w:ascii="Times New Roman" w:hAnsi="Times New Roman" w:cs="Times New Roman"/>
+          <w:b w:val="0"/>
+          <w:i w:val="0"/>
+          <w:sz w:val="24"/>
+        </w:rPr>
+        <w:t xml:space="preserve">[46]  </w:t>
+      </w:r>
+      <w:r>
+        <w:rPr>
+          <w:rFonts w:ascii="Times New Roman" w:hAnsi="Times New Roman" w:cs="Times New Roman"/>
+          <w:b w:val="0"/>
+          <w:i w:val="0"/>
+          <w:sz w:val="24"/>
+        </w:rPr>
+        <w:t>H. Cui, A. Unell, B. Chen et al., "TIMER: Temporal instruction modeling and evaluation for longitudinal clinical records," npj Digit. Med., vol. 8, p. 577, 2025.</w:t>
+      </w:r>
+    </w:p>
+    <w:p>
+      <w:pPr>
+        <w:spacing w:lineRule="auto" w:line="360" w:after="120"/>
+        <w:ind w:left="720" w:hanging="720"/>
+        <w:jc w:val="both"/>
+      </w:pPr>
+      <w:r>
+        <w:rPr>
+          <w:rFonts w:ascii="Times New Roman" w:hAnsi="Times New Roman" w:cs="Times New Roman"/>
+          <w:b w:val="0"/>
+          <w:i w:val="0"/>
+          <w:sz w:val="24"/>
+        </w:rPr>
+        <w:t xml:space="preserve">[47]  </w:t>
+      </w:r>
+      <w:r>
+        <w:rPr>
+          <w:rFonts w:ascii="Times New Roman" w:hAnsi="Times New Roman" w:cs="Times New Roman"/>
+          <w:b w:val="0"/>
+          <w:i w:val="0"/>
+          <w:sz w:val="24"/>
+        </w:rPr>
+        <w:t>S. Liang, L. Zhang, H. Zhu et al., "RGAR: Recurrence generation-augmented retrieval for factual-aware medical question answering," in Findings Assoc. Comput. Linguist. (EMNLP Findings), Suzhou, China, 2025, pp. 4006–4033.</w:t>
+      </w:r>
+    </w:p>
+    <w:p>
+      <w:pPr>
+        <w:spacing w:lineRule="auto" w:line="360" w:after="120"/>
+        <w:ind w:left="720" w:hanging="720"/>
+        <w:jc w:val="both"/>
+      </w:pPr>
+      <w:r>
+        <w:rPr>
+          <w:rFonts w:ascii="Times New Roman" w:hAnsi="Times New Roman" w:cs="Times New Roman"/>
+          <w:b w:val="0"/>
+          <w:i w:val="0"/>
+          <w:sz w:val="24"/>
+        </w:rPr>
+        <w:t xml:space="preserve">[48]  </w:t>
+      </w:r>
+      <w:r>
+        <w:rPr>
+          <w:rFonts w:ascii="Times New Roman" w:hAnsi="Times New Roman" w:cs="Times New Roman"/>
+          <w:b w:val="0"/>
+          <w:i w:val="0"/>
+          <w:sz w:val="24"/>
+        </w:rPr>
+        <w:t>Y. Kim, H. Jeong, S. Chen et al., "Medical hallucinations in foundation models and their impact on healthcare," arXiv:2503.05777, 2025.</w:t>
+      </w:r>
+    </w:p>
+    <w:p>
+      <w:pPr>
+        <w:spacing w:lineRule="auto" w:line="360" w:after="120"/>
+        <w:ind w:left="720" w:hanging="720"/>
+        <w:jc w:val="both"/>
+      </w:pPr>
+      <w:r>
+        <w:rPr>
+          <w:rFonts w:ascii="Times New Roman" w:hAnsi="Times New Roman" w:cs="Times New Roman"/>
+          <w:b w:val="0"/>
+          <w:i w:val="0"/>
+          <w:sz w:val="24"/>
+        </w:rPr>
+        <w:t xml:space="preserve">[49]  </w:t>
+      </w:r>
+      <w:r>
+        <w:rPr>
+          <w:rFonts w:ascii="Times New Roman" w:hAnsi="Times New Roman" w:cs="Times New Roman"/>
+          <w:b w:val="0"/>
+          <w:i w:val="0"/>
+          <w:sz w:val="24"/>
+        </w:rPr>
+        <w:t>Z. Atf, S. A. A. Safavi-Naini, P. R. Lewis et al., "The challenge of uncertainty quantification of large language models in medicine," arXiv:2504.05278, 2025.</w:t>
+      </w:r>
+    </w:p>
+    <w:p>
+      <w:pPr>
+        <w:spacing w:lineRule="auto" w:line="360" w:after="120"/>
+        <w:ind w:left="720" w:hanging="720"/>
+        <w:jc w:val="both"/>
+      </w:pPr>
+      <w:r>
+        <w:rPr>
+          <w:rFonts w:ascii="Times New Roman" w:hAnsi="Times New Roman" w:cs="Times New Roman"/>
+          <w:b w:val="0"/>
+          <w:i w:val="0"/>
+          <w:sz w:val="24"/>
+        </w:rPr>
+        <w:t xml:space="preserve">[50]  </w:t>
+      </w:r>
+      <w:r>
+        <w:rPr>
+          <w:rFonts w:ascii="Times New Roman" w:hAnsi="Times New Roman" w:cs="Times New Roman"/>
+          <w:b w:val="0"/>
+          <w:i w:val="0"/>
+          <w:sz w:val="24"/>
+        </w:rPr>
+        <w:t>M. Yu, F. Meng, X. Zhou et al., "A survey on trustworthy LLM agents: Threats and countermeasures," in Proc. 31st ACM SIGKDD Conf. Knowl. Discovery Data Mining (KDD), 2025, pp. 6216–6226.</w:t>
+      </w:r>
+    </w:p>
+    <w:p>
+      <w:pPr>
+        <w:spacing w:lineRule="auto" w:line="360" w:after="120"/>
+        <w:ind w:left="720" w:hanging="720"/>
+        <w:jc w:val="both"/>
+      </w:pPr>
+      <w:r>
+        <w:rPr>
+          <w:rFonts w:ascii="Times New Roman" w:hAnsi="Times New Roman" w:cs="Times New Roman"/>
+          <w:b w:val="0"/>
+          <w:i w:val="0"/>
+          <w:sz w:val="24"/>
+        </w:rPr>
+        <w:t xml:space="preserve">[51]  </w:t>
+      </w:r>
+      <w:r>
+        <w:rPr>
+          <w:rFonts w:ascii="Times New Roman" w:hAnsi="Times New Roman" w:cs="Times New Roman"/>
+          <w:b w:val="0"/>
+          <w:i w:val="0"/>
+          <w:sz w:val="24"/>
+        </w:rPr>
+        <w:t>K. Chen, T. Zhen, H. Wang et al., "MedSentry: Understanding and mitigating safety risks in medical LLM multi-agent systems," arXiv:2505.20824, 2025.</w:t>
+      </w:r>
+    </w:p>
+    <w:p>
+      <w:pPr>
+        <w:spacing w:lineRule="auto" w:line="360" w:after="120"/>
+        <w:ind w:left="720" w:hanging="720"/>
+        <w:jc w:val="both"/>
+      </w:pPr>
+      <w:r>
+        <w:rPr>
+          <w:rFonts w:ascii="Times New Roman" w:hAnsi="Times New Roman" w:cs="Times New Roman"/>
+          <w:b w:val="0"/>
+          <w:i w:val="0"/>
+          <w:sz w:val="24"/>
+        </w:rPr>
+        <w:t xml:space="preserve">[52]  </w:t>
+      </w:r>
+      <w:r>
+        <w:rPr>
+          <w:rFonts w:ascii="Times New Roman" w:hAnsi="Times New Roman" w:cs="Times New Roman"/>
+          <w:b w:val="0"/>
+          <w:i w:val="0"/>
+          <w:sz w:val="24"/>
+        </w:rPr>
+        <w:t>G. E. Weissman, T. Mankowitz, G. P. Kanter et al., "Unregulated large language models produce medical device-like output," npj Digit. Med., 2025.</w:t>
+      </w:r>
+    </w:p>
+    <w:p>
+      <w:pPr>
+        <w:spacing w:lineRule="auto" w:line="360" w:after="120"/>
+        <w:ind w:left="720" w:hanging="720"/>
+        <w:jc w:val="both"/>
+      </w:pPr>
+      <w:r>
+        <w:rPr>
+          <w:rFonts w:ascii="Times New Roman" w:hAnsi="Times New Roman" w:cs="Times New Roman"/>
+          <w:b w:val="0"/>
+          <w:i w:val="0"/>
+          <w:sz w:val="24"/>
+        </w:rPr>
+        <w:t xml:space="preserve">[53]  </w:t>
+      </w:r>
+      <w:r>
+        <w:rPr>
+          <w:rFonts w:ascii="Times New Roman" w:hAnsi="Times New Roman" w:cs="Times New Roman"/>
+          <w:b w:val="0"/>
+          <w:i w:val="0"/>
+          <w:sz w:val="24"/>
+        </w:rPr>
+        <w:t>K. C. Black et al., "Uses of generative AI by non-clinician staff at an academic medical center," npj Health Syst., vol. 3, art. 13, 2026.</w:t>
+      </w:r>
+    </w:p>
+    <w:p>
+      <w:pPr>
+        <w:spacing w:lineRule="auto" w:line="360" w:after="120"/>
+        <w:ind w:left="720" w:hanging="720"/>
+        <w:jc w:val="both"/>
+      </w:pPr>
+      <w:r>
+        <w:rPr>
+          <w:rFonts w:ascii="Times New Roman" w:hAnsi="Times New Roman" w:cs="Times New Roman"/>
+          <w:b w:val="0"/>
+          <w:i w:val="0"/>
+          <w:sz w:val="24"/>
+        </w:rPr>
+        <w:t xml:space="preserve">[54]  </w:t>
+      </w:r>
+      <w:r>
+        <w:rPr>
+          <w:rFonts w:ascii="Times New Roman" w:hAnsi="Times New Roman" w:cs="Times New Roman"/>
+          <w:b w:val="0"/>
+          <w:i w:val="0"/>
+          <w:sz w:val="24"/>
+        </w:rPr>
+        <w:t>C. Tan, D. V. Gunasekeran, C. O. Low et al., "Regulation of clinical artificial intelligence (AI) in the age of agents: Unconfined non-deterministic clinical software (UNDCS) systems for healthcare," npj Digit. Med., 2026.</w:t>
+      </w:r>
+    </w:p>
+    <w:p>
+      <w:pPr>
+        <w:spacing w:lineRule="auto" w:line="360" w:after="120"/>
+        <w:ind w:left="720" w:hanging="720"/>
+        <w:jc w:val="both"/>
+      </w:pPr>
+      <w:r>
+        <w:rPr>
+          <w:rFonts w:ascii="Times New Roman" w:hAnsi="Times New Roman" w:cs="Times New Roman"/>
+          <w:b w:val="0"/>
+          <w:i w:val="0"/>
+          <w:sz w:val="24"/>
+        </w:rPr>
+        <w:t xml:space="preserve">[55]  </w:t>
+      </w:r>
+      <w:r>
+        <w:rPr>
+          <w:rFonts w:ascii="Times New Roman" w:hAnsi="Times New Roman" w:cs="Times New Roman"/>
+          <w:b w:val="0"/>
+          <w:i w:val="0"/>
+          <w:sz w:val="24"/>
+        </w:rPr>
+        <w:t>G. Wang, K. Zhang, J. Jiang et al., "Human-large language model collaboration in clinical medicine: A systematic review and meta-analysis," npj Digit. Med., 2026.</w:t>
+      </w:r>
+    </w:p>
+    <w:p>
+      <w:pPr>
+        <w:spacing w:lineRule="auto" w:line="360" w:after="120"/>
+        <w:ind w:left="720" w:hanging="720"/>
+        <w:jc w:val="both"/>
+      </w:pPr>
+      <w:r>
+        <w:rPr>
+          <w:rFonts w:ascii="Times New Roman" w:hAnsi="Times New Roman" w:cs="Times New Roman"/>
+          <w:b w:val="0"/>
+          <w:i w:val="0"/>
+          <w:sz w:val="24"/>
+        </w:rPr>
+        <w:t xml:space="preserve">[56]  </w:t>
+      </w:r>
+      <w:r>
+        <w:rPr>
+          <w:rFonts w:ascii="Times New Roman" w:hAnsi="Times New Roman" w:cs="Times New Roman"/>
+          <w:b w:val="0"/>
+          <w:i w:val="0"/>
+          <w:sz w:val="24"/>
+        </w:rPr>
+        <w:t>Y. Jiang, K. C. Black, G. Geng et al., "MedAgentBench: A virtual EHR environment to benchmark medical LLM agents," NEJM AI, vol. 2, no. 9, 2025.</w:t>
+      </w:r>
+    </w:p>
+    <w:p>
+      <w:pPr>
+        <w:spacing w:lineRule="auto" w:line="360" w:after="120"/>
+        <w:ind w:left="720" w:hanging="720"/>
+        <w:jc w:val="both"/>
+      </w:pPr>
+      <w:r>
+        <w:rPr>
+          <w:rFonts w:ascii="Times New Roman" w:hAnsi="Times New Roman" w:cs="Times New Roman"/>
+          <w:b w:val="0"/>
+          <w:i w:val="0"/>
+          <w:sz w:val="24"/>
+        </w:rPr>
+        <w:t xml:space="preserve">[57]  </w:t>
+      </w:r>
+      <w:r>
+        <w:rPr>
+          <w:rFonts w:ascii="Times New Roman" w:hAnsi="Times New Roman" w:cs="Times New Roman"/>
+          <w:b w:val="0"/>
+          <w:i w:val="0"/>
+          <w:sz w:val="24"/>
+        </w:rPr>
+        <w:t>R. K. Arora, J. Wei, R. Soskin Hicks et al., "HealthBench: Evaluating large language models towards improved human health," arXiv:2505.08775, 2025.</w:t>
+      </w:r>
+    </w:p>
+    <w:p>
+      <w:pPr>
+        <w:spacing w:lineRule="auto" w:line="360" w:after="120"/>
+        <w:ind w:left="720" w:hanging="720"/>
+        <w:jc w:val="both"/>
+      </w:pPr>
+      <w:r>
+        <w:rPr>
+          <w:rFonts w:ascii="Times New Roman" w:hAnsi="Times New Roman" w:cs="Times New Roman"/>
+          <w:b w:val="0"/>
+          <w:i w:val="0"/>
+          <w:sz w:val="24"/>
+        </w:rPr>
+        <w:t xml:space="preserve">[58]  </w:t>
+      </w:r>
+      <w:r>
+        <w:rPr>
+          <w:rFonts w:ascii="Times New Roman" w:hAnsi="Times New Roman" w:cs="Times New Roman"/>
+          <w:b w:val="0"/>
+          <w:i w:val="0"/>
+          <w:sz w:val="24"/>
+        </w:rPr>
+        <w:t>S. Bedi et al., "Holistic evaluation of large language models for medical tasks with MedHELM," Nat. Med., vol. 32, no. 3, pp. 943-951, 2026.</w:t>
+      </w:r>
+    </w:p>
+    <w:p>
+      <w:pPr>
+        <w:spacing w:lineRule="auto" w:line="360" w:after="120"/>
+        <w:ind w:left="720" w:hanging="720"/>
+        <w:jc w:val="both"/>
+      </w:pPr>
+      <w:r>
+        <w:rPr>
+          <w:rFonts w:ascii="Times New Roman" w:hAnsi="Times New Roman" w:cs="Times New Roman"/>
+          <w:b w:val="0"/>
+          <w:i w:val="0"/>
+          <w:sz w:val="24"/>
+        </w:rPr>
+        <w:t xml:space="preserve">[59]  </w:t>
+      </w:r>
+      <w:r>
+        <w:rPr>
+          <w:rFonts w:ascii="Times New Roman" w:hAnsi="Times New Roman" w:cs="Times New Roman"/>
+          <w:b w:val="0"/>
+          <w:i w:val="0"/>
+          <w:sz w:val="24"/>
+        </w:rPr>
+        <w:t>A. Yehudai, L. Eden, A. Li et al., "A survey on evaluation of LLM-based agents," in Findings Assoc. Comput. Linguist. (ACL Findings), 2026, pp. 26690-26714.</w:t>
+      </w:r>
+    </w:p>
+    <w:p>
+      <w:pPr>
+        <w:spacing w:lineRule="auto" w:line="360" w:after="120"/>
+        <w:ind w:left="720" w:hanging="720"/>
+        <w:jc w:val="both"/>
+      </w:pPr>
+      <w:r>
+        <w:rPr>
+          <w:rFonts w:ascii="Times New Roman" w:hAnsi="Times New Roman" w:cs="Times New Roman"/>
+          <w:b w:val="0"/>
+          <w:i w:val="0"/>
+          <w:sz w:val="24"/>
+        </w:rPr>
+        <w:t xml:space="preserve">[60]  </w:t>
+      </w:r>
+      <w:r>
+        <w:rPr>
+          <w:rFonts w:ascii="Times New Roman" w:hAnsi="Times New Roman" w:cs="Times New Roman"/>
+          <w:b w:val="0"/>
+          <w:i w:val="0"/>
+          <w:sz w:val="24"/>
+        </w:rPr>
+        <w:t>J. Lovon, T. Ben-Haddi, J. Di Scala et al., "Revisiting the MIMIC-IV benchmark: Experiments using language models for electronic health records," in Proc. 1st Workshop Patient-Oriented Lang. Process. (CL4Health) @ LREC-COLING, Torino, Italy, 2024.</w:t>
+      </w:r>
+    </w:p>
+    <w:p>
+      <w:pPr>
+        <w:spacing w:lineRule="auto" w:line="360" w:after="120"/>
+        <w:ind w:left="720" w:hanging="720"/>
+        <w:jc w:val="both"/>
+      </w:pPr>
+      <w:r>
+        <w:rPr>
+          <w:rFonts w:ascii="Times New Roman" w:hAnsi="Times New Roman" w:cs="Times New Roman"/>
+          <w:b w:val="0"/>
+          <w:i w:val="0"/>
+          <w:sz w:val="24"/>
+        </w:rPr>
+        <w:t xml:space="preserve">[61]  </w:t>
+      </w:r>
+      <w:r>
+        <w:rPr>
+          <w:rFonts w:ascii="Times New Roman" w:hAnsi="Times New Roman" w:cs="Times New Roman"/>
+          <w:b w:val="0"/>
+          <w:i w:val="0"/>
+          <w:sz w:val="24"/>
+        </w:rPr>
+        <w:t>S. P. Shashikumar, S. Mohammadi, R. Krishnamoorthy et al., "Development and prospective implementation of a large language model based system for early sepsis prediction," npj Digit. Med., 2025.</w:t>
+      </w:r>
+    </w:p>
+    <w:p>
+      <w:pPr>
+        <w:spacing w:lineRule="auto" w:line="360" w:after="120"/>
+        <w:ind w:left="720" w:hanging="720"/>
+        <w:jc w:val="both"/>
+      </w:pPr>
+      <w:r>
+        <w:rPr>
+          <w:rFonts w:ascii="Times New Roman" w:hAnsi="Times New Roman" w:cs="Times New Roman"/>
+          <w:b w:val="0"/>
+          <w:i w:val="0"/>
+          <w:sz w:val="24"/>
+        </w:rPr>
+        <w:t xml:space="preserve">[62]  </w:t>
+      </w:r>
+      <w:r>
+        <w:rPr>
+          <w:rFonts w:ascii="Times New Roman" w:hAnsi="Times New Roman" w:cs="Times New Roman"/>
+          <w:b w:val="0"/>
+          <w:i w:val="0"/>
+          <w:sz w:val="24"/>
+        </w:rPr>
+        <w:t>A. S. Liang et al., "SmartAlert - Implementing machine learning-driven clinical decision support for inpatient laboratory utilization reduction," NEJM AI, vol. 3, no. 7, 2026.</w:t>
+      </w:r>
+    </w:p>
+    <w:p>
+      <w:pPr>
+        <w:spacing w:lineRule="auto" w:line="360" w:after="120"/>
+        <w:ind w:left="720" w:hanging="720"/>
+        <w:jc w:val="both"/>
+      </w:pPr>
+      <w:r>
+        <w:rPr>
+          <w:rFonts w:ascii="Times New Roman" w:hAnsi="Times New Roman" w:cs="Times New Roman"/>
+          <w:b w:val="0"/>
+          <w:i w:val="0"/>
+          <w:sz w:val="24"/>
+        </w:rPr>
+        <w:t xml:space="preserve">[63]  </w:t>
+      </w:r>
+      <w:r>
+        <w:rPr>
+          <w:rFonts w:ascii="Times New Roman" w:hAnsi="Times New Roman" w:cs="Times New Roman"/>
+          <w:b w:val="0"/>
+          <w:i w:val="0"/>
+          <w:sz w:val="24"/>
+        </w:rPr>
+        <w:t>A. Ehtesham, A. Singh, G. K. Gupta et al., "A survey of agent interoperability protocols: Model Context Protocol (MCP), Agent Communication Protocol (ACP), Agent-to-Agent Protocol (A2A), and Agent Network Protocol (ANP)," arXiv:2505.02279, 2025.</w:t>
+      </w:r>
+    </w:p>
+    <w:p>
+      <w:pPr>
+        <w:spacing w:lineRule="auto" w:line="360" w:after="120"/>
+        <w:ind w:left="720" w:hanging="720"/>
+        <w:jc w:val="both"/>
+      </w:pPr>
+      <w:r>
+        <w:rPr>
+          <w:rFonts w:ascii="Times New Roman" w:hAnsi="Times New Roman" w:cs="Times New Roman"/>
+          <w:b w:val="0"/>
+          <w:i w:val="0"/>
+          <w:sz w:val="24"/>
+        </w:rPr>
+        <w:t xml:space="preserve">[64]  </w:t>
+      </w:r>
+      <w:r>
+        <w:rPr>
+          <w:rFonts w:ascii="Times New Roman" w:hAnsi="Times New Roman" w:cs="Times New Roman"/>
+          <w:b w:val="0"/>
+          <w:i w:val="0"/>
+          <w:sz w:val="24"/>
+        </w:rPr>
+        <w:t>K.-T. Tran, D. Dao, M.-D. Nguyen et al., "Multi-agent collaboration mechanisms: A survey of LLMs," arXiv:2501.06322, 2025.</w:t>
+      </w:r>
+    </w:p>
+    <w:p>
+      <w:pPr>
+        <w:spacing w:lineRule="auto" w:line="360" w:after="120"/>
+        <w:ind w:left="720" w:hanging="720"/>
+        <w:jc w:val="both"/>
+      </w:pPr>
+      <w:r>
+        <w:rPr>
+          <w:rFonts w:ascii="Times New Roman" w:hAnsi="Times New Roman" w:cs="Times New Roman"/>
+          <w:b w:val="0"/>
+          <w:i w:val="0"/>
+          <w:sz w:val="24"/>
+        </w:rPr>
+        <w:t xml:space="preserve">[65]  </w:t>
+      </w:r>
+      <w:r>
+        <w:rPr>
+          <w:rFonts w:ascii="Times New Roman" w:hAnsi="Times New Roman" w:cs="Times New Roman"/>
+          <w:b w:val="0"/>
+          <w:i w:val="0"/>
+          <w:sz w:val="24"/>
+        </w:rPr>
+        <w:t>Y. Wu, S. Liang, C. Zhang et al., "From human memory to AI memory: A survey on memory mechanisms in the era of LLMs," arXiv:2504.15965, 2025.</w:t>
+      </w:r>
+    </w:p>
+    <w:p>
+      <w:pPr>
+        <w:spacing w:lineRule="auto" w:line="360" w:after="120"/>
+        <w:ind w:left="720" w:hanging="720"/>
+        <w:jc w:val="both"/>
+      </w:pPr>
+      <w:r>
+        <w:rPr>
+          <w:rFonts w:ascii="Times New Roman" w:hAnsi="Times New Roman" w:cs="Times New Roman"/>
+          <w:b w:val="0"/>
+          <w:i w:val="0"/>
+          <w:sz w:val="24"/>
+        </w:rPr>
+        <w:t xml:space="preserve">[66]  </w:t>
+      </w:r>
+      <w:r>
+        <w:rPr>
+          <w:rFonts w:ascii="Times New Roman" w:hAnsi="Times New Roman" w:cs="Times New Roman"/>
+          <w:b w:val="0"/>
+          <w:i w:val="0"/>
+          <w:sz w:val="24"/>
+        </w:rPr>
+        <w:t>B. Liu, X. Li, J. Zhang et al., "Advances and challenges in foundation agents: From brain-inspired intelligence to evolutionary, collaborative, and safe systems," arXiv:2504.01990, 2025.</w:t>
       </w:r>
     </w:p>
     <w:sectPr>
-      <w:footerReference w:type="default" r:id="rId12"/>
+      <w:footerReference w:type="default" r:id="rId13"/>
       <w:pgSz w:w="11909" w:h="16834"/>
       <w:pgMar w:top="1440" w:right="1440" w:bottom="1440" w:left="1800" w:header="720" w:footer="720" w:gutter="0"/>
       <w:cols w:space="720"/>

</xml_diff>